<commit_message>
Deploy PSYCH 350 RC37 course-site 2026-09-03
</commit_message>
<xml_diff>
--- a/lab-materials/lab01/files/B1.APA_journal_article_reference_formatting.docx
+++ b/lab-materials/lab01/files/B1.APA_journal_article_reference_formatting.docx
@@ -10,7 +10,7 @@
         <w:t xml:space="preserve">APA Style Quick 7th Edition Guide - Journal Articles, Citations &amp; References</w:t>
       </w:r>
     </w:p>
-    <w:bookmarkStart w:id="32" w:name="X57f5de3d047c0a857bec7615fbb3c05b311b7b5"/>
+    <w:bookmarkStart w:id="31" w:name="X57f5de3d047c0a857bec7615fbb3c05b311b7b5"/>
     <w:p>
       <w:pPr>
         <w:pStyle w:val="Heading1"/>
@@ -596,7 +596,7 @@
               <w:pStyle w:val="Compact"/>
             </w:pPr>
             <w:r>
-              <w:t xml:space="preserve">Sager (2019)</w:t>
+              <w:t xml:space="preserve">Marshall (2024)</w:t>
             </w:r>
           </w:p>
         </w:tc>
@@ -607,7 +607,7 @@
               <w:pStyle w:val="BodyText"/>
             </w:pPr>
             <w:r>
-              <w:t xml:space="preserve">(Sager, 2019)</w:t>
+              <w:t xml:space="preserve">(Marshall, 2024)</w:t>
             </w:r>
           </w:p>
           <w:p>
@@ -615,7 +615,7 @@
               <w:pStyle w:val="BodyText"/>
             </w:pPr>
             <w:r>
-              <w:t xml:space="preserve">(Sager, 2019, para. 3)</w:t>
+              <w:t xml:space="preserve">(Marshall, 2024, para. 3)</w:t>
             </w:r>
           </w:p>
         </w:tc>
@@ -626,7 +626,7 @@
               <w:pStyle w:val="BodyText"/>
             </w:pPr>
             <w:r>
-              <w:t xml:space="preserve">Sager, B. (2019, December 24). 9 steps for writing a love letter that will slay their heart.</w:t>
+              <w:t xml:space="preserve">Marshall, M. (2024, July 4). Here’s why scientists don’t know how life on Earth began.</w:t>
             </w:r>
             <w:r>
               <w:t xml:space="preserve"> </w:t>
@@ -636,7 +636,7 @@
                 <w:i/>
                 <w:iCs/>
               </w:rPr>
-              <w:t xml:space="preserve">Cosmopolitan</w:t>
+              <w:t xml:space="preserve">BBC Science Focus Magazine</w:t>
             </w:r>
             <w:r>
               <w:t xml:space="preserve">.</w:t>
@@ -651,7 +651,7 @@
                 <w:rPr>
                   <w:rStyle w:val="Hyperlink"/>
                 </w:rPr>
-                <w:t xml:space="preserve">https://www.cosmopolitan.com/sex-love/a30234888/love-letters-guide/</w:t>
+                <w:t xml:space="preserve">https://www.sciencefocus.com/science/how-did-life-on-earth-begin</w:t>
               </w:r>
             </w:hyperlink>
           </w:p>
@@ -850,19 +850,20 @@
         </w:numPr>
       </w:pPr>
       <w:r>
-        <w:t xml:space="preserve">All journal articles should have a DOI assigned; new standard format is:</w:t>
+        <w:t xml:space="preserve">When a journal article has a DOI, present it as a URL in the format</w:t>
       </w:r>
       <w:r>
         <w:t xml:space="preserve"> </w:t>
       </w:r>
-      <w:hyperlink r:id="rId26">
-        <w:r>
-          <w:rPr>
-            <w:rStyle w:val="Hyperlink"/>
-          </w:rPr>
-          <w:t xml:space="preserve">https://doi.org/XXXX</w:t>
-        </w:r>
-      </w:hyperlink>
+      <w:r>
+        <w:rPr>
+          <w:rStyle w:val="VerbatimChar"/>
+        </w:rPr>
+        <w:t xml:space="preserve">https://doi.org/10.xxxx/xxxxx</w:t>
+      </w:r>
+      <w:r>
+        <w:t xml:space="preserve">.</w:t>
+      </w:r>
     </w:p>
     <w:p>
       <w:pPr>
@@ -889,7 +890,7 @@
       <w:r>
         <w:t xml:space="preserve"> </w:t>
       </w:r>
-      <w:hyperlink r:id="rId27">
+      <w:hyperlink r:id="rId26">
         <w:r>
           <w:rPr>
             <w:rStyle w:val="Hyperlink"/>
@@ -903,7 +904,7 @@
       <w:r>
         <w:t xml:space="preserve"> </w:t>
       </w:r>
-      <w:hyperlink r:id="rId28">
+      <w:hyperlink r:id="rId27">
         <w:r>
           <w:rPr>
             <w:rStyle w:val="Hyperlink"/>
@@ -917,7 +918,7 @@
       <w:r>
         <w:t xml:space="preserve"> </w:t>
       </w:r>
-      <w:hyperlink r:id="rId29">
+      <w:hyperlink r:id="rId28">
         <w:r>
           <w:rPr>
             <w:rStyle w:val="Hyperlink"/>
@@ -931,7 +932,7 @@
       <w:r>
         <w:t xml:space="preserve"> </w:t>
       </w:r>
-      <w:hyperlink r:id="rId30">
+      <w:hyperlink r:id="rId29">
         <w:r>
           <w:rPr>
             <w:rStyle w:val="Hyperlink"/>
@@ -950,7 +951,7 @@
       <w:r>
         <w:t xml:space="preserve"> </w:t>
       </w:r>
-      <w:hyperlink r:id="rId31">
+      <w:hyperlink r:id="rId30">
         <w:r>
           <w:rPr>
             <w:rStyle w:val="Hyperlink"/>
@@ -959,8 +960,8 @@
         </w:r>
       </w:hyperlink>
     </w:p>
-    <w:bookmarkEnd w:id="32"/>
-    <w:bookmarkStart w:id="33" w:name="X5810a6386b602a6f5dffa74940a8fd153e1ea49"/>
+    <w:bookmarkEnd w:id="31"/>
+    <w:bookmarkStart w:id="32" w:name="X5810a6386b602a6f5dffa74940a8fd153e1ea49"/>
     <w:p>
       <w:pPr>
         <w:pStyle w:val="Heading1"/>
@@ -1604,7 +1605,7 @@
         </w:tc>
       </w:tr>
     </w:tbl>
-    <w:bookmarkEnd w:id="33"/>
+    <w:bookmarkEnd w:id="32"/>
     <w:sectPr>
       <w:headerReference r:id="rId9" w:type="default"/>
       <w:footerReference r:id="rId10" w:type="even"/>
@@ -1892,7 +1893,9 @@
               <wp:extent cx="847991" cy="0"/>
               <wp:effectExtent l="0" t="12700" r="28575" b="25400"/>
               <wp:wrapNone/>
-              <wp:docPr id="1138935457" name="Straight Connector 1"/>
+              <wp:docPr id="1138935457" name="Straight Connector 1">
+                <ns0:decorative xmlns:ns0="http://schemas.microsoft.com/office/drawing/2017/decorative" val="1"/>
+              </wp:docPr>
               <wp:cNvGraphicFramePr/>
               <a:graphic xmlns:a="http://schemas.openxmlformats.org/drawingml/2006/main">
                 <a:graphicData uri="http://schemas.microsoft.com/office/word/2010/wordprocessingShape">
@@ -1962,7 +1965,9 @@
               <wp:extent cx="7010400" cy="0"/>
               <wp:effectExtent l="0" t="12700" r="25400" b="25400"/>
               <wp:wrapNone/>
-              <wp:docPr id="1705665425" name="Straight Connector 1"/>
+              <wp:docPr id="1705665425" name="Straight Connector 1">
+                <ns1:decorative xmlns:ns1="http://schemas.microsoft.com/office/drawing/2017/decorative" val="1"/>
+              </wp:docPr>
               <wp:cNvGraphicFramePr/>
               <a:graphic xmlns:a="http://schemas.openxmlformats.org/drawingml/2006/main">
                 <a:graphicData uri="http://schemas.microsoft.com/office/word/2010/wordprocessingShape">
@@ -2119,7 +2124,9 @@
               <wp:extent cx="437050" cy="0"/>
               <wp:effectExtent l="0" t="12700" r="33020" b="25400"/>
               <wp:wrapNone/>
-              <wp:docPr id="160056721" name="Straight Connector 1"/>
+              <wp:docPr id="160056721" name="Straight Connector 1">
+                <adec:decorative val="1"/>
+              </wp:docPr>
               <wp:cNvGraphicFramePr/>
               <a:graphic xmlns:a="http://schemas.openxmlformats.org/drawingml/2006/main">
                 <a:graphicData uri="http://schemas.microsoft.com/office/word/2010/wordprocessingShape">
@@ -2183,7 +2190,9 @@
               <wp:extent cx="7010400" cy="0"/>
               <wp:effectExtent l="0" t="12700" r="25400" b="25400"/>
               <wp:wrapNone/>
-              <wp:docPr id="1347243333" name="Straight Connector 1"/>
+              <wp:docPr id="1347243333" name="Straight Connector 1">
+                <adec:decorative val="1"/>
+              </wp:docPr>
               <wp:cNvGraphicFramePr/>
               <a:graphic xmlns:a="http://schemas.openxmlformats.org/drawingml/2006/main">
                 <a:graphicData uri="http://schemas.microsoft.com/office/word/2010/wordprocessingShape">
@@ -8175,6 +8184,22 @@
       <w:sz w:val="28"/>
     </w:rPr>
   </w:style>
+  <w:style w:customStyle="1" w:styleId="Question" w:type="paragraph">
+    <w:name w:val="Question"/>
+    <w:basedOn w:val="Normal"/>
+    <w:next w:val="Normal"/>
+    <w:pPr>
+      <w:numPr>
+        <w:ilvl w:val="4"/>
+        <w:numId w:val="42"/>
+      </w:numPr>
+      <w:spacing w:after="40" w:before="80"/>
+    </w:pPr>
+    <w:rPr>
+      <w:color w:themeColor="text1" w:val="000000"/>
+      <w:sz w:val="28"/>
+    </w:rPr>
+  </w:style>
   <w:style w:styleId="Heading6" w:type="paragraph">
     <w:name w:val="heading 6"/>
     <w:basedOn w:val="Normal"/>

</xml_diff>

<commit_message>
Deploy 2026-09-10 14:05 CDT
</commit_message>
<xml_diff>
--- a/lab-materials/lab01/files/B1.APA_journal_article_reference_formatting.docx
+++ b/lab-materials/lab01/files/B1.APA_journal_article_reference_formatting.docx
@@ -10,762 +10,842 @@
         <w:t xml:space="preserve">APA Style Quick 7th Edition Guide - Journal Articles, Citations &amp; References</w:t>
       </w:r>
     </w:p>
-    <w:bookmarkStart w:id="31" w:name="X57f5de3d047c0a857bec7615fbb3c05b311b7b5"/>
+    <w:bookmarkStart w:id="39" w:name="citation-examples"/>
     <w:p>
       <w:pPr>
         <w:pStyle w:val="Heading1"/>
       </w:pPr>
       <w:r>
-        <w:t xml:space="preserve">APA Style Quick 7th Edition Guide - Journal Articles, Citations &amp; References</w:t>
-      </w:r>
-    </w:p>
-    <w:tbl>
-      <w:tblPr>
-        <w:tblStyle w:val="Table"/>
-        <w:tblW w:type="pct" w:w="4974"/>
-        <w:tblLayout w:type="fixed"/>
-        <w:tblLook w:firstRow="1" w:lastRow="0" w:firstColumn="0" w:lastColumn="0" w:noHBand="0" w:noVBand="0" w:val="0020"/>
-      </w:tblPr>
-      <w:tblGrid>
-        <w:gridCol w:w="828"/>
-        <w:gridCol w:w="828"/>
-        <w:gridCol w:w="909"/>
-        <w:gridCol w:w="5313"/>
-      </w:tblGrid>
-      <w:tr>
-        <w:trPr>
-          <w:tblHeader w:val="on"/>
-        </w:trPr>
-        <w:tc>
-          <w:tcPr/>
-          <w:p>
-            <w:pPr>
-              <w:pStyle w:val="Compact"/>
-            </w:pPr>
-            <w:r>
-              <w:rPr>
-                <w:b/>
-                <w:bCs/>
-              </w:rPr>
-              <w:t xml:space="preserve">Author type</w:t>
-            </w:r>
-          </w:p>
-        </w:tc>
-        <w:tc>
-          <w:tcPr/>
-          <w:p>
-            <w:pPr>
-              <w:pStyle w:val="Compact"/>
-            </w:pPr>
-            <w:r>
-              <w:rPr>
-                <w:b/>
-                <w:bCs/>
-              </w:rPr>
-              <w:t xml:space="preserve">Narrative citation</w:t>
-            </w:r>
-          </w:p>
-        </w:tc>
-        <w:tc>
-          <w:tcPr/>
-          <w:p>
-            <w:pPr>
-              <w:pStyle w:val="Compact"/>
-            </w:pPr>
-            <w:r>
-              <w:rPr>
-                <w:b/>
-                <w:bCs/>
-              </w:rPr>
-              <w:t xml:space="preserve">Parenthetical citation</w:t>
-            </w:r>
-          </w:p>
-        </w:tc>
-        <w:tc>
-          <w:tcPr/>
-          <w:p>
-            <w:pPr>
-              <w:pStyle w:val="Compact"/>
-            </w:pPr>
-            <w:r>
-              <w:rPr>
-                <w:b/>
-                <w:bCs/>
-              </w:rPr>
-              <w:t xml:space="preserve">Reference list</w:t>
-            </w:r>
-          </w:p>
-        </w:tc>
-      </w:tr>
-      <w:tr>
-        <w:tc>
-          <w:tcPr/>
-          <w:p>
-            <w:pPr>
-              <w:pStyle w:val="Compact"/>
-            </w:pPr>
-            <w:r>
-              <w:rPr>
-                <w:b/>
-                <w:bCs/>
-              </w:rPr>
-              <w:t xml:space="preserve">One author</w:t>
-            </w:r>
-          </w:p>
-        </w:tc>
-        <w:tc>
-          <w:tcPr/>
-          <w:p>
-            <w:pPr>
-              <w:pStyle w:val="Compact"/>
-            </w:pPr>
-            <w:r>
-              <w:t xml:space="preserve">Locke (2005)</w:t>
-            </w:r>
-          </w:p>
-        </w:tc>
-        <w:tc>
-          <w:tcPr/>
-          <w:p>
-            <w:pPr>
-              <w:pStyle w:val="Compact"/>
-            </w:pPr>
-            <w:r>
-              <w:t xml:space="preserve">(Locke, 2005)</w:t>
-            </w:r>
-          </w:p>
-        </w:tc>
-        <w:tc>
-          <w:tcPr/>
-          <w:p>
-            <w:pPr>
-              <w:pStyle w:val="BodyText"/>
-            </w:pPr>
-            <w:r>
-              <w:t xml:space="preserve">Locke, K. D. (2008). Attachment styles and interpersonal approach and avoidance goals in everyday couple interactions.</w:t>
-            </w:r>
-            <w:r>
-              <w:t xml:space="preserve"> </w:t>
-            </w:r>
-            <w:r>
-              <w:rPr>
-                <w:i/>
-                <w:iCs/>
-              </w:rPr>
-              <w:t xml:space="preserve">Personal Relationships, 15</w:t>
-            </w:r>
-            <w:r>
-              <w:t xml:space="preserve">(3), 359-374.</w:t>
-            </w:r>
-          </w:p>
-          <w:p>
-            <w:pPr>
-              <w:pStyle w:val="BodyText"/>
-            </w:pPr>
-            <w:hyperlink r:id="rId20">
-              <w:r>
-                <w:rPr>
-                  <w:rStyle w:val="Hyperlink"/>
-                </w:rPr>
-                <w:t xml:space="preserve">https://doi.org/10.1111/j.1475-6811.2008.00203.x</w:t>
-              </w:r>
-            </w:hyperlink>
-          </w:p>
-        </w:tc>
-      </w:tr>
-      <w:tr>
-        <w:tc>
-          <w:tcPr/>
-          <w:p>
-            <w:pPr>
-              <w:pStyle w:val="Compact"/>
-            </w:pPr>
-            <w:r>
-              <w:rPr>
-                <w:b/>
-                <w:bCs/>
-              </w:rPr>
-              <w:t xml:space="preserve">Two authors</w:t>
-            </w:r>
-          </w:p>
-        </w:tc>
-        <w:tc>
-          <w:tcPr/>
-          <w:p>
-            <w:pPr>
-              <w:pStyle w:val="Compact"/>
-            </w:pPr>
-            <w:r>
-              <w:t xml:space="preserve">Birnbaum and Reis (2019)</w:t>
-            </w:r>
-          </w:p>
-        </w:tc>
-        <w:tc>
-          <w:tcPr/>
-          <w:p>
-            <w:pPr>
-              <w:pStyle w:val="Compact"/>
-            </w:pPr>
-            <w:r>
-              <w:t xml:space="preserve">(Birnbaum &amp; Reis, 2019)</w:t>
-            </w:r>
-          </w:p>
-        </w:tc>
-        <w:tc>
-          <w:tcPr/>
-          <w:p>
-            <w:pPr>
-              <w:pStyle w:val="BodyText"/>
-            </w:pPr>
-            <w:r>
-              <w:t xml:space="preserve">Birnbaum, G. E., &amp; Reis, H. T. (2019). Evolved to be connected: The dynamics of attachment and sex over the course of romantic relationships.</w:t>
-            </w:r>
-            <w:r>
-              <w:t xml:space="preserve"> </w:t>
-            </w:r>
-            <w:r>
-              <w:rPr>
-                <w:i/>
-                <w:iCs/>
-              </w:rPr>
-              <w:t xml:space="preserve">Current Opinion in Psychology, 25</w:t>
-            </w:r>
-            <w:r>
-              <w:t xml:space="preserve">, 11-15.</w:t>
-            </w:r>
-          </w:p>
-          <w:p>
-            <w:pPr>
-              <w:pStyle w:val="BodyText"/>
-            </w:pPr>
-            <w:hyperlink r:id="rId21">
-              <w:r>
-                <w:rPr>
-                  <w:rStyle w:val="Hyperlink"/>
-                </w:rPr>
-                <w:t xml:space="preserve">https://doi.org/10.1016/j.copsyc.2018.02.005</w:t>
-              </w:r>
-            </w:hyperlink>
-          </w:p>
-        </w:tc>
-      </w:tr>
-      <w:tr>
-        <w:tc>
-          <w:tcPr/>
-          <w:p>
-            <w:pPr>
-              <w:pStyle w:val="Compact"/>
-            </w:pPr>
-            <w:r>
-              <w:rPr>
-                <w:b/>
-                <w:bCs/>
-              </w:rPr>
-              <w:t xml:space="preserve">Three or more authors</w:t>
-            </w:r>
-          </w:p>
-        </w:tc>
-        <w:tc>
-          <w:tcPr/>
-          <w:p>
-            <w:pPr>
-              <w:pStyle w:val="Compact"/>
-            </w:pPr>
-            <w:r>
-              <w:t xml:space="preserve">Mitchell et al. (2008)</w:t>
-            </w:r>
-          </w:p>
-        </w:tc>
-        <w:tc>
-          <w:tcPr/>
-          <w:p>
-            <w:pPr>
-              <w:pStyle w:val="Compact"/>
-            </w:pPr>
-            <w:r>
-              <w:t xml:space="preserve">(Mitchell et al., 2008)</w:t>
-            </w:r>
-          </w:p>
-        </w:tc>
-        <w:tc>
-          <w:tcPr/>
-          <w:p>
-            <w:pPr>
-              <w:pStyle w:val="BodyText"/>
-            </w:pPr>
-            <w:r>
-              <w:t xml:space="preserve">Mitchell, A. E., Castellani, A. M., Herrington, R. L., Joseph, J. I., Doss, B. D., &amp; Snyder, D. K. (2008). Predictors of intimacy in couples’ discussions of relationship injuries: An observational study.</w:t>
-            </w:r>
-            <w:r>
-              <w:t xml:space="preserve"> </w:t>
-            </w:r>
-            <w:r>
-              <w:rPr>
-                <w:i/>
-                <w:iCs/>
-              </w:rPr>
-              <w:t xml:space="preserve">Journal of Family Psychology, 22</w:t>
-            </w:r>
-            <w:r>
-              <w:t xml:space="preserve">(1), 21-29.</w:t>
-            </w:r>
-          </w:p>
-          <w:p>
-            <w:pPr>
-              <w:pStyle w:val="BodyText"/>
-            </w:pPr>
-            <w:hyperlink r:id="rId22">
-              <w:r>
-                <w:rPr>
-                  <w:rStyle w:val="Hyperlink"/>
-                </w:rPr>
-                <w:t xml:space="preserve">https://doi.org/10.1037/0893-3200.22.1.21</w:t>
-              </w:r>
-            </w:hyperlink>
-          </w:p>
-        </w:tc>
-      </w:tr>
-      <w:tr>
-        <w:tc>
-          <w:tcPr/>
-          <w:p>
-            <w:pPr>
-              <w:pStyle w:val="Compact"/>
-            </w:pPr>
-            <w:r>
-              <w:rPr>
-                <w:b/>
-                <w:bCs/>
-              </w:rPr>
-              <w:t xml:space="preserve">Secondary citation</w:t>
-            </w:r>
-          </w:p>
-        </w:tc>
-        <w:tc>
-          <w:tcPr/>
-          <w:p>
-            <w:pPr>
-              <w:pStyle w:val="Compact"/>
-            </w:pPr>
-            <w:r>
-              <w:t xml:space="preserve">Smith (2003, as cited in Gagné et al.,</w:t>
-            </w:r>
-            <w:r>
-              <w:t xml:space="preserve"> </w:t>
-            </w:r>
-            <w:r>
-              <w:t xml:space="preserve">2008)</w:t>
-            </w:r>
-          </w:p>
-        </w:tc>
-        <w:tc>
-          <w:tcPr/>
-          <w:p>
-            <w:pPr>
-              <w:pStyle w:val="Compact"/>
-            </w:pPr>
-            <w:r>
-              <w:t xml:space="preserve">(Smith, 2003, as cited in Gagné et al.,</w:t>
-            </w:r>
-            <w:r>
-              <w:t xml:space="preserve"> </w:t>
-            </w:r>
-            <w:r>
-              <w:t xml:space="preserve">2008).</w:t>
-            </w:r>
-          </w:p>
-        </w:tc>
-        <w:tc>
-          <w:tcPr/>
-          <w:p>
-            <w:pPr>
-              <w:pStyle w:val="BodyText"/>
-            </w:pPr>
-            <w:r>
-              <w:t xml:space="preserve">NOTHING</w:t>
-            </w:r>
-          </w:p>
-          <w:p>
-            <w:pPr>
-              <w:pStyle w:val="BodyText"/>
-            </w:pPr>
-            <w:r>
-              <w:rPr>
-                <w:b/>
-                <w:bCs/>
-              </w:rPr>
-              <w:t xml:space="preserve">AVOID THESE: Only use primary sources.</w:t>
-            </w:r>
-          </w:p>
-        </w:tc>
-      </w:tr>
-      <w:tr>
-        <w:tc>
-          <w:tcPr/>
-          <w:p>
-            <w:pPr>
-              <w:pStyle w:val="Compact"/>
-            </w:pPr>
-            <w:r>
-              <w:rPr>
-                <w:b/>
-                <w:bCs/>
-              </w:rPr>
-              <w:t xml:space="preserve">Direct quote</w:t>
-            </w:r>
-          </w:p>
-        </w:tc>
-        <w:tc>
-          <w:tcPr/>
-          <w:p>
-            <w:pPr>
-              <w:pStyle w:val="Compact"/>
-            </w:pPr>
-            <w:r>
-              <w:t xml:space="preserve">Locke (2005) states</w:t>
-            </w:r>
-            <w:r>
-              <w:t xml:space="preserve"> </w:t>
-            </w:r>
-            <w:r>
-              <w:t xml:space="preserve">“blah blah blah”</w:t>
-            </w:r>
-            <w:r>
-              <w:t xml:space="preserve"> </w:t>
-            </w:r>
-            <w:r>
-              <w:t xml:space="preserve">(p.</w:t>
-            </w:r>
-            <w:r>
-              <w:t xml:space="preserve"> </w:t>
-            </w:r>
-            <w:r>
-              <w:t xml:space="preserve">365).</w:t>
-            </w:r>
-          </w:p>
-        </w:tc>
-        <w:tc>
-          <w:tcPr/>
-          <w:p>
-            <w:pPr>
-              <w:pStyle w:val="Compact"/>
-            </w:pPr>
-            <w:r>
-              <w:t xml:space="preserve">Research suggests</w:t>
-            </w:r>
-            <w:r>
-              <w:t xml:space="preserve"> </w:t>
-            </w:r>
-            <w:r>
-              <w:t xml:space="preserve">“blah blah blah”</w:t>
-            </w:r>
-            <w:r>
-              <w:t xml:space="preserve"> </w:t>
-            </w:r>
-            <w:r>
-              <w:t xml:space="preserve">(Locke,</w:t>
-            </w:r>
-            <w:r>
-              <w:t xml:space="preserve"> </w:t>
-            </w:r>
-            <w:r>
-              <w:t xml:space="preserve">2005, p. 365).</w:t>
-            </w:r>
-          </w:p>
-        </w:tc>
-        <w:tc>
-          <w:tcPr/>
-          <w:p>
-            <w:pPr>
-              <w:pStyle w:val="BodyText"/>
-            </w:pPr>
-            <w:r>
-              <w:t xml:space="preserve">N/A</w:t>
-            </w:r>
-          </w:p>
-          <w:p>
-            <w:pPr>
-              <w:pStyle w:val="BodyText"/>
-            </w:pPr>
-            <w:r>
-              <w:rPr>
-                <w:b/>
-                <w:bCs/>
-              </w:rPr>
-              <w:t xml:space="preserve">AVOID THESE: Paraphrase instead!</w:t>
-            </w:r>
-          </w:p>
-        </w:tc>
-      </w:tr>
-      <w:tr>
-        <w:tc>
-          <w:tcPr/>
-          <w:p>
-            <w:pPr>
-              <w:pStyle w:val="Compact"/>
-            </w:pPr>
-            <w:r>
-              <w:rPr>
-                <w:b/>
-                <w:bCs/>
-              </w:rPr>
-              <w:t xml:space="preserve">Book chapter</w:t>
-            </w:r>
-          </w:p>
-        </w:tc>
-        <w:tc>
-          <w:tcPr/>
-          <w:p>
-            <w:pPr>
-              <w:pStyle w:val="Compact"/>
-            </w:pPr>
-            <w:r>
-              <w:t xml:space="preserve">Lydon et al. (2009)</w:t>
-            </w:r>
-          </w:p>
-        </w:tc>
-        <w:tc>
-          <w:tcPr/>
-          <w:p>
-            <w:pPr>
-              <w:pStyle w:val="Compact"/>
-            </w:pPr>
-            <w:r>
-              <w:t xml:space="preserve">Lydon et al. (2009)</w:t>
-            </w:r>
-          </w:p>
-        </w:tc>
-        <w:tc>
-          <w:tcPr/>
-          <w:p>
-            <w:pPr>
-              <w:pStyle w:val="BodyText"/>
-            </w:pPr>
-            <w:r>
-              <w:t xml:space="preserve">Lydon, J. E., McClure, J. M., &amp; Linardatos, L. (2009). Commitment: Predictors and outcomes. In H. T. Reis &amp; S. Sprecher (Eds.),</w:t>
-            </w:r>
-            <w:r>
-              <w:t xml:space="preserve"> </w:t>
-            </w:r>
-            <w:r>
-              <w:rPr>
-                <w:i/>
-                <w:iCs/>
-              </w:rPr>
-              <w:t xml:space="preserve">Encyclopedia of human relationships</w:t>
-            </w:r>
-            <w:r>
-              <w:t xml:space="preserve">. Sage Publications.</w:t>
-            </w:r>
-          </w:p>
-          <w:p>
-            <w:pPr>
-              <w:pStyle w:val="BodyText"/>
-            </w:pPr>
-            <w:hyperlink r:id="rId23">
-              <w:r>
-                <w:rPr>
-                  <w:rStyle w:val="Hyperlink"/>
-                </w:rPr>
-                <w:t xml:space="preserve">https://doi.org/10.4135/9781412958479.n82</w:t>
-              </w:r>
-            </w:hyperlink>
-          </w:p>
-        </w:tc>
-      </w:tr>
-      <w:tr>
-        <w:tc>
-          <w:tcPr/>
-          <w:p>
-            <w:pPr>
-              <w:pStyle w:val="Compact"/>
-            </w:pPr>
-            <w:r>
-              <w:rPr>
-                <w:b/>
-                <w:bCs/>
-              </w:rPr>
-              <w:t xml:space="preserve">Magazine article</w:t>
-            </w:r>
-          </w:p>
-        </w:tc>
-        <w:tc>
-          <w:tcPr/>
-          <w:p>
-            <w:pPr>
-              <w:pStyle w:val="Compact"/>
-            </w:pPr>
-            <w:r>
-              <w:t xml:space="preserve">Marshall (2024)</w:t>
-            </w:r>
-          </w:p>
-        </w:tc>
-        <w:tc>
-          <w:tcPr/>
-          <w:p>
-            <w:pPr>
-              <w:pStyle w:val="BodyText"/>
-            </w:pPr>
-            <w:r>
-              <w:t xml:space="preserve">(Marshall, 2024)</w:t>
-            </w:r>
-          </w:p>
-          <w:p>
-            <w:pPr>
-              <w:pStyle w:val="BodyText"/>
-            </w:pPr>
-            <w:r>
-              <w:t xml:space="preserve">(Marshall, 2024, para. 3)</w:t>
-            </w:r>
-          </w:p>
-        </w:tc>
-        <w:tc>
-          <w:tcPr/>
-          <w:p>
-            <w:pPr>
-              <w:pStyle w:val="BodyText"/>
-            </w:pPr>
-            <w:r>
-              <w:t xml:space="preserve">Marshall, M. (2024, July 4). Here’s why scientists don’t know how life on Earth began.</w:t>
-            </w:r>
-            <w:r>
-              <w:t xml:space="preserve"> </w:t>
-            </w:r>
-            <w:r>
-              <w:rPr>
-                <w:i/>
-                <w:iCs/>
-              </w:rPr>
-              <w:t xml:space="preserve">BBC Science Focus Magazine</w:t>
-            </w:r>
-            <w:r>
-              <w:t xml:space="preserve">.</w:t>
-            </w:r>
-          </w:p>
-          <w:p>
-            <w:pPr>
-              <w:pStyle w:val="BodyText"/>
-            </w:pPr>
-            <w:hyperlink r:id="rId24">
-              <w:r>
-                <w:rPr>
-                  <w:rStyle w:val="Hyperlink"/>
-                </w:rPr>
-                <w:t xml:space="preserve">https://www.sciencefocus.com/science/how-did-life-on-earth-begin</w:t>
-              </w:r>
-            </w:hyperlink>
-          </w:p>
-        </w:tc>
-      </w:tr>
-      <w:tr>
-        <w:tc>
-          <w:tcPr/>
-          <w:p>
-            <w:pPr>
-              <w:pStyle w:val="Compact"/>
-            </w:pPr>
-            <w:r>
-              <w:rPr>
-                <w:b/>
-                <w:bCs/>
-              </w:rPr>
-              <w:t xml:space="preserve">Audiovisual media (film)</w:t>
-            </w:r>
-          </w:p>
-        </w:tc>
-        <w:tc>
-          <w:tcPr/>
-          <w:p>
-            <w:pPr>
-              <w:pStyle w:val="Compact"/>
-            </w:pPr>
-            <w:r>
-              <w:t xml:space="preserve">Jackson (2001)</w:t>
-            </w:r>
-          </w:p>
-        </w:tc>
-        <w:tc>
-          <w:tcPr/>
-          <w:p>
-            <w:pPr>
-              <w:pStyle w:val="Compact"/>
-            </w:pPr>
-            <w:r>
-              <w:t xml:space="preserve">(Jackson, 2001)</w:t>
-            </w:r>
-          </w:p>
-        </w:tc>
-        <w:tc>
-          <w:tcPr/>
-          <w:p>
-            <w:pPr>
-              <w:pStyle w:val="Compact"/>
-            </w:pPr>
-            <w:r>
-              <w:t xml:space="preserve">Jackson, P. (Director). (2001).</w:t>
-            </w:r>
-            <w:r>
-              <w:t xml:space="preserve"> </w:t>
-            </w:r>
-            <w:r>
-              <w:rPr>
-                <w:i/>
-                <w:iCs/>
-              </w:rPr>
-              <w:t xml:space="preserve">The lord of the rings: The fellowship of the ring</w:t>
-            </w:r>
-            <w:r>
-              <w:t xml:space="preserve"> </w:t>
-            </w:r>
-            <w:r>
-              <w:t xml:space="preserve">[Film; four-disc special extended ed. on DVD]. Wingnut film; the Saul Zaentz company.</w:t>
-            </w:r>
-          </w:p>
-        </w:tc>
-      </w:tr>
-      <w:tr>
-        <w:tc>
-          <w:tcPr>
-            <w:gridSpan w:val="4"/>
-          </w:tcPr>
-          <w:p>
-            <w:pPr>
-              <w:pStyle w:val="BodyText"/>
-            </w:pPr>
-            <w:r>
-              <w:rPr>
-                <w:b/>
-                <w:bCs/>
-              </w:rPr>
-              <w:t xml:space="preserve">For examples of how to list other audiovisual media (e.g. TV show, podcast, song) in the reference section, use the following link:</w:t>
-            </w:r>
-            <w:r>
-              <w:t xml:space="preserve"> </w:t>
-            </w:r>
-            <w:hyperlink r:id="rId25">
-              <w:r>
-                <w:rPr>
-                  <w:rStyle w:val="Hyperlink"/>
-                </w:rPr>
-                <w:t xml:space="preserve">https://owl.purdue.edu/owl/research_and_citation/apa_style/apa_formatting_and_style_guide/reference_list_audiovisual_media.html</w:t>
-              </w:r>
-            </w:hyperlink>
-          </w:p>
-          <w:p>
-            <w:pPr>
-              <w:pStyle w:val="BodyText"/>
-            </w:pPr>
-            <w:r>
-              <w:rPr>
-                <w:b/>
-                <w:bCs/>
-              </w:rPr>
-              <w:t xml:space="preserve">Narrative and parenthetical citations always have the same form (Name, Publication Year)</w:t>
-            </w:r>
-          </w:p>
-        </w:tc>
-      </w:tr>
-    </w:tbl>
+        <w:t xml:space="preserve">Citation examples</w:t>
+      </w:r>
+    </w:p>
+    <w:bookmarkStart w:id="21" w:name="one-author"/>
+    <w:p>
+      <w:pPr>
+        <w:pStyle w:val="Heading2"/>
+      </w:pPr>
+      <w:r>
+        <w:rPr>
+          <w:b/>
+          <w:bCs/>
+        </w:rPr>
+        <w:t xml:space="preserve">One author</w:t>
+      </w:r>
+    </w:p>
+    <w:p>
+      <w:pPr>
+        <w:pStyle w:val="FirstParagraph"/>
+      </w:pPr>
+      <w:r>
+        <w:rPr>
+          <w:b/>
+          <w:bCs/>
+        </w:rPr>
+        <w:t xml:space="preserve">Narrative citation</w:t>
+      </w:r>
+    </w:p>
+    <w:p>
+      <w:pPr>
+        <w:pStyle w:val="BodyText"/>
+      </w:pPr>
+      <w:r>
+        <w:t xml:space="preserve">Locke (2005)</w:t>
+      </w:r>
+    </w:p>
+    <w:p>
+      <w:pPr>
+        <w:pStyle w:val="BodyText"/>
+      </w:pPr>
+      <w:r>
+        <w:rPr>
+          <w:b/>
+          <w:bCs/>
+        </w:rPr>
+        <w:t xml:space="preserve">Parenthetical citation</w:t>
+      </w:r>
+    </w:p>
+    <w:p>
+      <w:pPr>
+        <w:pStyle w:val="BodyText"/>
+      </w:pPr>
+      <w:r>
+        <w:t xml:space="preserve">(Locke, 2005)</w:t>
+      </w:r>
+    </w:p>
+    <w:p>
+      <w:pPr>
+        <w:pStyle w:val="BodyText"/>
+      </w:pPr>
+      <w:r>
+        <w:rPr>
+          <w:b/>
+          <w:bCs/>
+        </w:rPr>
+        <w:t xml:space="preserve">Reference list</w:t>
+      </w:r>
+    </w:p>
+    <w:p>
+      <w:pPr>
+        <w:pStyle w:val="BodyText"/>
+      </w:pPr>
+      <w:r>
+        <w:t xml:space="preserve">Locke, K. D. (2008). Attachment styles and interpersonal approach and avoidance goals in everyday couple interactions.</w:t>
+      </w:r>
+      <w:r>
+        <w:t xml:space="preserve"> </w:t>
+      </w:r>
+      <w:r>
+        <w:rPr>
+          <w:i/>
+          <w:iCs/>
+        </w:rPr>
+        <w:t xml:space="preserve">Personal Relationships, 15</w:t>
+      </w:r>
+      <w:r>
+        <w:t xml:space="preserve">(3), 359-374.</w:t>
+      </w:r>
+    </w:p>
+    <w:p>
+      <w:pPr>
+        <w:pStyle w:val="BodyText"/>
+      </w:pPr>
+      <w:hyperlink r:id="rId20">
+        <w:r>
+          <w:rPr>
+            <w:rStyle w:val="Hyperlink"/>
+          </w:rPr>
+          <w:t xml:space="preserve">https://doi.org/10.1111/j.1475-6811.2008.00203.x</w:t>
+        </w:r>
+      </w:hyperlink>
+    </w:p>
+    <w:bookmarkEnd w:id="21"/>
+    <w:bookmarkStart w:id="23" w:name="two-authors"/>
+    <w:p>
+      <w:pPr>
+        <w:pStyle w:val="Heading2"/>
+      </w:pPr>
+      <w:r>
+        <w:rPr>
+          <w:b/>
+          <w:bCs/>
+        </w:rPr>
+        <w:t xml:space="preserve">Two authors</w:t>
+      </w:r>
+    </w:p>
+    <w:p>
+      <w:pPr>
+        <w:pStyle w:val="FirstParagraph"/>
+      </w:pPr>
+      <w:r>
+        <w:rPr>
+          <w:b/>
+          <w:bCs/>
+        </w:rPr>
+        <w:t xml:space="preserve">Narrative citation</w:t>
+      </w:r>
+    </w:p>
+    <w:p>
+      <w:pPr>
+        <w:pStyle w:val="BodyText"/>
+      </w:pPr>
+      <w:r>
+        <w:t xml:space="preserve">Birnbaum and Reis (2019)</w:t>
+      </w:r>
+    </w:p>
+    <w:p>
+      <w:pPr>
+        <w:pStyle w:val="BodyText"/>
+      </w:pPr>
+      <w:r>
+        <w:rPr>
+          <w:b/>
+          <w:bCs/>
+        </w:rPr>
+        <w:t xml:space="preserve">Parenthetical citation</w:t>
+      </w:r>
+    </w:p>
+    <w:p>
+      <w:pPr>
+        <w:pStyle w:val="BodyText"/>
+      </w:pPr>
+      <w:r>
+        <w:t xml:space="preserve">(Birnbaum &amp; Reis, 2019)</w:t>
+      </w:r>
+    </w:p>
+    <w:p>
+      <w:pPr>
+        <w:pStyle w:val="BodyText"/>
+      </w:pPr>
+      <w:r>
+        <w:rPr>
+          <w:b/>
+          <w:bCs/>
+        </w:rPr>
+        <w:t xml:space="preserve">Reference list</w:t>
+      </w:r>
+    </w:p>
+    <w:p>
+      <w:pPr>
+        <w:pStyle w:val="BodyText"/>
+      </w:pPr>
+      <w:r>
+        <w:t xml:space="preserve">Birnbaum, G. E., &amp; Reis, H. T. (2019). Evolved to be connected: The dynamics of attachment and sex over the course of romantic relationships.</w:t>
+      </w:r>
+      <w:r>
+        <w:t xml:space="preserve"> </w:t>
+      </w:r>
+      <w:r>
+        <w:rPr>
+          <w:i/>
+          <w:iCs/>
+        </w:rPr>
+        <w:t xml:space="preserve">Current Opinion in Psychology, 25</w:t>
+      </w:r>
+      <w:r>
+        <w:t xml:space="preserve">, 11-15.</w:t>
+      </w:r>
+    </w:p>
+    <w:p>
+      <w:pPr>
+        <w:pStyle w:val="BodyText"/>
+      </w:pPr>
+      <w:hyperlink r:id="rId22">
+        <w:r>
+          <w:rPr>
+            <w:rStyle w:val="Hyperlink"/>
+          </w:rPr>
+          <w:t xml:space="preserve">https://doi.org/10.1016/j.copsyc.2018.02.005</w:t>
+        </w:r>
+      </w:hyperlink>
+    </w:p>
+    <w:bookmarkEnd w:id="23"/>
+    <w:bookmarkStart w:id="25" w:name="three-or-more-authors"/>
+    <w:p>
+      <w:pPr>
+        <w:pStyle w:val="Heading2"/>
+      </w:pPr>
+      <w:r>
+        <w:rPr>
+          <w:b/>
+          <w:bCs/>
+        </w:rPr>
+        <w:t xml:space="preserve">Three or more authors</w:t>
+      </w:r>
+    </w:p>
+    <w:p>
+      <w:pPr>
+        <w:pStyle w:val="FirstParagraph"/>
+      </w:pPr>
+      <w:r>
+        <w:rPr>
+          <w:b/>
+          <w:bCs/>
+        </w:rPr>
+        <w:t xml:space="preserve">Narrative citation</w:t>
+      </w:r>
+    </w:p>
+    <w:p>
+      <w:pPr>
+        <w:pStyle w:val="BodyText"/>
+      </w:pPr>
+      <w:r>
+        <w:t xml:space="preserve">Mitchell et al. (2008)</w:t>
+      </w:r>
+    </w:p>
+    <w:p>
+      <w:pPr>
+        <w:pStyle w:val="BodyText"/>
+      </w:pPr>
+      <w:r>
+        <w:rPr>
+          <w:b/>
+          <w:bCs/>
+        </w:rPr>
+        <w:t xml:space="preserve">Parenthetical citation</w:t>
+      </w:r>
+    </w:p>
+    <w:p>
+      <w:pPr>
+        <w:pStyle w:val="BodyText"/>
+      </w:pPr>
+      <w:r>
+        <w:t xml:space="preserve">(Mitchell et al., 2008)</w:t>
+      </w:r>
+    </w:p>
+    <w:p>
+      <w:pPr>
+        <w:pStyle w:val="BodyText"/>
+      </w:pPr>
+      <w:r>
+        <w:rPr>
+          <w:b/>
+          <w:bCs/>
+        </w:rPr>
+        <w:t xml:space="preserve">Reference list</w:t>
+      </w:r>
+    </w:p>
+    <w:p>
+      <w:pPr>
+        <w:pStyle w:val="BodyText"/>
+      </w:pPr>
+      <w:r>
+        <w:t xml:space="preserve">Mitchell, A. E., Castellani, A. M., Herrington, R. L., Joseph, J. I., Doss, B. D., &amp; Snyder, D. K. (2008). Predictors of intimacy in couples’ discussions of relationship injuries: An observational study.</w:t>
+      </w:r>
+      <w:r>
+        <w:t xml:space="preserve"> </w:t>
+      </w:r>
+      <w:r>
+        <w:rPr>
+          <w:i/>
+          <w:iCs/>
+        </w:rPr>
+        <w:t xml:space="preserve">Journal of Family Psychology, 22</w:t>
+      </w:r>
+      <w:r>
+        <w:t xml:space="preserve">(1), 21-29.</w:t>
+      </w:r>
+    </w:p>
+    <w:p>
+      <w:pPr>
+        <w:pStyle w:val="BodyText"/>
+      </w:pPr>
+      <w:hyperlink r:id="rId24">
+        <w:r>
+          <w:rPr>
+            <w:rStyle w:val="Hyperlink"/>
+          </w:rPr>
+          <w:t xml:space="preserve">https://doi.org/10.1037/0893-3200.22.1.21</w:t>
+        </w:r>
+      </w:hyperlink>
+    </w:p>
+    <w:bookmarkEnd w:id="25"/>
+    <w:bookmarkStart w:id="26" w:name="secondary-citation"/>
+    <w:p>
+      <w:pPr>
+        <w:pStyle w:val="Heading2"/>
+      </w:pPr>
+      <w:r>
+        <w:rPr>
+          <w:b/>
+          <w:bCs/>
+        </w:rPr>
+        <w:t xml:space="preserve">Secondary citation</w:t>
+      </w:r>
+    </w:p>
+    <w:p>
+      <w:pPr>
+        <w:pStyle w:val="FirstParagraph"/>
+      </w:pPr>
+      <w:r>
+        <w:rPr>
+          <w:b/>
+          <w:bCs/>
+        </w:rPr>
+        <w:t xml:space="preserve">Narrative citation</w:t>
+      </w:r>
+    </w:p>
+    <w:p>
+      <w:pPr>
+        <w:pStyle w:val="BodyText"/>
+      </w:pPr>
+      <w:r>
+        <w:t xml:space="preserve">Smith (2003, as cited in Gagné et al., 2008)</w:t>
+      </w:r>
+    </w:p>
+    <w:p>
+      <w:pPr>
+        <w:pStyle w:val="BodyText"/>
+      </w:pPr>
+      <w:r>
+        <w:rPr>
+          <w:b/>
+          <w:bCs/>
+        </w:rPr>
+        <w:t xml:space="preserve">Parenthetical citation</w:t>
+      </w:r>
+    </w:p>
+    <w:p>
+      <w:pPr>
+        <w:pStyle w:val="BodyText"/>
+      </w:pPr>
+      <w:r>
+        <w:t xml:space="preserve">(Smith, 2003, as cited in Gagné et al., 2008).</w:t>
+      </w:r>
+    </w:p>
+    <w:p>
+      <w:pPr>
+        <w:pStyle w:val="BodyText"/>
+      </w:pPr>
+      <w:r>
+        <w:rPr>
+          <w:b/>
+          <w:bCs/>
+        </w:rPr>
+        <w:t xml:space="preserve">Reference list</w:t>
+      </w:r>
+    </w:p>
+    <w:p>
+      <w:pPr>
+        <w:pStyle w:val="BodyText"/>
+      </w:pPr>
+      <w:r>
+        <w:t xml:space="preserve">NOTHING</w:t>
+      </w:r>
+    </w:p>
+    <w:p>
+      <w:pPr>
+        <w:pStyle w:val="BodyText"/>
+      </w:pPr>
+      <w:r>
+        <w:rPr>
+          <w:b/>
+          <w:bCs/>
+        </w:rPr>
+        <w:t xml:space="preserve">AVOID THESE: Only use primary sources.</w:t>
+      </w:r>
+    </w:p>
+    <w:bookmarkEnd w:id="26"/>
+    <w:bookmarkStart w:id="27" w:name="direct-quote"/>
+    <w:p>
+      <w:pPr>
+        <w:pStyle w:val="Heading2"/>
+      </w:pPr>
+      <w:r>
+        <w:rPr>
+          <w:b/>
+          <w:bCs/>
+        </w:rPr>
+        <w:t xml:space="preserve">Direct quote</w:t>
+      </w:r>
+    </w:p>
+    <w:p>
+      <w:pPr>
+        <w:pStyle w:val="FirstParagraph"/>
+      </w:pPr>
+      <w:r>
+        <w:rPr>
+          <w:b/>
+          <w:bCs/>
+        </w:rPr>
+        <w:t xml:space="preserve">Narrative citation</w:t>
+      </w:r>
+    </w:p>
+    <w:p>
+      <w:pPr>
+        <w:pStyle w:val="BodyText"/>
+      </w:pPr>
+      <w:r>
+        <w:t xml:space="preserve">Locke (2005) states</w:t>
+      </w:r>
+      <w:r>
+        <w:t xml:space="preserve"> </w:t>
+      </w:r>
+      <w:r>
+        <w:t xml:space="preserve">“blah blah blah”</w:t>
+      </w:r>
+      <w:r>
+        <w:t xml:space="preserve"> </w:t>
+      </w:r>
+      <w:r>
+        <w:t xml:space="preserve">(p. 365).</w:t>
+      </w:r>
+    </w:p>
+    <w:p>
+      <w:pPr>
+        <w:pStyle w:val="BodyText"/>
+      </w:pPr>
+      <w:r>
+        <w:rPr>
+          <w:b/>
+          <w:bCs/>
+        </w:rPr>
+        <w:t xml:space="preserve">Parenthetical citation</w:t>
+      </w:r>
+    </w:p>
+    <w:p>
+      <w:pPr>
+        <w:pStyle w:val="BodyText"/>
+      </w:pPr>
+      <w:r>
+        <w:t xml:space="preserve">Research suggests</w:t>
+      </w:r>
+      <w:r>
+        <w:t xml:space="preserve"> </w:t>
+      </w:r>
+      <w:r>
+        <w:t xml:space="preserve">“blah blah blah”</w:t>
+      </w:r>
+      <w:r>
+        <w:t xml:space="preserve"> </w:t>
+      </w:r>
+      <w:r>
+        <w:t xml:space="preserve">(Locke, 2005, p. 365).</w:t>
+      </w:r>
+    </w:p>
+    <w:p>
+      <w:pPr>
+        <w:pStyle w:val="BodyText"/>
+      </w:pPr>
+      <w:r>
+        <w:rPr>
+          <w:b/>
+          <w:bCs/>
+        </w:rPr>
+        <w:t xml:space="preserve">Reference list</w:t>
+      </w:r>
+    </w:p>
+    <w:p>
+      <w:pPr>
+        <w:pStyle w:val="BodyText"/>
+      </w:pPr>
+      <w:r>
+        <w:t xml:space="preserve">N/A</w:t>
+      </w:r>
+    </w:p>
+    <w:p>
+      <w:pPr>
+        <w:pStyle w:val="BodyText"/>
+      </w:pPr>
+      <w:r>
+        <w:rPr>
+          <w:b/>
+          <w:bCs/>
+        </w:rPr>
+        <w:t xml:space="preserve">AVOID THESE: Paraphrase instead!</w:t>
+      </w:r>
+    </w:p>
+    <w:bookmarkEnd w:id="27"/>
+    <w:bookmarkStart w:id="29" w:name="book-chapter"/>
+    <w:p>
+      <w:pPr>
+        <w:pStyle w:val="Heading2"/>
+      </w:pPr>
+      <w:r>
+        <w:rPr>
+          <w:b/>
+          <w:bCs/>
+        </w:rPr>
+        <w:t xml:space="preserve">Book chapter</w:t>
+      </w:r>
+    </w:p>
+    <w:p>
+      <w:pPr>
+        <w:pStyle w:val="FirstParagraph"/>
+      </w:pPr>
+      <w:r>
+        <w:rPr>
+          <w:b/>
+          <w:bCs/>
+        </w:rPr>
+        <w:t xml:space="preserve">Narrative citation</w:t>
+      </w:r>
+    </w:p>
+    <w:p>
+      <w:pPr>
+        <w:pStyle w:val="BodyText"/>
+      </w:pPr>
+      <w:r>
+        <w:t xml:space="preserve">Lydon et al. (2009)</w:t>
+      </w:r>
+    </w:p>
+    <w:p>
+      <w:pPr>
+        <w:pStyle w:val="BodyText"/>
+      </w:pPr>
+      <w:r>
+        <w:rPr>
+          <w:b/>
+          <w:bCs/>
+        </w:rPr>
+        <w:t xml:space="preserve">Parenthetical citation</w:t>
+      </w:r>
+    </w:p>
+    <w:p>
+      <w:pPr>
+        <w:pStyle w:val="BodyText"/>
+      </w:pPr>
+      <w:r>
+        <w:t xml:space="preserve">Lydon et al. (2009)</w:t>
+      </w:r>
+    </w:p>
+    <w:p>
+      <w:pPr>
+        <w:pStyle w:val="BodyText"/>
+      </w:pPr>
+      <w:r>
+        <w:rPr>
+          <w:b/>
+          <w:bCs/>
+        </w:rPr>
+        <w:t xml:space="preserve">Reference list</w:t>
+      </w:r>
+    </w:p>
+    <w:p>
+      <w:pPr>
+        <w:pStyle w:val="BodyText"/>
+      </w:pPr>
+      <w:r>
+        <w:t xml:space="preserve">Lydon, J. E., McClure, J. M., &amp; Linardatos, L. (2009). Commitment: Predictors and outcomes. In H. T. Reis &amp; S. Sprecher (Eds.),</w:t>
+      </w:r>
+      <w:r>
+        <w:t xml:space="preserve"> </w:t>
+      </w:r>
+      <w:r>
+        <w:rPr>
+          <w:i/>
+          <w:iCs/>
+        </w:rPr>
+        <w:t xml:space="preserve">Encyclopedia of human relationships</w:t>
+      </w:r>
+      <w:r>
+        <w:t xml:space="preserve">. Sage Publications.</w:t>
+      </w:r>
+    </w:p>
+    <w:p>
+      <w:pPr>
+        <w:pStyle w:val="BodyText"/>
+      </w:pPr>
+      <w:hyperlink r:id="rId28">
+        <w:r>
+          <w:rPr>
+            <w:rStyle w:val="Hyperlink"/>
+          </w:rPr>
+          <w:t xml:space="preserve">https://doi.org/10.4135/9781412958479.n82</w:t>
+        </w:r>
+      </w:hyperlink>
+    </w:p>
+    <w:bookmarkEnd w:id="29"/>
+    <w:bookmarkStart w:id="31" w:name="magazine-article"/>
+    <w:p>
+      <w:pPr>
+        <w:pStyle w:val="Heading2"/>
+      </w:pPr>
+      <w:r>
+        <w:rPr>
+          <w:b/>
+          <w:bCs/>
+        </w:rPr>
+        <w:t xml:space="preserve">Magazine article</w:t>
+      </w:r>
+    </w:p>
+    <w:p>
+      <w:pPr>
+        <w:pStyle w:val="FirstParagraph"/>
+      </w:pPr>
+      <w:r>
+        <w:rPr>
+          <w:b/>
+          <w:bCs/>
+        </w:rPr>
+        <w:t xml:space="preserve">Narrative citation</w:t>
+      </w:r>
+    </w:p>
+    <w:p>
+      <w:pPr>
+        <w:pStyle w:val="BodyText"/>
+      </w:pPr>
+      <w:r>
+        <w:t xml:space="preserve">Marshall (2024)</w:t>
+      </w:r>
+    </w:p>
+    <w:p>
+      <w:pPr>
+        <w:pStyle w:val="BodyText"/>
+      </w:pPr>
+      <w:r>
+        <w:rPr>
+          <w:b/>
+          <w:bCs/>
+        </w:rPr>
+        <w:t xml:space="preserve">Parenthetical citation</w:t>
+      </w:r>
+    </w:p>
+    <w:p>
+      <w:pPr>
+        <w:pStyle w:val="BodyText"/>
+      </w:pPr>
+      <w:r>
+        <w:t xml:space="preserve">(Marshall, 2024)</w:t>
+      </w:r>
+    </w:p>
+    <w:p>
+      <w:pPr>
+        <w:pStyle w:val="BodyText"/>
+      </w:pPr>
+      <w:r>
+        <w:t xml:space="preserve">(Marshall, 2024, para. 3)</w:t>
+      </w:r>
+    </w:p>
+    <w:p>
+      <w:pPr>
+        <w:pStyle w:val="BodyText"/>
+      </w:pPr>
+      <w:r>
+        <w:rPr>
+          <w:b/>
+          <w:bCs/>
+        </w:rPr>
+        <w:t xml:space="preserve">Reference list</w:t>
+      </w:r>
+    </w:p>
+    <w:p>
+      <w:pPr>
+        <w:pStyle w:val="BodyText"/>
+      </w:pPr>
+      <w:r>
+        <w:t xml:space="preserve">Marshall, M. (2024, July 4). Here’s why scientists don’t know how life on Earth began.</w:t>
+      </w:r>
+      <w:r>
+        <w:t xml:space="preserve"> </w:t>
+      </w:r>
+      <w:r>
+        <w:rPr>
+          <w:i/>
+          <w:iCs/>
+        </w:rPr>
+        <w:t xml:space="preserve">BBC Science Focus Magazine</w:t>
+      </w:r>
+      <w:r>
+        <w:t xml:space="preserve">.</w:t>
+      </w:r>
+    </w:p>
+    <w:p>
+      <w:pPr>
+        <w:pStyle w:val="BodyText"/>
+      </w:pPr>
+      <w:hyperlink r:id="rId30">
+        <w:r>
+          <w:rPr>
+            <w:rStyle w:val="Hyperlink"/>
+          </w:rPr>
+          <w:t xml:space="preserve">https://www.sciencefocus.com/science/how-did-life-on-earth-begin</w:t>
+        </w:r>
+      </w:hyperlink>
+    </w:p>
+    <w:bookmarkEnd w:id="31"/>
+    <w:bookmarkStart w:id="38" w:name="audiovisual-media-film"/>
+    <w:p>
+      <w:pPr>
+        <w:pStyle w:val="Heading2"/>
+      </w:pPr>
+      <w:r>
+        <w:rPr>
+          <w:b/>
+          <w:bCs/>
+        </w:rPr>
+        <w:t xml:space="preserve">Audiovisual media (film)</w:t>
+      </w:r>
+    </w:p>
+    <w:p>
+      <w:pPr>
+        <w:pStyle w:val="FirstParagraph"/>
+      </w:pPr>
+      <w:r>
+        <w:rPr>
+          <w:b/>
+          <w:bCs/>
+        </w:rPr>
+        <w:t xml:space="preserve">Narrative citation</w:t>
+      </w:r>
+    </w:p>
+    <w:p>
+      <w:pPr>
+        <w:pStyle w:val="BodyText"/>
+      </w:pPr>
+      <w:r>
+        <w:t xml:space="preserve">Jackson (2001)</w:t>
+      </w:r>
+    </w:p>
+    <w:p>
+      <w:pPr>
+        <w:pStyle w:val="BodyText"/>
+      </w:pPr>
+      <w:r>
+        <w:rPr>
+          <w:b/>
+          <w:bCs/>
+        </w:rPr>
+        <w:t xml:space="preserve">Parenthetical citation</w:t>
+      </w:r>
+    </w:p>
+    <w:p>
+      <w:pPr>
+        <w:pStyle w:val="BodyText"/>
+      </w:pPr>
+      <w:r>
+        <w:t xml:space="preserve">(Jackson, 2001)</w:t>
+      </w:r>
+    </w:p>
+    <w:p>
+      <w:pPr>
+        <w:pStyle w:val="BodyText"/>
+      </w:pPr>
+      <w:r>
+        <w:rPr>
+          <w:b/>
+          <w:bCs/>
+        </w:rPr>
+        <w:t xml:space="preserve">Reference list</w:t>
+      </w:r>
+    </w:p>
+    <w:p>
+      <w:pPr>
+        <w:pStyle w:val="BodyText"/>
+      </w:pPr>
+      <w:r>
+        <w:t xml:space="preserve">Jackson, P. (Director). (2001).</w:t>
+      </w:r>
+      <w:r>
+        <w:t xml:space="preserve"> </w:t>
+      </w:r>
+      <w:r>
+        <w:rPr>
+          <w:i/>
+          <w:iCs/>
+        </w:rPr>
+        <w:t xml:space="preserve">The lord of the rings: The fellowship of the ring</w:t>
+      </w:r>
+      <w:r>
+        <w:t xml:space="preserve"> </w:t>
+      </w:r>
+      <w:r>
+        <w:t xml:space="preserve">[Film; four-disc special extended ed. on DVD]. Wingnut film; the Saul Zaentz company.</w:t>
+      </w:r>
+    </w:p>
+    <w:p>
+      <w:pPr>
+        <w:pStyle w:val="BodyText"/>
+      </w:pPr>
+      <w:r>
+        <w:t xml:space="preserve">For examples of how to list other audiovisual media (TV shows, podcasts, and songs), see</w:t>
+      </w:r>
+      <w:r>
+        <w:t xml:space="preserve"> </w:t>
+      </w:r>
+      <w:hyperlink r:id="rId32">
+        <w:r>
+          <w:rPr>
+            <w:rStyle w:val="Hyperlink"/>
+          </w:rPr>
+          <w:t xml:space="preserve">Purdue OWL audiovisual reference examples</w:t>
+        </w:r>
+      </w:hyperlink>
+      <w:r>
+        <w:t xml:space="preserve">.</w:t>
+      </w:r>
+    </w:p>
+    <w:p>
+      <w:pPr>
+        <w:pStyle w:val="BodyText"/>
+      </w:pPr>
+      <w:r>
+        <w:rPr>
+          <w:b/>
+          <w:bCs/>
+        </w:rPr>
+        <w:t xml:space="preserve">Narrative and parenthetical citations always have the same form (Name, Publication Year).</w:t>
+      </w:r>
+    </w:p>
     <w:p>
       <w:pPr>
         <w:pStyle w:val="BodyText"/>
@@ -780,11 +860,13 @@
     </w:p>
     <w:p>
       <w:pPr>
-        <w:pStyle w:val="Compact"/>
+        <w:pStyle w:val="ListParagraph"/>
         <w:numPr>
           <w:ilvl w:val="0"/>
-          <w:numId w:val="1001"/>
+          <w:numId w:val="100"/>
         </w:numPr>
+        <w:spacing w:before="0" w:after="120" w:line="288" w:lineRule="auto"/>
+        <w:widowControl/>
       </w:pPr>
       <w:r>
         <w:t xml:space="preserve">“References”</w:t>
@@ -798,11 +880,13 @@
     </w:p>
     <w:p>
       <w:pPr>
-        <w:pStyle w:val="Compact"/>
+        <w:pStyle w:val="ListParagraph"/>
         <w:numPr>
           <w:ilvl w:val="0"/>
-          <w:numId w:val="1001"/>
+          <w:numId w:val="100"/>
         </w:numPr>
+        <w:spacing w:before="0" w:after="120" w:line="288" w:lineRule="auto"/>
+        <w:widowControl/>
       </w:pPr>
       <w:r>
         <w:t xml:space="preserve">Everything double-spaced and no extra spaces between heading and first reference</w:t>
@@ -810,11 +894,13 @@
     </w:p>
     <w:p>
       <w:pPr>
-        <w:pStyle w:val="Compact"/>
+        <w:pStyle w:val="ListParagraph"/>
         <w:numPr>
           <w:ilvl w:val="0"/>
-          <w:numId w:val="1001"/>
+          <w:numId w:val="100"/>
         </w:numPr>
+        <w:spacing w:before="0" w:after="120" w:line="288" w:lineRule="auto"/>
+        <w:widowControl/>
       </w:pPr>
       <w:r>
         <w:t xml:space="preserve">Indent second/subsequent lines of each reference by a .5 in hanging indent (</w:t>
@@ -831,11 +917,13 @@
     </w:p>
     <w:p>
       <w:pPr>
-        <w:pStyle w:val="Compact"/>
+        <w:pStyle w:val="ListParagraph"/>
         <w:numPr>
           <w:ilvl w:val="0"/>
-          <w:numId w:val="1001"/>
+          <w:numId w:val="100"/>
         </w:numPr>
+        <w:spacing w:before="0" w:after="120" w:line="288" w:lineRule="auto"/>
+        <w:widowControl/>
       </w:pPr>
       <w:r>
         <w:t xml:space="preserve">Alphabetize by first author’s last name</w:t>
@@ -843,11 +931,13 @@
     </w:p>
     <w:p>
       <w:pPr>
-        <w:pStyle w:val="Compact"/>
+        <w:pStyle w:val="ListParagraph"/>
         <w:numPr>
           <w:ilvl w:val="0"/>
-          <w:numId w:val="1001"/>
+          <w:numId w:val="100"/>
         </w:numPr>
+        <w:spacing w:before="0" w:after="120" w:line="288" w:lineRule="auto"/>
+        <w:widowControl/>
       </w:pPr>
       <w:r>
         <w:t xml:space="preserve">When a journal article has a DOI, present it as a URL in the format</w:t>
@@ -890,7 +980,7 @@
       <w:r>
         <w:t xml:space="preserve"> </w:t>
       </w:r>
-      <w:hyperlink r:id="rId26">
+      <w:hyperlink r:id="rId33">
         <w:r>
           <w:rPr>
             <w:rStyle w:val="Hyperlink"/>
@@ -904,12 +994,12 @@
       <w:r>
         <w:t xml:space="preserve"> </w:t>
       </w:r>
-      <w:hyperlink r:id="rId27">
+      <w:hyperlink r:id="rId34">
         <w:r>
           <w:rPr>
             <w:rStyle w:val="Hyperlink"/>
           </w:rPr>
-          <w:t xml:space="preserve">https://www.facebook.com/APAStyle</w:t>
+          <w:t xml:space="preserve">APA Style on Facebook</w:t>
         </w:r>
       </w:hyperlink>
       <w:r>
@@ -918,12 +1008,12 @@
       <w:r>
         <w:t xml:space="preserve"> </w:t>
       </w:r>
-      <w:hyperlink r:id="rId28">
+      <w:hyperlink r:id="rId35">
         <w:r>
           <w:rPr>
             <w:rStyle w:val="Hyperlink"/>
           </w:rPr>
-          <w:t xml:space="preserve">https://www.instagram.com/officialapastyle/</w:t>
+          <w:t xml:space="preserve">APA Style on Instagram</w:t>
         </w:r>
       </w:hyperlink>
       <w:r>
@@ -932,12 +1022,12 @@
       <w:r>
         <w:t xml:space="preserve"> </w:t>
       </w:r>
-      <w:hyperlink r:id="rId29">
+      <w:hyperlink r:id="rId36">
         <w:r>
           <w:rPr>
             <w:rStyle w:val="Hyperlink"/>
           </w:rPr>
-          <w:t xml:space="preserve">https://apastyle.apa.org</w:t>
+          <w:t xml:space="preserve">APA Style blog</w:t>
         </w:r>
       </w:hyperlink>
     </w:p>
@@ -951,17 +1041,18 @@
       <w:r>
         <w:t xml:space="preserve"> </w:t>
       </w:r>
-      <w:hyperlink r:id="rId30">
+      <w:hyperlink r:id="rId37">
         <w:r>
           <w:rPr>
             <w:rStyle w:val="Hyperlink"/>
           </w:rPr>
-          <w:t xml:space="preserve">https://apastyle.apa.org/style-grammar-guidelines/index</w:t>
+          <w:t xml:space="preserve">APA style and grammar guidelines</w:t>
         </w:r>
       </w:hyperlink>
     </w:p>
-    <w:bookmarkEnd w:id="31"/>
-    <w:bookmarkStart w:id="32" w:name="X5810a6386b602a6f5dffa74940a8fd153e1ea49"/>
+    <w:bookmarkEnd w:id="38"/>
+    <w:bookmarkEnd w:id="39"/>
+    <w:bookmarkStart w:id="48" w:name="X5810a6386b602a6f5dffa74940a8fd153e1ea49"/>
     <w:p>
       <w:pPr>
         <w:pStyle w:val="Heading1"/>
@@ -970,642 +1061,593 @@
         <w:t xml:space="preserve">Journal Article Reference List Checklist (For EACH source)</w:t>
       </w:r>
     </w:p>
-    <w:tbl>
-      <w:tblPr>
-        <w:tblStyle w:val="Table"/>
-        <w:tblW w:type="pct" w:w="5000"/>
-        <w:tblLayout w:type="fixed"/>
-        <w:tblLook w:firstRow="0" w:lastRow="0" w:firstColumn="0" w:lastColumn="0" w:noHBand="0" w:noVBand="0" w:val="0000"/>
-      </w:tblPr>
-      <w:tblGrid>
-        <w:gridCol w:w="3960"/>
-        <w:gridCol w:w="3960"/>
-      </w:tblGrid>
-      <w:tr>
-        <w:tc>
-          <w:tcPr/>
-          <w:p>
-            <w:pPr>
-              <w:pStyle w:val="FirstParagraph"/>
-            </w:pPr>
-            <w:r>
-              <w:rPr>
-                <w:b/>
-                <w:bCs/>
-              </w:rPr>
-              <w:t xml:space="preserve">1. Author(s)</w:t>
-            </w:r>
-          </w:p>
-          <w:p>
-            <w:pPr>
-              <w:pStyle w:val="Compact"/>
-              <w:numPr>
-                <w:ilvl w:val="0"/>
-                <w:numId w:val="1002"/>
-              </w:numPr>
-            </w:pPr>
-            <w:r>
-              <w:t xml:space="preserve">Names in same order as listed on the article title page</w:t>
-            </w:r>
-          </w:p>
-          <w:p>
-            <w:pPr>
-              <w:pStyle w:val="Compact"/>
-              <w:numPr>
-                <w:ilvl w:val="0"/>
-                <w:numId w:val="1002"/>
-              </w:numPr>
-            </w:pPr>
-            <w:r>
-              <w:t xml:space="preserve">Author’s last name, followed by a comma, and their initials with a period and a space after each initial–NO full first or</w:t>
-            </w:r>
-            <w:r>
-              <w:t xml:space="preserve"> </w:t>
-            </w:r>
-            <w:r>
-              <w:t xml:space="preserve">middle names</w:t>
-            </w:r>
-          </w:p>
-          <w:p>
-            <w:pPr>
-              <w:pStyle w:val="Compact"/>
-              <w:numPr>
-                <w:ilvl w:val="0"/>
-                <w:numId w:val="1002"/>
-              </w:numPr>
-            </w:pPr>
-            <w:r>
-              <w:t xml:space="preserve">Comma after final initial of previous author and before last name of the next author</w:t>
-            </w:r>
-          </w:p>
-          <w:p>
-            <w:pPr>
-              <w:pStyle w:val="Compact"/>
-              <w:numPr>
-                <w:ilvl w:val="0"/>
-                <w:numId w:val="1002"/>
-              </w:numPr>
-            </w:pPr>
-            <w:r>
-              <w:t xml:space="preserve">“&amp;”</w:t>
-            </w:r>
-            <w:r>
-              <w:t xml:space="preserve"> </w:t>
-            </w:r>
-            <w:r>
-              <w:t xml:space="preserve">before final author’s last name</w:t>
-            </w:r>
-          </w:p>
-          <w:p>
-            <w:pPr>
-              <w:pStyle w:val="Compact"/>
-              <w:numPr>
-                <w:ilvl w:val="0"/>
-                <w:numId w:val="1002"/>
-              </w:numPr>
-            </w:pPr>
-            <w:r>
-              <w:t xml:space="preserve">If 20 or more authors, list first 20 authors, then ” … “, then last author</w:t>
-            </w:r>
-          </w:p>
-          <w:p>
-            <w:pPr>
-              <w:pStyle w:val="Compact"/>
-              <w:numPr>
-                <w:ilvl w:val="0"/>
-                <w:numId w:val="1002"/>
-              </w:numPr>
-            </w:pPr>
-            <w:r>
-              <w:t xml:space="preserve">Period after final author’s initials</w:t>
-            </w:r>
-          </w:p>
-        </w:tc>
-        <w:tc>
-          <w:tcPr/>
-          <w:p>
-            <w:pPr>
-              <w:pStyle w:val="FirstParagraph"/>
-            </w:pPr>
-            <w:r>
-              <w:rPr>
-                <w:b/>
-                <w:bCs/>
-              </w:rPr>
-              <w:t xml:space="preserve">3. Article Title</w:t>
-            </w:r>
-          </w:p>
-          <w:p>
-            <w:pPr>
-              <w:pStyle w:val="Compact"/>
-              <w:numPr>
-                <w:ilvl w:val="0"/>
-                <w:numId w:val="1003"/>
-              </w:numPr>
-            </w:pPr>
-            <w:r>
-              <w:t xml:space="preserve">Use sentence case–Lowercase most words; only capitalize the first word of the title, proper nouns, and the first word after</w:t>
-            </w:r>
-            <w:r>
-              <w:t xml:space="preserve"> </w:t>
-            </w:r>
-            <w:r>
-              <w:t xml:space="preserve">punctuation within the title (e.g., after a colon)</w:t>
-            </w:r>
-          </w:p>
-          <w:p>
-            <w:pPr>
-              <w:pStyle w:val="Compact"/>
-              <w:numPr>
-                <w:ilvl w:val="0"/>
-                <w:numId w:val="1003"/>
-              </w:numPr>
-            </w:pPr>
-            <w:r>
-              <w:t xml:space="preserve">No italics or any other special formatting</w:t>
-            </w:r>
-          </w:p>
-          <w:p>
-            <w:pPr>
-              <w:pStyle w:val="Compact"/>
-              <w:numPr>
-                <w:ilvl w:val="0"/>
-                <w:numId w:val="1003"/>
-              </w:numPr>
-            </w:pPr>
-            <w:r>
-              <w:t xml:space="preserve">Period at the end of title</w:t>
-            </w:r>
-          </w:p>
-          <w:p>
-            <w:pPr>
-              <w:pStyle w:val="FirstParagraph"/>
-            </w:pPr>
-            <w:r>
-              <w:rPr>
-                <w:b/>
-                <w:bCs/>
-              </w:rPr>
-              <w:t xml:space="preserve">4. Journal Title</w:t>
-            </w:r>
-          </w:p>
-          <w:p>
-            <w:pPr>
-              <w:pStyle w:val="Compact"/>
-              <w:numPr>
-                <w:ilvl w:val="0"/>
-                <w:numId w:val="1004"/>
-              </w:numPr>
-            </w:pPr>
-            <w:r>
-              <w:t xml:space="preserve">Write the title as shown on the cited work</w:t>
-            </w:r>
-          </w:p>
-          <w:p>
-            <w:pPr>
-              <w:pStyle w:val="Compact"/>
-              <w:numPr>
-                <w:ilvl w:val="0"/>
-                <w:numId w:val="1004"/>
-              </w:numPr>
-            </w:pPr>
-            <w:r>
-              <w:t xml:space="preserve">Use Title Case–Capitalize most words; only lowercase words of three letters or fewer (except the first word in the title and</w:t>
-            </w:r>
-            <w:r>
-              <w:t xml:space="preserve"> </w:t>
-            </w:r>
-            <w:r>
-              <w:t xml:space="preserve">after punctuation within the title)</w:t>
-            </w:r>
-          </w:p>
-          <w:p>
-            <w:pPr>
-              <w:pStyle w:val="Compact"/>
-              <w:numPr>
-                <w:ilvl w:val="0"/>
-                <w:numId w:val="1004"/>
-              </w:numPr>
-            </w:pPr>
-            <w:r>
-              <w:t xml:space="preserve">Italicize the journal title</w:t>
-            </w:r>
-          </w:p>
-          <w:p>
-            <w:pPr>
-              <w:pStyle w:val="Compact"/>
-              <w:numPr>
-                <w:ilvl w:val="0"/>
-                <w:numId w:val="1004"/>
-              </w:numPr>
-            </w:pPr>
-            <w:r>
-              <w:t xml:space="preserve">Comma after the end of title; do not italicize the comma</w:t>
-            </w:r>
-          </w:p>
-        </w:tc>
-      </w:tr>
-      <w:tr>
-        <w:tc>
-          <w:tcPr/>
-          <w:p>
-            <w:pPr>
-              <w:pStyle w:val="FirstParagraph"/>
-            </w:pPr>
-            <w:r>
-              <w:rPr>
-                <w:b/>
-                <w:bCs/>
-              </w:rPr>
-              <w:t xml:space="preserve">2. Year (xxxx)</w:t>
-            </w:r>
-          </w:p>
-          <w:p>
-            <w:pPr>
-              <w:pStyle w:val="Compact"/>
-              <w:numPr>
-                <w:ilvl w:val="0"/>
-                <w:numId w:val="1005"/>
-              </w:numPr>
-            </w:pPr>
-            <w:r>
-              <w:t xml:space="preserve">In parentheses</w:t>
-            </w:r>
-          </w:p>
-          <w:p>
-            <w:pPr>
-              <w:pStyle w:val="Compact"/>
-              <w:numPr>
-                <w:ilvl w:val="0"/>
-                <w:numId w:val="1005"/>
-              </w:numPr>
-            </w:pPr>
-            <w:r>
-              <w:t xml:space="preserve">Year only (other periodicals [e.g., blog, newspaper, magazine] may include month, day, or season)</w:t>
-            </w:r>
-          </w:p>
-          <w:p>
-            <w:pPr>
-              <w:pStyle w:val="Compact"/>
-              <w:numPr>
-                <w:ilvl w:val="0"/>
-                <w:numId w:val="1005"/>
-              </w:numPr>
-            </w:pPr>
-            <w:r>
-              <w:t xml:space="preserve">Period after closing parenthesis</w:t>
-            </w:r>
-          </w:p>
-        </w:tc>
-        <w:tc>
-          <w:tcPr/>
-          <w:p>
-            <w:pPr>
-              <w:pStyle w:val="FirstParagraph"/>
-            </w:pPr>
-            <w:r>
-              <w:rPr>
-                <w:b/>
-                <w:bCs/>
-              </w:rPr>
-              <w:t xml:space="preserve">5. Journal Volume Number</w:t>
-            </w:r>
-          </w:p>
-          <w:p>
-            <w:pPr>
-              <w:pStyle w:val="Compact"/>
-              <w:numPr>
-                <w:ilvl w:val="0"/>
-                <w:numId w:val="1006"/>
-              </w:numPr>
-            </w:pPr>
-            <w:r>
-              <w:t xml:space="preserve">Italicize the volume</w:t>
-            </w:r>
-          </w:p>
-          <w:p>
-            <w:pPr>
-              <w:pStyle w:val="Compact"/>
-              <w:numPr>
-                <w:ilvl w:val="0"/>
-                <w:numId w:val="1006"/>
-              </w:numPr>
-            </w:pPr>
-            <w:r>
-              <w:t xml:space="preserve">If no issue number, place a comma directly after the number</w:t>
-            </w:r>
-          </w:p>
-          <w:p>
-            <w:pPr>
-              <w:pStyle w:val="Compact"/>
-              <w:numPr>
-                <w:ilvl w:val="0"/>
-                <w:numId w:val="1006"/>
-              </w:numPr>
-            </w:pPr>
-            <w:r>
-              <w:t xml:space="preserve">Do not italicize the comma after the volume number</w:t>
-            </w:r>
-          </w:p>
-        </w:tc>
-      </w:tr>
-      <w:tr>
-        <w:tc>
-          <w:tcPr/>
-          <w:p>
-            <w:pPr>
-              <w:pStyle w:val="FirstParagraph"/>
-            </w:pPr>
-            <w:r>
-              <w:rPr>
-                <w:b/>
-                <w:bCs/>
-              </w:rPr>
-              <w:t xml:space="preserve">6. Journal Issue Number</w:t>
-            </w:r>
-          </w:p>
-          <w:p>
-            <w:pPr>
-              <w:pStyle w:val="Compact"/>
-              <w:numPr>
-                <w:ilvl w:val="0"/>
-                <w:numId w:val="1007"/>
-              </w:numPr>
-            </w:pPr>
-            <w:r>
-              <w:t xml:space="preserve">Include the issue number whenever available</w:t>
-            </w:r>
-          </w:p>
-          <w:p>
-            <w:pPr>
-              <w:pStyle w:val="Compact"/>
-              <w:numPr>
-                <w:ilvl w:val="0"/>
-                <w:numId w:val="1007"/>
-              </w:numPr>
-            </w:pPr>
-            <w:r>
-              <w:t xml:space="preserve">Put the number in parentheses DIRECTLY after the volume number–no space between the volume number and the opening parentheses</w:t>
-            </w:r>
-          </w:p>
-          <w:p>
-            <w:pPr>
-              <w:pStyle w:val="Compact"/>
-              <w:numPr>
-                <w:ilvl w:val="0"/>
-                <w:numId w:val="1007"/>
-              </w:numPr>
-            </w:pPr>
-            <w:r>
-              <w:t xml:space="preserve">Do not use italics or any other special formatting for this number and the parentheses</w:t>
-            </w:r>
-          </w:p>
-          <w:p>
-            <w:pPr>
-              <w:pStyle w:val="Compact"/>
-              <w:numPr>
-                <w:ilvl w:val="0"/>
-                <w:numId w:val="1007"/>
-              </w:numPr>
-            </w:pPr>
-            <w:r>
-              <w:t xml:space="preserve">Comma after closing parenthesis</w:t>
-            </w:r>
-          </w:p>
-        </w:tc>
-        <w:tc>
-          <w:tcPr/>
-          <w:p>
-            <w:pPr>
-              <w:pStyle w:val="FirstParagraph"/>
-            </w:pPr>
-            <w:r>
-              <w:rPr>
-                <w:b/>
-                <w:bCs/>
-              </w:rPr>
-              <w:t xml:space="preserve">7. Page Numbers</w:t>
-            </w:r>
-          </w:p>
-          <w:p>
-            <w:pPr>
-              <w:pStyle w:val="Compact"/>
-              <w:numPr>
-                <w:ilvl w:val="0"/>
-                <w:numId w:val="1008"/>
-              </w:numPr>
-            </w:pPr>
-            <w:r>
-              <w:t xml:space="preserve">Include full page range of article, even if you only use information from one page</w:t>
-            </w:r>
-          </w:p>
-          <w:p>
-            <w:pPr>
-              <w:pStyle w:val="Compact"/>
-              <w:numPr>
-                <w:ilvl w:val="0"/>
-                <w:numId w:val="1008"/>
-              </w:numPr>
-            </w:pPr>
-            <w:r>
-              <w:t xml:space="preserve">No italics or any other special formatting</w:t>
-            </w:r>
-          </w:p>
-          <w:p>
-            <w:pPr>
-              <w:pStyle w:val="Compact"/>
-              <w:numPr>
-                <w:ilvl w:val="0"/>
-                <w:numId w:val="1008"/>
-              </w:numPr>
-            </w:pPr>
-            <w:r>
-              <w:t xml:space="preserve">Separate the page numbers in the range using an en dash</w:t>
-            </w:r>
-            <w:r>
-              <w:t xml:space="preserve"> </w:t>
-            </w:r>
-            <w:r>
-              <w:t xml:space="preserve">“–”</w:t>
-            </w:r>
-            <w:r>
-              <w:t xml:space="preserve"> </w:t>
-            </w:r>
-            <w:r>
-              <w:t xml:space="preserve">(this is longer than a hyphen, and is usually typed by hitting</w:t>
-            </w:r>
-            <w:r>
-              <w:t xml:space="preserve"> </w:t>
-            </w:r>
-            <w:r>
-              <w:t xml:space="preserve">option+hyphen, or alt+hyphen)</w:t>
-            </w:r>
-          </w:p>
-          <w:p>
-            <w:pPr>
-              <w:pStyle w:val="Compact"/>
-              <w:numPr>
-                <w:ilvl w:val="0"/>
-                <w:numId w:val="1008"/>
-              </w:numPr>
-            </w:pPr>
-            <w:r>
-              <w:t xml:space="preserve">No page abbreviation such as pp. or pg. before the page numbers</w:t>
-            </w:r>
-          </w:p>
-          <w:p>
-            <w:pPr>
-              <w:pStyle w:val="Compact"/>
-              <w:numPr>
-                <w:ilvl w:val="0"/>
-                <w:numId w:val="1008"/>
-              </w:numPr>
-            </w:pPr>
-            <w:r>
-              <w:t xml:space="preserve">Period after second page number</w:t>
-            </w:r>
-          </w:p>
-          <w:p>
-            <w:pPr>
-              <w:pStyle w:val="Compact"/>
-              <w:numPr>
-                <w:ilvl w:val="0"/>
-                <w:numId w:val="1008"/>
-              </w:numPr>
-            </w:pPr>
-            <w:r>
-              <w:t xml:space="preserve">If an article number or eLocator instead of a page range, write the word</w:t>
-            </w:r>
-            <w:r>
-              <w:t xml:space="preserve"> </w:t>
-            </w:r>
-            <w:r>
-              <w:t xml:space="preserve">“Article”</w:t>
-            </w:r>
-            <w:r>
-              <w:t xml:space="preserve"> </w:t>
-            </w:r>
-            <w:r>
-              <w:t xml:space="preserve">(capitalized) and then the article number</w:t>
-            </w:r>
-          </w:p>
-        </w:tc>
-      </w:tr>
-      <w:tr>
-        <w:tc>
-          <w:tcPr>
-            <w:gridSpan w:val="2"/>
-          </w:tcPr>
-          <w:p>
-            <w:pPr>
-              <w:pStyle w:val="FirstParagraph"/>
-            </w:pPr>
-            <w:r>
-              <w:rPr>
-                <w:b/>
-                <w:bCs/>
-              </w:rPr>
-              <w:t xml:space="preserve">8. DOI or URL</w:t>
-            </w:r>
-          </w:p>
-          <w:p>
-            <w:pPr>
-              <w:pStyle w:val="Compact"/>
-              <w:numPr>
-                <w:ilvl w:val="0"/>
-                <w:numId w:val="1009"/>
-              </w:numPr>
-            </w:pPr>
-            <w:r>
-              <w:t xml:space="preserve">Include the DOI if available</w:t>
-            </w:r>
-          </w:p>
-          <w:p>
-            <w:pPr>
-              <w:pStyle w:val="Compact"/>
-              <w:numPr>
-                <w:ilvl w:val="0"/>
-                <w:numId w:val="1009"/>
-              </w:numPr>
-            </w:pPr>
-            <w:r>
-              <w:t xml:space="preserve">Use the CrossRef DOI search engine if you cannot find the DOI in your article</w:t>
-            </w:r>
-          </w:p>
-          <w:p>
-            <w:pPr>
-              <w:pStyle w:val="Compact"/>
-              <w:numPr>
-                <w:ilvl w:val="0"/>
-                <w:numId w:val="1009"/>
-              </w:numPr>
-            </w:pPr>
-            <w:r>
-              <w:t xml:space="preserve">Include the URL (website address) if retrieved online</w:t>
-            </w:r>
-            <w:r>
-              <w:t xml:space="preserve"> </w:t>
-            </w:r>
-            <w:r>
-              <w:rPr>
-                <w:b/>
-                <w:bCs/>
-              </w:rPr>
-              <w:t xml:space="preserve">and</w:t>
-            </w:r>
-            <w:r>
-              <w:t xml:space="preserve"> </w:t>
-            </w:r>
-            <w:r>
-              <w:t xml:space="preserve">it has no DOI</w:t>
-            </w:r>
-          </w:p>
-          <w:p>
-            <w:pPr>
-              <w:pStyle w:val="Compact"/>
-              <w:numPr>
-                <w:ilvl w:val="0"/>
-                <w:numId w:val="1009"/>
-              </w:numPr>
-            </w:pPr>
-            <w:r>
-              <w:t xml:space="preserve">Copy and paste the EXACT string of letters and numbers</w:t>
-            </w:r>
-          </w:p>
-          <w:p>
-            <w:pPr>
-              <w:pStyle w:val="Compact"/>
-              <w:numPr>
-                <w:ilvl w:val="0"/>
-                <w:numId w:val="1009"/>
-              </w:numPr>
-            </w:pPr>
-            <w:r>
-              <w:t xml:space="preserve">NO closing punctuation</w:t>
-            </w:r>
-          </w:p>
-          <w:p>
-            <w:pPr>
-              <w:pStyle w:val="Compact"/>
-              <w:numPr>
-                <w:ilvl w:val="0"/>
-                <w:numId w:val="1009"/>
-              </w:numPr>
-            </w:pPr>
-            <w:r>
-              <w:t xml:space="preserve">Do not write</w:t>
-            </w:r>
-            <w:r>
-              <w:t xml:space="preserve"> </w:t>
-            </w:r>
-            <w:r>
-              <w:t xml:space="preserve">“Retrieved from”</w:t>
-            </w:r>
-          </w:p>
-        </w:tc>
-      </w:tr>
-    </w:tbl>
-    <w:bookmarkEnd w:id="32"/>
+    <w:bookmarkStart w:id="40" w:name="authors"/>
+    <w:p>
+      <w:pPr>
+        <w:pStyle w:val="Heading2"/>
+      </w:pPr>
+      <w:r>
+        <w:t xml:space="preserve">1. Author(s)</w:t>
+      </w:r>
+    </w:p>
+    <w:p>
+      <w:pPr>
+        <w:pStyle w:val="ListParagraph"/>
+        <w:numPr>
+          <w:ilvl w:val="0"/>
+          <w:numId w:val="101"/>
+        </w:numPr>
+        <w:spacing w:before="0" w:after="120" w:line="288" w:lineRule="auto"/>
+        <w:widowControl/>
+      </w:pPr>
+      <w:r>
+        <w:t xml:space="preserve">Names in same order as listed on the article title page</w:t>
+      </w:r>
+    </w:p>
+    <w:p>
+      <w:pPr>
+        <w:pStyle w:val="ListParagraph"/>
+        <w:numPr>
+          <w:ilvl w:val="0"/>
+          <w:numId w:val="101"/>
+        </w:numPr>
+        <w:spacing w:before="0" w:after="120" w:line="288" w:lineRule="auto"/>
+        <w:widowControl/>
+      </w:pPr>
+      <w:r>
+        <w:t xml:space="preserve">Author’s last name, followed by a comma, and their initials with a period and a space after each initial–NO full first or middle names</w:t>
+      </w:r>
+    </w:p>
+    <w:p>
+      <w:pPr>
+        <w:pStyle w:val="ListParagraph"/>
+        <w:numPr>
+          <w:ilvl w:val="0"/>
+          <w:numId w:val="101"/>
+        </w:numPr>
+        <w:spacing w:before="0" w:after="120" w:line="288" w:lineRule="auto"/>
+        <w:widowControl/>
+      </w:pPr>
+      <w:r>
+        <w:t xml:space="preserve">Comma after final initial of previous author and before last name of the next author</w:t>
+      </w:r>
+    </w:p>
+    <w:p>
+      <w:pPr>
+        <w:pStyle w:val="ListParagraph"/>
+        <w:numPr>
+          <w:ilvl w:val="0"/>
+          <w:numId w:val="101"/>
+        </w:numPr>
+        <w:spacing w:before="0" w:after="120" w:line="288" w:lineRule="auto"/>
+        <w:widowControl/>
+      </w:pPr>
+      <w:r>
+        <w:t xml:space="preserve">“&amp;” before final author’s last name</w:t>
+      </w:r>
+    </w:p>
+    <w:p>
+      <w:pPr>
+        <w:pStyle w:val="ListParagraph"/>
+        <w:numPr>
+          <w:ilvl w:val="0"/>
+          <w:numId w:val="101"/>
+        </w:numPr>
+        <w:spacing w:before="0" w:after="120" w:line="288" w:lineRule="auto"/>
+        <w:widowControl/>
+      </w:pPr>
+      <w:r>
+        <w:t xml:space="preserve">If 20 or more authors, list first 20 authors, then “ … ”, then last author</w:t>
+      </w:r>
+    </w:p>
+    <w:p>
+      <w:pPr>
+        <w:pStyle w:val="ListParagraph"/>
+        <w:numPr>
+          <w:ilvl w:val="0"/>
+          <w:numId w:val="101"/>
+        </w:numPr>
+        <w:spacing w:before="0" w:after="120" w:line="288" w:lineRule="auto"/>
+        <w:widowControl/>
+      </w:pPr>
+      <w:r>
+        <w:t xml:space="preserve">Period after final author’s initials</w:t>
+      </w:r>
+    </w:p>
+    <w:bookmarkEnd w:id="40"/>
+    <w:bookmarkStart w:id="41" w:name="year-xxxx"/>
+    <w:p>
+      <w:pPr>
+        <w:pStyle w:val="Heading2"/>
+      </w:pPr>
+      <w:r>
+        <w:t xml:space="preserve">2. Year (xxxx)</w:t>
+      </w:r>
+    </w:p>
+    <w:p>
+      <w:pPr>
+        <w:pStyle w:val="ListParagraph"/>
+        <w:numPr>
+          <w:ilvl w:val="0"/>
+          <w:numId w:val="102"/>
+        </w:numPr>
+        <w:spacing w:before="0" w:after="120" w:line="288" w:lineRule="auto"/>
+        <w:widowControl/>
+      </w:pPr>
+      <w:r>
+        <w:t xml:space="preserve">In parentheses</w:t>
+      </w:r>
+    </w:p>
+    <w:p>
+      <w:pPr>
+        <w:pStyle w:val="ListParagraph"/>
+        <w:numPr>
+          <w:ilvl w:val="0"/>
+          <w:numId w:val="102"/>
+        </w:numPr>
+        <w:spacing w:before="0" w:after="120" w:line="288" w:lineRule="auto"/>
+        <w:widowControl/>
+      </w:pPr>
+      <w:r>
+        <w:t xml:space="preserve">Year only (other periodicals [e.g., blog, newspaper, magazine] may include month, day, or season)</w:t>
+      </w:r>
+    </w:p>
+    <w:p>
+      <w:pPr>
+        <w:pStyle w:val="ListParagraph"/>
+        <w:numPr>
+          <w:ilvl w:val="0"/>
+          <w:numId w:val="102"/>
+        </w:numPr>
+        <w:spacing w:before="0" w:after="120" w:line="288" w:lineRule="auto"/>
+        <w:widowControl/>
+      </w:pPr>
+      <w:r>
+        <w:t xml:space="preserve">Period after closing parenthesis</w:t>
+      </w:r>
+    </w:p>
+    <w:bookmarkEnd w:id="41"/>
+    <w:bookmarkStart w:id="42" w:name="article-title"/>
+    <w:p>
+      <w:pPr>
+        <w:pStyle w:val="Heading2"/>
+      </w:pPr>
+      <w:r>
+        <w:t xml:space="preserve">3. Article Title</w:t>
+      </w:r>
+    </w:p>
+    <w:p>
+      <w:pPr>
+        <w:pStyle w:val="ListParagraph"/>
+        <w:numPr>
+          <w:ilvl w:val="0"/>
+          <w:numId w:val="103"/>
+        </w:numPr>
+        <w:spacing w:before="0" w:after="120" w:line="288" w:lineRule="auto"/>
+        <w:widowControl/>
+      </w:pPr>
+      <w:r>
+        <w:t xml:space="preserve">Use sentence case–Lowercase most words; only capitalize the first word of the title, proper nouns, and the first word after punctuation within the title (e.g., after a colon)</w:t>
+      </w:r>
+    </w:p>
+    <w:p>
+      <w:pPr>
+        <w:pStyle w:val="ListParagraph"/>
+        <w:numPr>
+          <w:ilvl w:val="0"/>
+          <w:numId w:val="103"/>
+        </w:numPr>
+        <w:spacing w:before="0" w:after="120" w:line="288" w:lineRule="auto"/>
+        <w:widowControl/>
+      </w:pPr>
+      <w:r>
+        <w:t xml:space="preserve">No italics or any other special formatting</w:t>
+      </w:r>
+    </w:p>
+    <w:p>
+      <w:pPr>
+        <w:pStyle w:val="ListParagraph"/>
+        <w:numPr>
+          <w:ilvl w:val="0"/>
+          <w:numId w:val="103"/>
+        </w:numPr>
+        <w:spacing w:before="0" w:after="120" w:line="288" w:lineRule="auto"/>
+        <w:widowControl/>
+      </w:pPr>
+      <w:r>
+        <w:t xml:space="preserve">Period at the end of title</w:t>
+      </w:r>
+    </w:p>
+    <w:bookmarkEnd w:id="42"/>
+    <w:bookmarkStart w:id="43" w:name="journal-title"/>
+    <w:p>
+      <w:pPr>
+        <w:pStyle w:val="Heading2"/>
+      </w:pPr>
+      <w:r>
+        <w:t xml:space="preserve">4. Journal Title</w:t>
+      </w:r>
+    </w:p>
+    <w:p>
+      <w:pPr>
+        <w:pStyle w:val="ListParagraph"/>
+        <w:numPr>
+          <w:ilvl w:val="0"/>
+          <w:numId w:val="104"/>
+        </w:numPr>
+        <w:spacing w:before="0" w:after="120" w:line="288" w:lineRule="auto"/>
+        <w:widowControl/>
+      </w:pPr>
+      <w:r>
+        <w:t xml:space="preserve">Write the title as shown on the cited work</w:t>
+      </w:r>
+    </w:p>
+    <w:p>
+      <w:pPr>
+        <w:pStyle w:val="ListParagraph"/>
+        <w:numPr>
+          <w:ilvl w:val="0"/>
+          <w:numId w:val="104"/>
+        </w:numPr>
+        <w:spacing w:before="0" w:after="120" w:line="288" w:lineRule="auto"/>
+        <w:widowControl/>
+      </w:pPr>
+      <w:r>
+        <w:t xml:space="preserve">Use Title Case–Capitalize most words; only lowercase words of three letters or fewer (except the first word in the title and after punctuation within the title)</w:t>
+      </w:r>
+    </w:p>
+    <w:p>
+      <w:pPr>
+        <w:pStyle w:val="ListParagraph"/>
+        <w:numPr>
+          <w:ilvl w:val="0"/>
+          <w:numId w:val="104"/>
+        </w:numPr>
+        <w:spacing w:before="0" w:after="120" w:line="288" w:lineRule="auto"/>
+        <w:widowControl/>
+      </w:pPr>
+      <w:r>
+        <w:t xml:space="preserve">Italicize the journal title</w:t>
+      </w:r>
+    </w:p>
+    <w:p>
+      <w:pPr>
+        <w:pStyle w:val="ListParagraph"/>
+        <w:numPr>
+          <w:ilvl w:val="0"/>
+          <w:numId w:val="104"/>
+        </w:numPr>
+        <w:spacing w:before="0" w:after="120" w:line="288" w:lineRule="auto"/>
+        <w:widowControl/>
+      </w:pPr>
+      <w:r>
+        <w:t xml:space="preserve">Comma after the end of title; do not italicize the comma</w:t>
+      </w:r>
+    </w:p>
+    <w:bookmarkEnd w:id="43"/>
+    <w:bookmarkStart w:id="44" w:name="journal-volume-number"/>
+    <w:p>
+      <w:pPr>
+        <w:pStyle w:val="Heading2"/>
+      </w:pPr>
+      <w:r>
+        <w:t xml:space="preserve">5. Journal Volume Number</w:t>
+      </w:r>
+    </w:p>
+    <w:p>
+      <w:pPr>
+        <w:pStyle w:val="ListParagraph"/>
+        <w:numPr>
+          <w:ilvl w:val="0"/>
+          <w:numId w:val="105"/>
+        </w:numPr>
+        <w:spacing w:before="0" w:after="120" w:line="288" w:lineRule="auto"/>
+        <w:widowControl/>
+      </w:pPr>
+      <w:r>
+        <w:t xml:space="preserve">Italicize the volume</w:t>
+      </w:r>
+    </w:p>
+    <w:p>
+      <w:pPr>
+        <w:pStyle w:val="ListParagraph"/>
+        <w:numPr>
+          <w:ilvl w:val="0"/>
+          <w:numId w:val="105"/>
+        </w:numPr>
+        <w:spacing w:before="0" w:after="120" w:line="288" w:lineRule="auto"/>
+        <w:widowControl/>
+      </w:pPr>
+      <w:r>
+        <w:t xml:space="preserve">If no issue number, place a comma directly after the number</w:t>
+      </w:r>
+    </w:p>
+    <w:p>
+      <w:pPr>
+        <w:pStyle w:val="ListParagraph"/>
+        <w:numPr>
+          <w:ilvl w:val="0"/>
+          <w:numId w:val="105"/>
+        </w:numPr>
+        <w:spacing w:before="0" w:after="120" w:line="288" w:lineRule="auto"/>
+        <w:widowControl/>
+      </w:pPr>
+      <w:r>
+        <w:t xml:space="preserve">Do not italicize the comma after the volume number</w:t>
+      </w:r>
+    </w:p>
+    <w:bookmarkEnd w:id="44"/>
+    <w:bookmarkStart w:id="45" w:name="journal-issue-number"/>
+    <w:p>
+      <w:pPr>
+        <w:pStyle w:val="Heading2"/>
+      </w:pPr>
+      <w:r>
+        <w:t xml:space="preserve">6. Journal Issue Number</w:t>
+      </w:r>
+    </w:p>
+    <w:p>
+      <w:pPr>
+        <w:pStyle w:val="ListParagraph"/>
+        <w:numPr>
+          <w:ilvl w:val="0"/>
+          <w:numId w:val="106"/>
+        </w:numPr>
+        <w:spacing w:before="0" w:after="120" w:line="288" w:lineRule="auto"/>
+        <w:widowControl/>
+      </w:pPr>
+      <w:r>
+        <w:t xml:space="preserve">Include the issue number whenever available</w:t>
+      </w:r>
+    </w:p>
+    <w:p>
+      <w:pPr>
+        <w:pStyle w:val="ListParagraph"/>
+        <w:numPr>
+          <w:ilvl w:val="0"/>
+          <w:numId w:val="106"/>
+        </w:numPr>
+        <w:spacing w:before="0" w:after="120" w:line="288" w:lineRule="auto"/>
+        <w:widowControl/>
+      </w:pPr>
+      <w:r>
+        <w:t xml:space="preserve">Put the number in parentheses DIRECTLY after the volume number–no space between the volume number and the opening parentheses</w:t>
+      </w:r>
+    </w:p>
+    <w:p>
+      <w:pPr>
+        <w:pStyle w:val="ListParagraph"/>
+        <w:numPr>
+          <w:ilvl w:val="0"/>
+          <w:numId w:val="106"/>
+        </w:numPr>
+        <w:spacing w:before="0" w:after="120" w:line="288" w:lineRule="auto"/>
+        <w:widowControl/>
+      </w:pPr>
+      <w:r>
+        <w:t xml:space="preserve">Do not use italics or any other special formatting for this number and the parentheses</w:t>
+      </w:r>
+    </w:p>
+    <w:p>
+      <w:pPr>
+        <w:pStyle w:val="ListParagraph"/>
+        <w:numPr>
+          <w:ilvl w:val="0"/>
+          <w:numId w:val="106"/>
+        </w:numPr>
+        <w:spacing w:before="0" w:after="120" w:line="288" w:lineRule="auto"/>
+        <w:widowControl/>
+      </w:pPr>
+      <w:r>
+        <w:t xml:space="preserve">Comma after closing parenthesis</w:t>
+      </w:r>
+    </w:p>
+    <w:bookmarkEnd w:id="45"/>
+    <w:bookmarkStart w:id="46" w:name="page-numbers"/>
+    <w:p>
+      <w:pPr>
+        <w:pStyle w:val="Heading2"/>
+      </w:pPr>
+      <w:r>
+        <w:t xml:space="preserve">7. Page Numbers</w:t>
+      </w:r>
+    </w:p>
+    <w:p>
+      <w:pPr>
+        <w:pStyle w:val="ListParagraph"/>
+        <w:numPr>
+          <w:ilvl w:val="0"/>
+          <w:numId w:val="107"/>
+        </w:numPr>
+        <w:spacing w:before="0" w:after="120" w:line="288" w:lineRule="auto"/>
+        <w:widowControl/>
+      </w:pPr>
+      <w:r>
+        <w:t xml:space="preserve">Include full page range of article, even if you only use information from one page</w:t>
+      </w:r>
+    </w:p>
+    <w:p>
+      <w:pPr>
+        <w:pStyle w:val="ListParagraph"/>
+        <w:numPr>
+          <w:ilvl w:val="0"/>
+          <w:numId w:val="107"/>
+        </w:numPr>
+        <w:spacing w:before="0" w:after="120" w:line="288" w:lineRule="auto"/>
+        <w:widowControl/>
+      </w:pPr>
+      <w:r>
+        <w:t xml:space="preserve">No italics or any other special formatting</w:t>
+      </w:r>
+    </w:p>
+    <w:p>
+      <w:pPr>
+        <w:pStyle w:val="ListParagraph"/>
+        <w:numPr>
+          <w:ilvl w:val="0"/>
+          <w:numId w:val="107"/>
+        </w:numPr>
+        <w:spacing w:before="0" w:after="120" w:line="288" w:lineRule="auto"/>
+        <w:widowControl/>
+      </w:pPr>
+      <w:r>
+        <w:t xml:space="preserve">Separate the page numbers in the range using an en dash “–“ (this is longer than a hyphen, and is usually typed by hitting option+hyphen, or alt+hyphen)</w:t>
+      </w:r>
+    </w:p>
+    <w:p>
+      <w:pPr>
+        <w:pStyle w:val="ListParagraph"/>
+        <w:numPr>
+          <w:ilvl w:val="0"/>
+          <w:numId w:val="107"/>
+        </w:numPr>
+        <w:spacing w:before="0" w:after="120" w:line="288" w:lineRule="auto"/>
+        <w:widowControl/>
+      </w:pPr>
+      <w:r>
+        <w:t xml:space="preserve">No page abbreviation such as pp. or pg. before the page numbers</w:t>
+      </w:r>
+    </w:p>
+    <w:p>
+      <w:pPr>
+        <w:pStyle w:val="ListParagraph"/>
+        <w:numPr>
+          <w:ilvl w:val="0"/>
+          <w:numId w:val="107"/>
+        </w:numPr>
+        <w:spacing w:before="0" w:after="120" w:line="288" w:lineRule="auto"/>
+        <w:widowControl/>
+      </w:pPr>
+      <w:r>
+        <w:t xml:space="preserve">Period after second page number</w:t>
+      </w:r>
+    </w:p>
+    <w:p>
+      <w:pPr>
+        <w:pStyle w:val="ListParagraph"/>
+        <w:numPr>
+          <w:ilvl w:val="0"/>
+          <w:numId w:val="107"/>
+        </w:numPr>
+        <w:spacing w:before="0" w:after="120" w:line="288" w:lineRule="auto"/>
+        <w:widowControl/>
+      </w:pPr>
+      <w:r>
+        <w:t xml:space="preserve">If an article number or eLocator instead of a page range, write the word “Article” (capitalized) and then the article number</w:t>
+      </w:r>
+    </w:p>
+    <w:bookmarkEnd w:id="46"/>
+    <w:bookmarkStart w:id="47" w:name="doi-or-url"/>
+    <w:p>
+      <w:pPr>
+        <w:pStyle w:val="Heading2"/>
+      </w:pPr>
+      <w:r>
+        <w:t xml:space="preserve">8. DOI or URL</w:t>
+      </w:r>
+    </w:p>
+    <w:p>
+      <w:pPr>
+        <w:pStyle w:val="ListParagraph"/>
+        <w:numPr>
+          <w:ilvl w:val="0"/>
+          <w:numId w:val="108"/>
+        </w:numPr>
+        <w:spacing w:before="0" w:after="120" w:line="288" w:lineRule="auto"/>
+        <w:widowControl/>
+      </w:pPr>
+      <w:r>
+        <w:t xml:space="preserve">Include the DOI if available</w:t>
+      </w:r>
+    </w:p>
+    <w:p>
+      <w:pPr>
+        <w:pStyle w:val="ListParagraph"/>
+        <w:numPr>
+          <w:ilvl w:val="0"/>
+          <w:numId w:val="108"/>
+        </w:numPr>
+        <w:spacing w:before="0" w:after="120" w:line="288" w:lineRule="auto"/>
+        <w:widowControl/>
+      </w:pPr>
+      <w:r>
+        <w:t xml:space="preserve">Use the CrossRef DOI search engine if you cannot find the DOI in your article</w:t>
+      </w:r>
+    </w:p>
+    <w:p>
+      <w:pPr>
+        <w:pStyle w:val="ListParagraph"/>
+        <w:numPr>
+          <w:ilvl w:val="0"/>
+          <w:numId w:val="108"/>
+        </w:numPr>
+        <w:spacing w:before="0" w:after="120" w:line="288" w:lineRule="auto"/>
+        <w:widowControl/>
+      </w:pPr>
+      <w:r>
+        <w:t xml:space="preserve">Include the URL (website address) if retrieved online</w:t>
+      </w:r>
+      <w:r>
+        <w:t xml:space="preserve"> </w:t>
+      </w:r>
+      <w:r>
+        <w:rPr>
+          <w:b/>
+          <w:bCs/>
+        </w:rPr>
+        <w:t xml:space="preserve">and</w:t>
+      </w:r>
+      <w:r>
+        <w:t xml:space="preserve"> </w:t>
+      </w:r>
+      <w:r>
+        <w:t xml:space="preserve">it has no DOI</w:t>
+      </w:r>
+    </w:p>
+    <w:p>
+      <w:pPr>
+        <w:pStyle w:val="ListParagraph"/>
+        <w:numPr>
+          <w:ilvl w:val="0"/>
+          <w:numId w:val="108"/>
+        </w:numPr>
+        <w:spacing w:before="0" w:after="120" w:line="288" w:lineRule="auto"/>
+        <w:widowControl/>
+      </w:pPr>
+      <w:r>
+        <w:t xml:space="preserve">Copy and paste the EXACT string of letters and numbers</w:t>
+      </w:r>
+    </w:p>
+    <w:p>
+      <w:pPr>
+        <w:pStyle w:val="ListParagraph"/>
+        <w:numPr>
+          <w:ilvl w:val="0"/>
+          <w:numId w:val="108"/>
+        </w:numPr>
+        <w:spacing w:before="0" w:after="120" w:line="288" w:lineRule="auto"/>
+        <w:widowControl/>
+      </w:pPr>
+      <w:r>
+        <w:t xml:space="preserve">NO closing punctuation</w:t>
+      </w:r>
+    </w:p>
+    <w:p>
+      <w:pPr>
+        <w:pStyle w:val="ListParagraph"/>
+        <w:numPr>
+          <w:ilvl w:val="0"/>
+          <w:numId w:val="108"/>
+        </w:numPr>
+        <w:spacing w:before="0" w:after="120" w:line="288" w:lineRule="auto"/>
+        <w:widowControl/>
+      </w:pPr>
+      <w:r>
+        <w:t xml:space="preserve">Do not write “Retrieved from”</w:t>
+      </w:r>
+    </w:p>
+    <w:bookmarkEnd w:id="47"/>
+    <w:bookmarkEnd w:id="48"/>
     <w:sectPr>
       <w:headerReference r:id="rId9" w:type="default"/>
       <w:footerReference r:id="rId10" w:type="even"/>
@@ -1624,394 +1666,112 @@
 </file>
 
 <file path=word/footer1.xml><?xml version="1.0" encoding="utf-8"?>
-<w:ftr xmlns:wpc="http://schemas.microsoft.com/office/word/2010/wordprocessingCanvas" xmlns:cx="http://schemas.microsoft.com/office/drawing/2014/chartex" xmlns:cx1="http://schemas.microsoft.com/office/drawing/2015/9/8/chartex" xmlns:cx2="http://schemas.microsoft.com/office/drawing/2015/10/21/chartex" xmlns:cx3="http://schemas.microsoft.com/office/drawing/2016/5/9/chartex" xmlns:cx4="http://schemas.microsoft.com/office/drawing/2016/5/10/chartex" xmlns:cx5="http://schemas.microsoft.com/office/drawing/2016/5/11/chartex" xmlns:cx6="http://schemas.microsoft.com/office/drawing/2016/5/12/chartex" xmlns:cx7="http://schemas.microsoft.com/office/drawing/2016/5/13/chartex" xmlns:cx8="http://schemas.microsoft.com/office/drawing/2016/5/14/chartex" xmlns:mc="http://schemas.openxmlformats.org/markup-compatibility/2006" xmlns:aink="http://schemas.microsoft.com/office/drawing/2016/ink" xmlns:am3d="http://schemas.microsoft.com/office/drawing/2017/model3d" xmlns:o="urn:schemas-microsoft-com:office:office" xmlns:oel="http://schemas.microsoft.com/office/2019/extlst" xmlns:r="http://schemas.openxmlformats.org/officeDocument/2006/relationships" xmlns:m="http://schemas.openxmlformats.org/officeDocument/2006/math" xmlns:v="urn:schemas-microsoft-com:vml" xmlns:wp14="http://schemas.microsoft.com/office/word/2010/wordprocessingDrawing" xmlns:wp="http://schemas.openxmlformats.org/drawingml/2006/wordprocessingDrawing" xmlns:w10="urn:schemas-microsoft-com:office:word" xmlns:w="http://schemas.openxmlformats.org/wordprocessingml/2006/main" xmlns:w14="http://schemas.microsoft.com/office/word/2010/wordml" xmlns:w15="http://schemas.microsoft.com/office/word/2012/wordml" xmlns:w16cex="http://schemas.microsoft.com/office/word/2018/wordml/cex" xmlns:w16cid="http://schemas.microsoft.com/office/word/2016/wordml/cid" xmlns:w16="http://schemas.microsoft.com/office/word/2018/wordml" xmlns:w16du="http://schemas.microsoft.com/office/word/2023/wordml/word16du" xmlns:w16sdtdh="http://schemas.microsoft.com/office/word/2020/wordml/sdtdatahash" xmlns:w16sdtfl="http://schemas.microsoft.com/office/word/2024/wordml/sdtformatlock" xmlns:w16se="http://schemas.microsoft.com/office/word/2015/wordml/symex" xmlns:wpg="http://schemas.microsoft.com/office/word/2010/wordprocessingGroup" xmlns:wpi="http://schemas.microsoft.com/office/word/2010/wordprocessingInk" xmlns:wne="http://schemas.microsoft.com/office/word/2006/wordml" xmlns:wps="http://schemas.microsoft.com/office/word/2010/wordprocessingShape" mc:Ignorable="w14 w15 w16se w16cid w16 w16cex w16sdtdh w16sdtfl w16du wp14">
-  <w:sdt>
-    <w:sdtPr>
-      <w:rPr>
-        <w:rStyle w:val="PageNumber"/>
-      </w:rPr>
-      <w:id w:val="-1602941162"/>
-      <w:docPartObj>
-        <w:docPartGallery w:val="Page Numbers (Bottom of Page)"/>
-        <w:docPartUnique/>
-      </w:docPartObj>
-    </w:sdtPr>
-    <w:sdtContent>
-      <w:p>
-        <w:pPr>
-          <w:pStyle w:val="Footer"/>
-          <w:framePr w:wrap="none" w:vAnchor="text" w:hAnchor="margin" w:y="1"/>
-          <w:rPr>
-            <w:rStyle w:val="PageNumber"/>
-          </w:rPr>
-        </w:pPr>
-        <w:r>
-          <w:rPr>
-            <w:rStyle w:val="PageNumber"/>
-          </w:rPr>
-          <w:fldChar w:fldCharType="begin"/>
-        </w:r>
-        <w:r>
-          <w:rPr>
-            <w:rStyle w:val="PageNumber"/>
-          </w:rPr>
-          <w:instrText xml:space="preserve"> PAGE </w:instrText>
-        </w:r>
-        <w:r>
-          <w:rPr>
-            <w:rStyle w:val="PageNumber"/>
-          </w:rPr>
-          <w:fldChar w:fldCharType="separate"/>
-        </w:r>
-        <w:r>
-          <w:rPr>
-            <w:rStyle w:val="PageNumber"/>
-            <w:noProof/>
-          </w:rPr>
-          <w:t>1</w:t>
-        </w:r>
-        <w:r>
-          <w:rPr>
-            <w:rStyle w:val="PageNumber"/>
-          </w:rPr>
-          <w:fldChar w:fldCharType="end"/>
-        </w:r>
-      </w:p>
-    </w:sdtContent>
-  </w:sdt>
-  <w:sdt>
-    <w:sdtPr>
-      <w:rPr>
-        <w:rStyle w:val="PageNumber"/>
-      </w:rPr>
-      <w:id w:val="-145356932"/>
-      <w:docPartObj>
-        <w:docPartGallery w:val="Page Numbers (Bottom of Page)"/>
-        <w:docPartUnique/>
-      </w:docPartObj>
-    </w:sdtPr>
-    <w:sdtContent>
-      <w:p>
-        <w:pPr>
-          <w:pStyle w:val="Footer"/>
-          <w:framePr w:wrap="none" w:vAnchor="text" w:hAnchor="margin" w:y="1"/>
-          <w:ind w:right="360" w:firstLine="360"/>
-          <w:rPr>
-            <w:rStyle w:val="PageNumber"/>
-          </w:rPr>
-        </w:pPr>
-        <w:r>
-          <w:rPr>
-            <w:rStyle w:val="PageNumber"/>
-          </w:rPr>
-          <w:fldChar w:fldCharType="begin"/>
-        </w:r>
-        <w:r>
-          <w:rPr>
-            <w:rStyle w:val="PageNumber"/>
-          </w:rPr>
-          <w:instrText xml:space="preserve"> PAGE </w:instrText>
-        </w:r>
-        <w:r>
-          <w:rPr>
-            <w:rStyle w:val="PageNumber"/>
-          </w:rPr>
-          <w:fldChar w:fldCharType="separate"/>
-        </w:r>
-        <w:r>
-          <w:rPr>
-            <w:rStyle w:val="PageNumber"/>
-            <w:noProof/>
-          </w:rPr>
-          <w:t>1</w:t>
-        </w:r>
-        <w:r>
-          <w:rPr>
-            <w:rStyle w:val="PageNumber"/>
-          </w:rPr>
-          <w:fldChar w:fldCharType="end"/>
-        </w:r>
-      </w:p>
-    </w:sdtContent>
-  </w:sdt>
+<w:ftr xmlns:w="http://schemas.openxmlformats.org/wordprocessingml/2006/main">
   <w:p>
     <w:pPr>
       <w:pStyle w:val="Footer"/>
-      <w:ind w:right="360" w:firstLine="360"/>
+      <w:tabs>
+        <w:tab w:val="center" w:pos="4680"/>
+        <w:tab w:val="right" w:pos="9360"/>
+      </w:tabs>
+      <w:pBdr>
+        <w:top w:val="single" w:sz="8" w:space="4" w:color="000000"/>
+      </w:pBdr>
+      <w:spacing w:before="0" w:after="0" w:line="220" w:lineRule="auto"/>
     </w:pPr>
+    <w:r>
+      <w:tab/>
+    </w:r>
+    <w:r>
+      <w:rPr>
+        <w:rFonts w:ascii="Arial" w:hAnsi="Arial"/>
+        <w:b/>
+        <w:color w:val="C8102E"/>
+        <w:spacing w:val="12"/>
+        <w:sz w:val="18"/>
+        <w:szCs w:val="18"/>
+      </w:rPr>
+      <w:t>NEBRASKA</w:t>
+    </w:r>
+    <w:r>
+      <w:tab/>
+    </w:r>
+    <w:r>
+      <w:t xml:space="preserve">- </w:t>
+    </w:r>
+    <w:r>
+      <w:fldChar w:fldCharType="begin"/>
+    </w:r>
+    <w:r>
+      <w:instrText xml:space="preserve"> PAGE </w:instrText>
+    </w:r>
+    <w:r>
+      <w:fldChar w:fldCharType="separate"/>
+    </w:r>
+    <w:r>
+      <w:t>1</w:t>
+    </w:r>
+    <w:r>
+      <w:fldChar w:fldCharType="end"/>
+    </w:r>
+    <w:r>
+      <w:t xml:space="preserve"> -</w:t>
+    </w:r>
   </w:p>
 </w:ftr>
 </file>
 
 <file path=word/footer2.xml><?xml version="1.0" encoding="utf-8"?>
-<w:ftr xmlns:wpc="http://schemas.microsoft.com/office/word/2010/wordprocessingCanvas" xmlns:cx="http://schemas.microsoft.com/office/drawing/2014/chartex" xmlns:cx1="http://schemas.microsoft.com/office/drawing/2015/9/8/chartex" xmlns:cx2="http://schemas.microsoft.com/office/drawing/2015/10/21/chartex" xmlns:cx3="http://schemas.microsoft.com/office/drawing/2016/5/9/chartex" xmlns:cx4="http://schemas.microsoft.com/office/drawing/2016/5/10/chartex" xmlns:cx5="http://schemas.microsoft.com/office/drawing/2016/5/11/chartex" xmlns:cx6="http://schemas.microsoft.com/office/drawing/2016/5/12/chartex" xmlns:cx7="http://schemas.microsoft.com/office/drawing/2016/5/13/chartex" xmlns:cx8="http://schemas.microsoft.com/office/drawing/2016/5/14/chartex" xmlns:mc="http://schemas.openxmlformats.org/markup-compatibility/2006" xmlns:aink="http://schemas.microsoft.com/office/drawing/2016/ink" xmlns:am3d="http://schemas.microsoft.com/office/drawing/2017/model3d" xmlns:o="urn:schemas-microsoft-com:office:office" xmlns:oel="http://schemas.microsoft.com/office/2019/extlst" xmlns:r="http://schemas.openxmlformats.org/officeDocument/2006/relationships" xmlns:m="http://schemas.openxmlformats.org/officeDocument/2006/math" xmlns:v="urn:schemas-microsoft-com:vml" xmlns:wp14="http://schemas.microsoft.com/office/word/2010/wordprocessingDrawing" xmlns:wp="http://schemas.openxmlformats.org/drawingml/2006/wordprocessingDrawing" xmlns:w10="urn:schemas-microsoft-com:office:word" xmlns:w="http://schemas.openxmlformats.org/wordprocessingml/2006/main" xmlns:w14="http://schemas.microsoft.com/office/word/2010/wordml" xmlns:w15="http://schemas.microsoft.com/office/word/2012/wordml" xmlns:w16cex="http://schemas.microsoft.com/office/word/2018/wordml/cex" xmlns:w16cid="http://schemas.microsoft.com/office/word/2016/wordml/cid" xmlns:w16="http://schemas.microsoft.com/office/word/2018/wordml" xmlns:w16du="http://schemas.microsoft.com/office/word/2023/wordml/word16du" xmlns:w16sdtdh="http://schemas.microsoft.com/office/word/2020/wordml/sdtdatahash" xmlns:w16sdtfl="http://schemas.microsoft.com/office/word/2024/wordml/sdtformatlock" xmlns:w16se="http://schemas.microsoft.com/office/word/2015/wordml/symex" xmlns:wpg="http://schemas.microsoft.com/office/word/2010/wordprocessingGroup" xmlns:wpi="http://schemas.microsoft.com/office/word/2010/wordprocessingInk" xmlns:wne="http://schemas.microsoft.com/office/word/2006/wordml" xmlns:wps="http://schemas.microsoft.com/office/word/2010/wordprocessingShape" mc:Ignorable="w14 w15 w16se w16cid w16 w16cex w16sdtdh w16sdtfl w16du wp14">
-  <w:sdt>
-    <w:sdtPr>
-      <w:rPr>
-        <w:rStyle w:val="PageNumber"/>
-      </w:rPr>
-      <w:id w:val="-398136938"/>
-      <w:docPartObj>
-        <w:docPartGallery w:val="Page Numbers (Bottom of Page)"/>
-        <w:docPartUnique/>
-      </w:docPartObj>
-    </w:sdtPr>
-    <w:sdtContent>
-      <w:p>
-        <w:pPr>
-          <w:pStyle w:val="Footer"/>
-          <w:framePr w:wrap="none" w:vAnchor="text" w:hAnchor="margin" w:y="1"/>
-          <w:rPr>
-            <w:rStyle w:val="PageNumber"/>
-          </w:rPr>
-        </w:pPr>
-        <w:r>
-          <w:rPr>
-            <w:rStyle w:val="PageNumber"/>
-          </w:rPr>
-          <w:fldChar w:fldCharType="begin"/>
-        </w:r>
-        <w:r>
-          <w:rPr>
-            <w:rStyle w:val="PageNumber"/>
-          </w:rPr>
-          <w:instrText xml:space="preserve"> PAGE </w:instrText>
-        </w:r>
-        <w:r>
-          <w:rPr>
-            <w:rStyle w:val="PageNumber"/>
-          </w:rPr>
-          <w:fldChar w:fldCharType="separate"/>
-        </w:r>
-        <w:r>
-          <w:rPr>
-            <w:rStyle w:val="PageNumber"/>
-            <w:noProof/>
-          </w:rPr>
-          <w:t>- 1 -</w:t>
-        </w:r>
-        <w:r>
-          <w:rPr>
-            <w:rStyle w:val="PageNumber"/>
-          </w:rPr>
-          <w:fldChar w:fldCharType="end"/>
-        </w:r>
-      </w:p>
-    </w:sdtContent>
-  </w:sdt>
+<w:ftr xmlns:w="http://schemas.openxmlformats.org/wordprocessingml/2006/main">
   <w:p>
     <w:pPr>
       <w:pStyle w:val="Footer"/>
-      <w:ind w:right="360" w:firstLine="360"/>
+      <w:tabs>
+        <w:tab w:val="center" w:pos="4680"/>
+        <w:tab w:val="right" w:pos="9360"/>
+      </w:tabs>
+      <w:pBdr>
+        <w:top w:val="single" w:sz="8" w:space="4" w:color="000000"/>
+      </w:pBdr>
+      <w:spacing w:before="0" w:after="0" w:line="220" w:lineRule="auto"/>
     </w:pPr>
     <w:r>
-      <w:rPr>
-        <w:noProof/>
-      </w:rPr>
-      <w:drawing>
-        <wp:anchor distT="0" distB="0" distL="114300" distR="114300" simplePos="0" relativeHeight="251658240" behindDoc="1" locked="0" layoutInCell="1" allowOverlap="1" wp14:anchorId="3C4A1701" wp14:editId="7E49379E">
-          <wp:simplePos x="0" y="0"/>
-          <wp:positionH relativeFrom="column">
-            <wp:posOffset>5567347</wp:posOffset>
-          </wp:positionH>
-          <wp:positionV relativeFrom="paragraph">
-            <wp:posOffset>112459</wp:posOffset>
-          </wp:positionV>
-          <wp:extent cx="891515" cy="378020"/>
-          <wp:effectExtent l="0" t="0" r="0" b="3175"/>
-          <wp:wrapNone/>
-          <wp:docPr id="724861626" name="Picture 2" descr="A black line and the text NEBRASKA in red. "/>
-          <wp:cNvGraphicFramePr>
-            <a:graphicFrameLocks xmlns:a="http://schemas.openxmlformats.org/drawingml/2006/main" noChangeAspect="1"/>
-          </wp:cNvGraphicFramePr>
-          <a:graphic xmlns:a="http://schemas.openxmlformats.org/drawingml/2006/main">
-            <a:graphicData uri="http://schemas.openxmlformats.org/drawingml/2006/picture">
-              <pic:pic xmlns:pic="http://schemas.openxmlformats.org/drawingml/2006/picture">
-                <pic:nvPicPr>
-                  <pic:cNvPr id="724861626" name="Picture 2" descr="A black line and the text NEBRASKA in red. "/>
-                  <pic:cNvPicPr>
-                    <a:picLocks noChangeAspect="1"/>
-                  </pic:cNvPicPr>
-                </pic:nvPicPr>
-                <pic:blipFill rotWithShape="1">
-                  <a:blip r:embed="rId1">
-                    <a:extLst>
-                      <a:ext uri="{28A0092B-C50C-407E-A947-70E740481C1C}">
-                        <a14:useLocalDpi xmlns:a14="http://schemas.microsoft.com/office/drawing/2010/main" val="0"/>
-                      </a:ext>
-                    </a:extLst>
-                  </a:blip>
-                  <a:srcRect l="67772" r="9300"/>
-                  <a:stretch>
-                    <a:fillRect/>
-                  </a:stretch>
-                </pic:blipFill>
-                <pic:spPr bwMode="auto">
-                  <a:xfrm>
-                    <a:off x="0" y="0"/>
-                    <a:ext cx="891515" cy="378020"/>
-                  </a:xfrm>
-                  <a:prstGeom prst="rect">
-                    <a:avLst/>
-                  </a:prstGeom>
-                  <a:ln>
-                    <a:noFill/>
-                  </a:ln>
-                  <a:extLst>
-                    <a:ext uri="{53640926-AAD7-44D8-BBD7-CCE9431645EC}">
-                      <a14:shadowObscured xmlns:a14="http://schemas.microsoft.com/office/drawing/2010/main"/>
-                    </a:ext>
-                  </a:extLst>
-                </pic:spPr>
-              </pic:pic>
-            </a:graphicData>
-          </a:graphic>
-          <wp14:sizeRelH relativeFrom="margin">
-            <wp14:pctWidth>0</wp14:pctWidth>
-          </wp14:sizeRelH>
-          <wp14:sizeRelV relativeFrom="margin">
-            <wp14:pctHeight>0</wp14:pctHeight>
-          </wp14:sizeRelV>
-        </wp:anchor>
-      </w:drawing>
+      <w:tab/>
     </w:r>
     <w:r>
       <w:rPr>
-        <w:noProof/>
-      </w:rPr>
-      <mc:AlternateContent>
-        <mc:Choice Requires="wps">
-          <w:drawing>
-            <wp:anchor distT="0" distB="0" distL="114300" distR="114300" simplePos="0" relativeHeight="251669504" behindDoc="1" locked="0" layoutInCell="1" allowOverlap="1" wp14:anchorId="21D6F732" wp14:editId="54604F3B">
-              <wp:simplePos x="0" y="0"/>
-              <wp:positionH relativeFrom="column">
-                <wp:posOffset>-914400</wp:posOffset>
-              </wp:positionH>
-              <wp:positionV relativeFrom="paragraph">
-                <wp:posOffset>83816</wp:posOffset>
-              </wp:positionV>
-              <wp:extent cx="847991" cy="0"/>
-              <wp:effectExtent l="0" t="12700" r="28575" b="25400"/>
-              <wp:wrapNone/>
-              <wp:docPr id="1138935457" name="Straight Connector 1">
-                <ns0:decorative xmlns:ns0="http://schemas.microsoft.com/office/drawing/2017/decorative" val="1"/>
-              </wp:docPr>
-              <wp:cNvGraphicFramePr/>
-              <a:graphic xmlns:a="http://schemas.openxmlformats.org/drawingml/2006/main">
-                <a:graphicData uri="http://schemas.microsoft.com/office/word/2010/wordprocessingShape">
-                  <wps:wsp>
-                    <wps:cNvCnPr/>
-                    <wps:spPr>
-                      <a:xfrm>
-                        <a:off x="0" y="0"/>
-                        <a:ext cx="847991" cy="0"/>
-                      </a:xfrm>
-                      <a:prstGeom prst="line">
-                        <a:avLst/>
-                      </a:prstGeom>
-                      <a:ln w="38100"/>
-                    </wps:spPr>
-                    <wps:style>
-                      <a:lnRef idx="3">
-                        <a:schemeClr val="dk1"/>
-                      </a:lnRef>
-                      <a:fillRef idx="0">
-                        <a:schemeClr val="dk1"/>
-                      </a:fillRef>
-                      <a:effectRef idx="2">
-                        <a:schemeClr val="dk1"/>
-                      </a:effectRef>
-                      <a:fontRef idx="minor">
-                        <a:schemeClr val="tx1"/>
-                      </a:fontRef>
-                    </wps:style>
-                    <wps:bodyPr/>
-                  </wps:wsp>
-                </a:graphicData>
-              </a:graphic>
-              <wp14:sizeRelH relativeFrom="margin">
-                <wp14:pctWidth>0</wp14:pctWidth>
-              </wp14:sizeRelH>
-              <wp14:sizeRelV relativeFrom="margin">
-                <wp14:pctHeight>0</wp14:pctHeight>
-              </wp14:sizeRelV>
-            </wp:anchor>
-          </w:drawing>
-        </mc:Choice>
-        <mc:Fallback>
-          <w:pict>
-            <v:line w14:anchorId="48B09629" id="Straight Connector 1" o:spid="_x0000_s1026" style="position:absolute;z-index:-251646976;visibility:visible;mso-wrap-style:square;mso-width-percent:0;mso-height-percent:0;mso-wrap-distance-left:9pt;mso-wrap-distance-top:0;mso-wrap-distance-right:9pt;mso-wrap-distance-bottom:0;mso-position-horizontal:absolute;mso-position-horizontal-relative:text;mso-position-vertical:absolute;mso-position-vertical-relative:text;mso-width-percent:0;mso-height-percent:0;mso-width-relative:margin;mso-height-relative:margin" from="-1in,6.6pt" to="-5.25pt,6.6pt" o:gfxdata="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" strokecolor="black [3200]" strokeweight="3pt">
-              <v:stroke joinstyle="miter"/>
-            </v:line>
-          </w:pict>
-        </mc:Fallback>
-      </mc:AlternateContent>
+        <w:rFonts w:ascii="Arial" w:hAnsi="Arial"/>
+        <w:b/>
+        <w:color w:val="C8102E"/>
+        <w:spacing w:val="12"/>
+        <w:sz w:val="18"/>
+        <w:szCs w:val="18"/>
+      </w:rPr>
+      <w:t>NEBRASKA</w:t>
     </w:r>
     <w:r>
-      <w:rPr>
-        <w:noProof/>
-      </w:rPr>
-      <mc:AlternateContent>
-        <mc:Choice Requires="wps">
-          <w:drawing>
-            <wp:anchor distT="0" distB="0" distL="114300" distR="114300" simplePos="0" relativeHeight="251667456" behindDoc="1" locked="0" layoutInCell="1" allowOverlap="1" wp14:anchorId="6DB231D0" wp14:editId="68302D1D">
-              <wp:simplePos x="0" y="0"/>
-              <wp:positionH relativeFrom="column">
-                <wp:posOffset>143034</wp:posOffset>
-              </wp:positionH>
-              <wp:positionV relativeFrom="paragraph">
-                <wp:posOffset>84217</wp:posOffset>
-              </wp:positionV>
-              <wp:extent cx="7010400" cy="0"/>
-              <wp:effectExtent l="0" t="12700" r="25400" b="25400"/>
-              <wp:wrapNone/>
-              <wp:docPr id="1705665425" name="Straight Connector 1">
-                <ns1:decorative xmlns:ns1="http://schemas.microsoft.com/office/drawing/2017/decorative" val="1"/>
-              </wp:docPr>
-              <wp:cNvGraphicFramePr/>
-              <a:graphic xmlns:a="http://schemas.openxmlformats.org/drawingml/2006/main">
-                <a:graphicData uri="http://schemas.microsoft.com/office/word/2010/wordprocessingShape">
-                  <wps:wsp>
-                    <wps:cNvCnPr/>
-                    <wps:spPr>
-                      <a:xfrm>
-                        <a:off x="0" y="0"/>
-                        <a:ext cx="7010400" cy="0"/>
-                      </a:xfrm>
-                      <a:prstGeom prst="line">
-                        <a:avLst/>
-                      </a:prstGeom>
-                      <a:ln w="38100"/>
-                    </wps:spPr>
-                    <wps:style>
-                      <a:lnRef idx="3">
-                        <a:schemeClr val="dk1"/>
-                      </a:lnRef>
-                      <a:fillRef idx="0">
-                        <a:schemeClr val="dk1"/>
-                      </a:fillRef>
-                      <a:effectRef idx="2">
-                        <a:schemeClr val="dk1"/>
-                      </a:effectRef>
-                      <a:fontRef idx="minor">
-                        <a:schemeClr val="tx1"/>
-                      </a:fontRef>
-                    </wps:style>
-                    <wps:bodyPr/>
-                  </wps:wsp>
-                </a:graphicData>
-              </a:graphic>
-            </wp:anchor>
-          </w:drawing>
-        </mc:Choice>
-        <mc:Fallback>
-          <w:pict>
-            <v:line w14:anchorId="145E04E9" id="Straight Connector 1" o:spid="_x0000_s1026" style="position:absolute;z-index:-251649024;visibility:visible;mso-wrap-style:square;mso-wrap-distance-left:9pt;mso-wrap-distance-top:0;mso-wrap-distance-right:9pt;mso-wrap-distance-bottom:0;mso-position-horizontal:absolute;mso-position-horizontal-relative:text;mso-position-vertical:absolute;mso-position-vertical-relative:text" from="11.25pt,6.65pt" to="563.25pt,6.65pt" o:gfxdata="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" strokecolor="black [3200]" strokeweight="3pt">
-              <v:stroke joinstyle="miter"/>
-            </v:line>
-          </w:pict>
-        </mc:Fallback>
-      </mc:AlternateContent>
+      <w:tab/>
+    </w:r>
+    <w:r>
+      <w:t xml:space="preserve">- </w:t>
+    </w:r>
+    <w:r>
+      <w:fldChar w:fldCharType="begin"/>
+    </w:r>
+    <w:r>
+      <w:instrText xml:space="preserve"> PAGE </w:instrText>
+    </w:r>
+    <w:r>
+      <w:fldChar w:fldCharType="separate"/>
+    </w:r>
+    <w:r>
+      <w:t>1</w:t>
+    </w:r>
+    <w:r>
+      <w:fldChar w:fldCharType="end"/>
+    </w:r>
+    <w:r>
+      <w:t xml:space="preserve"> -</w:t>
     </w:r>
   </w:p>
 </w:ftr>
@@ -2037,216 +1797,120 @@
 </file>
 
 <file path=word/header1.xml><?xml version="1.0" encoding="utf-8"?>
-<w:hdr xmlns:adec="http://schemas.microsoft.com/office/drawing/2017/decorative" xmlns:wpc="http://schemas.microsoft.com/office/word/2010/wordprocessingCanvas" xmlns:cx="http://schemas.microsoft.com/office/drawing/2014/chartex" xmlns:cx1="http://schemas.microsoft.com/office/drawing/2015/9/8/chartex" xmlns:cx2="http://schemas.microsoft.com/office/drawing/2015/10/21/chartex" xmlns:cx3="http://schemas.microsoft.com/office/drawing/2016/5/9/chartex" xmlns:cx4="http://schemas.microsoft.com/office/drawing/2016/5/10/chartex" xmlns:cx5="http://schemas.microsoft.com/office/drawing/2016/5/11/chartex" xmlns:cx6="http://schemas.microsoft.com/office/drawing/2016/5/12/chartex" xmlns:cx7="http://schemas.microsoft.com/office/drawing/2016/5/13/chartex" xmlns:cx8="http://schemas.microsoft.com/office/drawing/2016/5/14/chartex" xmlns:mc="http://schemas.openxmlformats.org/markup-compatibility/2006" xmlns:aink="http://schemas.microsoft.com/office/drawing/2016/ink" xmlns:am3d="http://schemas.microsoft.com/office/drawing/2017/model3d" xmlns:o="urn:schemas-microsoft-com:office:office" xmlns:oel="http://schemas.microsoft.com/office/2019/extlst" xmlns:r="http://schemas.openxmlformats.org/officeDocument/2006/relationships" xmlns:m="http://schemas.openxmlformats.org/officeDocument/2006/math" xmlns:v="urn:schemas-microsoft-com:vml" xmlns:wp14="http://schemas.microsoft.com/office/word/2010/wordprocessingDrawing" xmlns:wp="http://schemas.openxmlformats.org/drawingml/2006/wordprocessingDrawing" xmlns:w10="urn:schemas-microsoft-com:office:word" xmlns:w="http://schemas.openxmlformats.org/wordprocessingml/2006/main" xmlns:w14="http://schemas.microsoft.com/office/word/2010/wordml" xmlns:w15="http://schemas.microsoft.com/office/word/2012/wordml" xmlns:w16cex="http://schemas.microsoft.com/office/word/2018/wordml/cex" xmlns:w16cid="http://schemas.microsoft.com/office/word/2016/wordml/cid" xmlns:w16="http://schemas.microsoft.com/office/word/2018/wordml" xmlns:w16du="http://schemas.microsoft.com/office/word/2023/wordml/word16du" xmlns:w16sdtdh="http://schemas.microsoft.com/office/word/2020/wordml/sdtdatahash" xmlns:w16sdtfl="http://schemas.microsoft.com/office/word/2024/wordml/sdtformatlock" xmlns:w16se="http://schemas.microsoft.com/office/word/2015/wordml/symex" xmlns:wpg="http://schemas.microsoft.com/office/word/2010/wordprocessingGroup" xmlns:wpi="http://schemas.microsoft.com/office/word/2010/wordprocessingInk" xmlns:wne="http://schemas.microsoft.com/office/word/2006/wordml" xmlns:wps="http://schemas.microsoft.com/office/word/2010/wordprocessingShape" mc:Ignorable="w14 w15 w16se w16cid w16 w16cex w16sdtdh w16sdtfl w16du wp14">
+<w:hdr xmlns:w="http://schemas.openxmlformats.org/wordprocessingml/2006/main" xmlns:r="http://schemas.openxmlformats.org/officeDocument/2006/relationships" xmlns:wp="http://schemas.openxmlformats.org/drawingml/2006/wordprocessingDrawing" xmlns:a="http://schemas.openxmlformats.org/drawingml/2006/main" xmlns:pic="http://schemas.openxmlformats.org/drawingml/2006/picture">
+  <w:tbl>
+    <w:tblPr>
+      <w:tblW w:w="9360" w:type="dxa"/>
+      <w:tblLayout w:type="fixed"/>
+      <w:tblBorders>
+        <w:top w:val="nil"/>
+        <w:left w:val="nil"/>
+        <w:bottom w:val="single" w:sz="12" w:space="0" w:color="000000"/>
+        <w:right w:val="nil"/>
+        <w:insideH w:val="nil"/>
+        <w:insideV w:val="nil"/>
+      </w:tblBorders>
+      <w:tblCellMar>
+        <w:top w:w="0" w:type="dxa"/>
+        <w:left w:w="0" w:type="dxa"/>
+        <w:bottom w:w="80" w:type="dxa"/>
+        <w:right w:w="0" w:type="dxa"/>
+      </w:tblCellMar>
+      <w:tblCaption w:val="Course header"/>
+      <w:tblDescription w:val="PSYC350 LAB with Nebraska N logo."/>
+      <w:tblLook w:val="0000" w:firstRow="0" w:lastRow="0" w:firstColumn="0" w:lastColumn="0" w:noHBand="1" w:noVBand="1"/>
+    </w:tblPr>
+    <w:tblGrid>
+      <w:gridCol w:w="8000"/>
+      <w:gridCol w:w="1360"/>
+    </w:tblGrid>
+    <w:tr>
+      <w:trPr>
+        <w:cantSplit/>
+      </w:trPr>
+      <w:tc>
+        <w:tcPr>
+          <w:tcW w:w="8000" w:type="dxa"/>
+          <w:vAlign w:val="center"/>
+        </w:tcPr>
+        <w:p>
+          <w:pPr>
+            <w:pStyle w:val="Header"/>
+            <w:spacing w:before="0" w:after="0" w:line="240" w:lineRule="auto"/>
+          </w:pPr>
+          <w:r>
+            <w:rPr>
+              <w:rFonts w:ascii="Arial" w:hAnsi="Arial" w:cs="Arial" w:eastAsia="Arial"/>
+              <w:b/>
+              <w:color w:val="1A1A1A"/>
+              <w:sz w:val="20"/>
+              <w:szCs w:val="20"/>
+            </w:rPr>
+            <w:t>PSYC350 LAB</w:t>
+          </w:r>
+        </w:p>
+      </w:tc>
+      <w:tc>
+        <w:tcPr>
+          <w:tcW w:w="1360" w:type="dxa"/>
+          <w:vAlign w:val="center"/>
+        </w:tcPr>
+        <w:p>
+          <w:pPr>
+            <w:pStyle w:val="Header"/>
+            <w:jc w:val="right"/>
+            <w:spacing w:before="0" w:after="0" w:line="240" w:lineRule="auto"/>
+          </w:pPr>
+          <w:r>
+            <w:drawing>
+              <wp:inline distT="0" distB="0" distL="0" distR="0">
+                <wp:extent cx="411480" cy="360000"/>
+                <wp:effectExtent l="0" t="0" r="0" b="0"/>
+                <wp:docPr id="1" name="Nebraska N logo" descr="Nebraska N logo" title=""/>
+                <wp:cNvGraphicFramePr>
+                  <a:graphicFrameLocks noChangeAspect="1"/>
+                </wp:cNvGraphicFramePr>
+                <a:graphic>
+                  <a:graphicData uri="http://schemas.openxmlformats.org/drawingml/2006/picture">
+                    <pic:pic>
+                      <pic:nvPicPr>
+                        <pic:cNvPr id="1" name="Nebraska N logo" descr="Nebraska N logo"/>
+                        <pic:cNvPicPr>
+                          <a:picLocks noChangeAspect="1"/>
+                        </pic:cNvPicPr>
+                      </pic:nvPicPr>
+                      <pic:blipFill>
+                        <a:blip r:embed="rId1"/>
+                        <a:stretch>
+                          <a:fillRect/>
+                        </a:stretch>
+                      </pic:blipFill>
+                      <pic:spPr>
+                        <a:xfrm>
+                          <a:off x="0" y="0"/>
+                          <a:ext cx="411480" cy="360000"/>
+                        </a:xfrm>
+                        <a:prstGeom prst="rect">
+                          <a:avLst/>
+                        </a:prstGeom>
+                        <a:ln>
+                          <a:noFill/>
+                        </a:ln>
+                      </pic:spPr>
+                    </pic:pic>
+                  </a:graphicData>
+                </a:graphic>
+              </wp:inline>
+            </w:drawing>
+          </w:r>
+        </w:p>
+      </w:tc>
+    </w:tr>
+  </w:tbl>
   <w:p>
     <w:pPr>
-      <w:pStyle w:val="Header"/>
+      <w:spacing w:before="0" w:after="0" w:line="20" w:lineRule="exact"/>
     </w:pPr>
-    <w:r>
-      <w:rPr>
-        <w:noProof/>
-      </w:rPr>
-      <w:drawing>
-        <wp:anchor distT="0" distB="0" distL="114300" distR="114300" simplePos="0" relativeHeight="251665408" behindDoc="1" locked="0" layoutInCell="1" allowOverlap="1" wp14:anchorId="048C4747" wp14:editId="4180D4FB">
-          <wp:simplePos x="0" y="0"/>
-          <wp:positionH relativeFrom="column">
-            <wp:posOffset>6010275</wp:posOffset>
-          </wp:positionH>
-          <wp:positionV relativeFrom="paragraph">
-            <wp:posOffset>-323850</wp:posOffset>
-          </wp:positionV>
-          <wp:extent cx="523374" cy="457200"/>
-          <wp:effectExtent l="0" t="0" r="0" b="0"/>
-          <wp:wrapNone/>
-          <wp:docPr id="1428854869" name="Picture 1" descr="">
-            <adec:decorative val="1"/>
-          </wp:docPr>
-          <wp:cNvGraphicFramePr>
-            <a:graphicFrameLocks xmlns:a="http://schemas.openxmlformats.org/drawingml/2006/main" noChangeAspect="1"/>
-          </wp:cNvGraphicFramePr>
-          <a:graphic xmlns:a="http://schemas.openxmlformats.org/drawingml/2006/main">
-            <a:graphicData uri="http://schemas.openxmlformats.org/drawingml/2006/picture">
-              <pic:pic xmlns:pic="http://schemas.openxmlformats.org/drawingml/2006/picture">
-                <pic:nvPicPr>
-                  <pic:cNvPr id="1428854869" name="Picture 1" descr=""/>
-                  <pic:cNvPicPr>
-                    <a:picLocks noChangeAspect="1"/>
-                  </pic:cNvPicPr>
-                </pic:nvPicPr>
-                <pic:blipFill>
-                  <a:blip r:embed="rId1">
-                    <a:extLst>
-                      <a:ext uri="{28A0092B-C50C-407E-A947-70E740481C1C}">
-                        <a14:useLocalDpi xmlns:a14="http://schemas.microsoft.com/office/drawing/2010/main" val="0"/>
-                      </a:ext>
-                    </a:extLst>
-                  </a:blip>
-                  <a:stretch>
-                    <a:fillRect/>
-                  </a:stretch>
-                </pic:blipFill>
-                <pic:spPr>
-                  <a:xfrm>
-                    <a:off x="0" y="0"/>
-                    <a:ext cx="523374" cy="457200"/>
-                  </a:xfrm>
-                  <a:prstGeom prst="rect">
-                    <a:avLst/>
-                  </a:prstGeom>
-                </pic:spPr>
-              </pic:pic>
-            </a:graphicData>
-          </a:graphic>
-          <wp14:sizeRelH relativeFrom="margin">
-            <wp14:pctWidth>0</wp14:pctWidth>
-          </wp14:sizeRelH>
-          <wp14:sizeRelV relativeFrom="margin">
-            <wp14:pctHeight>0</wp14:pctHeight>
-          </wp14:sizeRelV>
-        </wp:anchor>
-      </w:drawing>
-    </w:r>
-    <w:r>
-      <w:rPr>
-        <w:noProof/>
-      </w:rPr>
-      <mc:AlternateContent>
-        <mc:Choice Requires="wps">
-          <w:drawing>
-            <wp:anchor distT="0" distB="0" distL="114300" distR="114300" simplePos="0" relativeHeight="251663360" behindDoc="1" locked="0" layoutInCell="1" allowOverlap="1" wp14:anchorId="76194198" wp14:editId="377CA5F0">
-              <wp:simplePos x="0" y="0"/>
-              <wp:positionH relativeFrom="column">
-                <wp:posOffset>6416125</wp:posOffset>
-              </wp:positionH>
-              <wp:positionV relativeFrom="paragraph">
-                <wp:posOffset>-76697</wp:posOffset>
-              </wp:positionV>
-              <wp:extent cx="437050" cy="0"/>
-              <wp:effectExtent l="0" t="12700" r="33020" b="25400"/>
-              <wp:wrapNone/>
-              <wp:docPr id="160056721" name="Straight Connector 1">
-                <adec:decorative val="1"/>
-              </wp:docPr>
-              <wp:cNvGraphicFramePr/>
-              <a:graphic xmlns:a="http://schemas.openxmlformats.org/drawingml/2006/main">
-                <a:graphicData uri="http://schemas.microsoft.com/office/word/2010/wordprocessingShape">
-                  <wps:wsp>
-                    <wps:cNvCnPr/>
-                    <wps:spPr>
-                      <a:xfrm>
-                        <a:off x="0" y="0"/>
-                        <a:ext cx="437050" cy="0"/>
-                      </a:xfrm>
-                      <a:prstGeom prst="line">
-                        <a:avLst/>
-                      </a:prstGeom>
-                      <a:ln w="38100"/>
-                    </wps:spPr>
-                    <wps:style>
-                      <a:lnRef idx="3">
-                        <a:schemeClr val="dk1"/>
-                      </a:lnRef>
-                      <a:fillRef idx="0">
-                        <a:schemeClr val="dk1"/>
-                      </a:fillRef>
-                      <a:effectRef idx="2">
-                        <a:schemeClr val="dk1"/>
-                      </a:effectRef>
-                      <a:fontRef idx="minor">
-                        <a:schemeClr val="tx1"/>
-                      </a:fontRef>
-                    </wps:style>
-                    <wps:bodyPr/>
-                  </wps:wsp>
-                </a:graphicData>
-              </a:graphic>
-            </wp:anchor>
-          </w:drawing>
-        </mc:Choice>
-        <mc:Fallback>
-          <w:pict>
-            <v:line w14:anchorId="61EE608E" id="Straight Connector 1" o:spid="_x0000_s1026" style="position:absolute;z-index:-251653120;visibility:visible;mso-wrap-style:square;mso-wrap-distance-left:9pt;mso-wrap-distance-top:0;mso-wrap-distance-right:9pt;mso-wrap-distance-bottom:0;mso-position-horizontal:absolute;mso-position-horizontal-relative:text;mso-position-vertical:absolute;mso-position-vertical-relative:text" from="505.2pt,-6.05pt" to="539.6pt,-6.05pt" o:gfxdata="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" strokecolor="black [3200]" strokeweight="3pt">
-              <v:stroke joinstyle="miter"/>
-            </v:line>
-          </w:pict>
-        </mc:Fallback>
-      </mc:AlternateContent>
-    </w:r>
-    <w:r>
-      <w:rPr>
-        <w:noProof/>
-      </w:rPr>
-      <mc:AlternateContent>
-        <mc:Choice Requires="wps">
-          <w:drawing>
-            <wp:anchor distT="0" distB="0" distL="114300" distR="114300" simplePos="0" relativeHeight="251664384" behindDoc="1" locked="0" layoutInCell="1" allowOverlap="1" wp14:anchorId="2470D6F5" wp14:editId="5BB71F83">
-              <wp:simplePos x="0" y="0"/>
-              <wp:positionH relativeFrom="column">
-                <wp:posOffset>-914400</wp:posOffset>
-              </wp:positionH>
-              <wp:positionV relativeFrom="paragraph">
-                <wp:posOffset>-76697</wp:posOffset>
-              </wp:positionV>
-              <wp:extent cx="7010400" cy="0"/>
-              <wp:effectExtent l="0" t="12700" r="25400" b="25400"/>
-              <wp:wrapNone/>
-              <wp:docPr id="1347243333" name="Straight Connector 1">
-                <adec:decorative val="1"/>
-              </wp:docPr>
-              <wp:cNvGraphicFramePr/>
-              <a:graphic xmlns:a="http://schemas.openxmlformats.org/drawingml/2006/main">
-                <a:graphicData uri="http://schemas.microsoft.com/office/word/2010/wordprocessingShape">
-                  <wps:wsp>
-                    <wps:cNvCnPr/>
-                    <wps:spPr>
-                      <a:xfrm>
-                        <a:off x="0" y="0"/>
-                        <a:ext cx="7010400" cy="0"/>
-                      </a:xfrm>
-                      <a:prstGeom prst="line">
-                        <a:avLst/>
-                      </a:prstGeom>
-                      <a:ln w="38100"/>
-                    </wps:spPr>
-                    <wps:style>
-                      <a:lnRef idx="3">
-                        <a:schemeClr val="dk1"/>
-                      </a:lnRef>
-                      <a:fillRef idx="0">
-                        <a:schemeClr val="dk1"/>
-                      </a:fillRef>
-                      <a:effectRef idx="2">
-                        <a:schemeClr val="dk1"/>
-                      </a:effectRef>
-                      <a:fontRef idx="minor">
-                        <a:schemeClr val="tx1"/>
-                      </a:fontRef>
-                    </wps:style>
-                    <wps:bodyPr/>
-                  </wps:wsp>
-                </a:graphicData>
-              </a:graphic>
-            </wp:anchor>
-          </w:drawing>
-        </mc:Choice>
-        <mc:Fallback>
-          <w:pict>
-            <v:line w14:anchorId="2D0A0F32" id="Straight Connector 1" o:spid="_x0000_s1026" style="position:absolute;z-index:-251652096;visibility:visible;mso-wrap-style:square;mso-wrap-distance-left:9pt;mso-wrap-distance-top:0;mso-wrap-distance-right:9pt;mso-wrap-distance-bottom:0;mso-position-horizontal:absolute;mso-position-horizontal-relative:text;mso-position-vertical:absolute;mso-position-vertical-relative:text" from="-1in,-6.05pt" to="480pt,-6.05pt" o:gfxdata="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" strokecolor="black [3200]" strokeweight="3pt">
-              <v:stroke joinstyle="miter"/>
-            </v:line>
-          </w:pict>
-        </mc:Fallback>
-      </mc:AlternateContent>
-    </w:r>
-    <w:r>
-      <w:t>PSYC350</w:t>
-    </w:r>
-    <w:r>
-      <w:t xml:space="preserve"> L</w:t>
-    </w:r>
-    <w:r>
-      <w:t>AB</w:t>
-    </w:r>
   </w:p>
 </w:hdr>
 </file>
@@ -2451,7 +2115,7 @@
     <w:tmpl w:val="421A2B20"/>
     <w:lvl w:ilvl="0">
       <w:numFmt w:val="bullet"/>
-      <w:lvlText w:val=""/>
+      <w:lvlText w:val="•"/>
       <w:lvlJc w:val="left"/>
       <w:pPr>
         <w:ind w:hanging="360" w:left="720"/>
@@ -2462,7 +2126,7 @@
     </w:lvl>
     <w:lvl w:ilvl="1">
       <w:numFmt w:val="bullet"/>
-      <w:lvlText w:val="o"/>
+      <w:lvlText w:val="◦"/>
       <w:lvlJc w:val="left"/>
       <w:pPr>
         <w:ind w:hanging="360" w:left="1440"/>
@@ -2473,7 +2137,7 @@
     </w:lvl>
     <w:lvl w:ilvl="2">
       <w:numFmt w:val="bullet"/>
-      <w:lvlText w:val=""/>
+      <w:lvlText w:val="▪"/>
       <w:lvlJc w:val="left"/>
       <w:pPr>
         <w:ind w:hanging="360" w:left="2160"/>
@@ -2484,7 +2148,7 @@
     </w:lvl>
     <w:lvl w:ilvl="3">
       <w:numFmt w:val="bullet"/>
-      <w:lvlText w:val=""/>
+      <w:lvlText w:val="•"/>
       <w:lvlJc w:val="left"/>
       <w:pPr>
         <w:ind w:hanging="360" w:left="2880"/>
@@ -2495,7 +2159,7 @@
     </w:lvl>
     <w:lvl w:ilvl="4">
       <w:numFmt w:val="bullet"/>
-      <w:lvlText w:val="o"/>
+      <w:lvlText w:val="◦"/>
       <w:lvlJc w:val="left"/>
       <w:pPr>
         <w:ind w:hanging="360" w:left="3600"/>
@@ -2506,7 +2170,7 @@
     </w:lvl>
     <w:lvl w:ilvl="5">
       <w:numFmt w:val="bullet"/>
-      <w:lvlText w:val=""/>
+      <w:lvlText w:val="▪"/>
       <w:lvlJc w:val="left"/>
       <w:pPr>
         <w:ind w:hanging="360" w:left="4320"/>
@@ -2517,7 +2181,7 @@
     </w:lvl>
     <w:lvl w:ilvl="6">
       <w:numFmt w:val="bullet"/>
-      <w:lvlText w:val=""/>
+      <w:lvlText w:val="•"/>
       <w:lvlJc w:val="left"/>
       <w:pPr>
         <w:ind w:hanging="360" w:left="5040"/>
@@ -2528,7 +2192,7 @@
     </w:lvl>
     <w:lvl w:ilvl="7">
       <w:numFmt w:val="bullet"/>
-      <w:lvlText w:val="o"/>
+      <w:lvlText w:val="◦"/>
       <w:lvlJc w:val="left"/>
       <w:pPr>
         <w:ind w:hanging="360" w:left="5760"/>
@@ -2539,7 +2203,7 @@
     </w:lvl>
     <w:lvl w:ilvl="8">
       <w:numFmt w:val="bullet"/>
-      <w:lvlText w:val=""/>
+      <w:lvlText w:val="▪"/>
       <w:lvlJc w:val="left"/>
       <w:pPr>
         <w:ind w:hanging="360" w:left="6480"/>
@@ -7236,7 +6900,15 @@
       <w:lvlJc w:val="left"/>
       <w:pPr>
         <w:ind w:left="720" w:hanging="360"/>
-      </w:pPr>
+        <w:spacing w:before="0" w:after="120" w:line="288" w:lineRule="auto"/>
+      </w:pPr>
+      <w:rPr>
+        <w:rFonts w:ascii="Arial" w:hAnsi="Arial" w:cs="Arial" w:eastAsia="Arial"/>
+        <w:sz w:val="23"/>
+        <w:szCs w:val="23"/>
+        <w:color w:val="222222"/>
+      </w:rPr>
+      <w:suff w:val="tab"/>
     </w:lvl>
     <w:lvl w:ilvl="1">
       <w:numFmt w:val="bullet"/>
@@ -7244,7 +6916,15 @@
       <w:lvlJc w:val="left"/>
       <w:pPr>
         <w:ind w:left="1440" w:hanging="360"/>
-      </w:pPr>
+        <w:spacing w:before="0" w:after="120" w:line="288" w:lineRule="auto"/>
+      </w:pPr>
+      <w:rPr>
+        <w:rFonts w:ascii="Arial" w:hAnsi="Arial" w:cs="Arial" w:eastAsia="Arial"/>
+        <w:sz w:val="23"/>
+        <w:szCs w:val="23"/>
+        <w:color w:val="222222"/>
+      </w:rPr>
+      <w:suff w:val="tab"/>
     </w:lvl>
     <w:lvl w:ilvl="2">
       <w:numFmt w:val="bullet"/>
@@ -7252,7 +6932,15 @@
       <w:lvlJc w:val="left"/>
       <w:pPr>
         <w:ind w:left="2160" w:hanging="360"/>
-      </w:pPr>
+        <w:spacing w:before="0" w:after="120" w:line="288" w:lineRule="auto"/>
+      </w:pPr>
+      <w:rPr>
+        <w:rFonts w:ascii="Arial" w:hAnsi="Arial" w:cs="Arial" w:eastAsia="Arial"/>
+        <w:sz w:val="23"/>
+        <w:szCs w:val="23"/>
+        <w:color w:val="222222"/>
+      </w:rPr>
+      <w:suff w:val="tab"/>
     </w:lvl>
     <w:lvl w:ilvl="3">
       <w:numFmt w:val="bullet"/>
@@ -7260,7 +6948,15 @@
       <w:lvlJc w:val="left"/>
       <w:pPr>
         <w:ind w:left="2880" w:hanging="360"/>
-      </w:pPr>
+        <w:spacing w:before="0" w:after="120" w:line="288" w:lineRule="auto"/>
+      </w:pPr>
+      <w:rPr>
+        <w:rFonts w:ascii="Arial" w:hAnsi="Arial" w:cs="Arial" w:eastAsia="Arial"/>
+        <w:sz w:val="23"/>
+        <w:szCs w:val="23"/>
+        <w:color w:val="222222"/>
+      </w:rPr>
+      <w:suff w:val="tab"/>
     </w:lvl>
     <w:lvl w:ilvl="4">
       <w:numFmt w:val="bullet"/>
@@ -7268,7 +6964,15 @@
       <w:lvlJc w:val="left"/>
       <w:pPr>
         <w:ind w:left="3600" w:hanging="360"/>
-      </w:pPr>
+        <w:spacing w:before="0" w:after="120" w:line="288" w:lineRule="auto"/>
+      </w:pPr>
+      <w:rPr>
+        <w:rFonts w:ascii="Arial" w:hAnsi="Arial" w:cs="Arial" w:eastAsia="Arial"/>
+        <w:sz w:val="23"/>
+        <w:szCs w:val="23"/>
+        <w:color w:val="222222"/>
+      </w:rPr>
+      <w:suff w:val="tab"/>
     </w:lvl>
     <w:lvl w:ilvl="5">
       <w:numFmt w:val="bullet"/>
@@ -7276,7 +6980,15 @@
       <w:lvlJc w:val="left"/>
       <w:pPr>
         <w:ind w:left="4320" w:hanging="360"/>
-      </w:pPr>
+        <w:spacing w:before="0" w:after="120" w:line="288" w:lineRule="auto"/>
+      </w:pPr>
+      <w:rPr>
+        <w:rFonts w:ascii="Arial" w:hAnsi="Arial" w:cs="Arial" w:eastAsia="Arial"/>
+        <w:sz w:val="23"/>
+        <w:szCs w:val="23"/>
+        <w:color w:val="222222"/>
+      </w:rPr>
+      <w:suff w:val="tab"/>
     </w:lvl>
     <w:lvl w:ilvl="6">
       <w:numFmt w:val="bullet"/>
@@ -7284,7 +6996,15 @@
       <w:lvlJc w:val="left"/>
       <w:pPr>
         <w:ind w:left="5040" w:hanging="360"/>
-      </w:pPr>
+        <w:spacing w:before="0" w:after="120" w:line="288" w:lineRule="auto"/>
+      </w:pPr>
+      <w:rPr>
+        <w:rFonts w:ascii="Arial" w:hAnsi="Arial" w:cs="Arial" w:eastAsia="Arial"/>
+        <w:sz w:val="23"/>
+        <w:szCs w:val="23"/>
+        <w:color w:val="222222"/>
+      </w:rPr>
+      <w:suff w:val="tab"/>
     </w:lvl>
     <w:lvl w:ilvl="7">
       <w:numFmt w:val="bullet"/>
@@ -7292,7 +7012,15 @@
       <w:lvlJc w:val="left"/>
       <w:pPr>
         <w:ind w:left="5760" w:hanging="360"/>
-      </w:pPr>
+        <w:spacing w:before="0" w:after="120" w:line="288" w:lineRule="auto"/>
+      </w:pPr>
+      <w:rPr>
+        <w:rFonts w:ascii="Arial" w:hAnsi="Arial" w:cs="Arial" w:eastAsia="Arial"/>
+        <w:sz w:val="23"/>
+        <w:szCs w:val="23"/>
+        <w:color w:val="222222"/>
+      </w:rPr>
+      <w:suff w:val="tab"/>
     </w:lvl>
     <w:lvl w:ilvl="8">
       <w:numFmt w:val="bullet"/>
@@ -7300,110 +7028,163 @@
       <w:lvlJc w:val="left"/>
       <w:pPr>
         <w:ind w:left="6480" w:hanging="360"/>
-      </w:pPr>
+        <w:spacing w:before="0" w:after="120" w:line="288" w:lineRule="auto"/>
+      </w:pPr>
+      <w:rPr>
+        <w:rFonts w:ascii="Arial" w:hAnsi="Arial" w:cs="Arial" w:eastAsia="Arial"/>
+        <w:sz w:val="23"/>
+        <w:szCs w:val="23"/>
+        <w:color w:val="222222"/>
+      </w:rPr>
+      <w:suff w:val="tab"/>
     </w:lvl>
   </w:abstractNum>
-  <w:abstractNum w:abstractNumId="991">
+  <w:abstractNum w:abstractNumId="100">
     <w:nsid w:val="0000A991"/>
     <w:multiLevelType w:val="multilevel"/>
     <w:lvl w:ilvl="0">
       <w:numFmt w:val="bullet"/>
-      <w:lvlText w:val=""/>
+      <w:lvlText w:val="•"/>
       <w:lvlJc w:val="left"/>
       <w:pPr>
         <w:ind w:left="720" w:hanging="360"/>
-      </w:pPr>
-      <w:rPr>
-        <w:rFonts w:ascii="Symbol" w:hAnsi="Symbol" w:cs="Symbol" w:hint="default"/>
-      </w:rPr>
+        <w:spacing w:before="0" w:after="120" w:line="288" w:lineRule="auto"/>
+      </w:pPr>
+      <w:rPr>
+        <w:rFonts w:ascii="Arial" w:hAnsi="Arial" w:cs="Arial" w:hint="default" w:eastAsia="Arial"/>
+        <w:sz w:val="23"/>
+        <w:szCs w:val="23"/>
+        <w:color w:val="222222"/>
+      </w:rPr>
+      <w:suff w:val="tab"/>
     </w:lvl>
     <w:lvl w:ilvl="1">
       <w:numFmt w:val="bullet"/>
-      <w:lvlText w:val="o"/>
+      <w:lvlText w:val="◦"/>
       <w:lvlJc w:val="left"/>
       <w:pPr>
         <w:ind w:left="1440" w:hanging="360"/>
-      </w:pPr>
-      <w:rPr>
-        <w:rFonts w:ascii="Courier New" w:hAnsi="Courier New" w:cs="Courier New" w:hint="default"/>
-      </w:rPr>
+        <w:spacing w:before="0" w:after="120" w:line="288" w:lineRule="auto"/>
+      </w:pPr>
+      <w:rPr>
+        <w:rFonts w:ascii="Arial" w:hAnsi="Arial" w:cs="Arial" w:hint="default" w:eastAsia="Arial"/>
+        <w:sz w:val="23"/>
+        <w:szCs w:val="23"/>
+        <w:color w:val="222222"/>
+      </w:rPr>
+      <w:suff w:val="tab"/>
     </w:lvl>
     <w:lvl w:ilvl="2">
       <w:numFmt w:val="bullet"/>
-      <w:lvlText w:val=""/>
+      <w:lvlText w:val="▪"/>
       <w:lvlJc w:val="left"/>
       <w:pPr>
         <w:ind w:left="2160" w:hanging="360"/>
-      </w:pPr>
-      <w:rPr>
-        <w:rFonts w:ascii="Wingdings" w:hAnsi="Wingdings" w:cs="Wingdings" w:hint="default"/>
-      </w:rPr>
+        <w:spacing w:before="0" w:after="120" w:line="288" w:lineRule="auto"/>
+      </w:pPr>
+      <w:rPr>
+        <w:rFonts w:ascii="Arial" w:hAnsi="Arial" w:cs="Arial" w:hint="default" w:eastAsia="Arial"/>
+        <w:sz w:val="23"/>
+        <w:szCs w:val="23"/>
+        <w:color w:val="222222"/>
+      </w:rPr>
+      <w:suff w:val="tab"/>
     </w:lvl>
     <w:lvl w:ilvl="3">
       <w:numFmt w:val="bullet"/>
-      <w:lvlText w:val=""/>
+      <w:lvlText w:val="•"/>
       <w:lvlJc w:val="left"/>
       <w:pPr>
         <w:ind w:left="2880" w:hanging="360"/>
-      </w:pPr>
-      <w:rPr>
-        <w:rFonts w:ascii="Symbol" w:hAnsi="Symbol" w:cs="Symbol" w:hint="default"/>
-      </w:rPr>
+        <w:spacing w:before="0" w:after="120" w:line="288" w:lineRule="auto"/>
+      </w:pPr>
+      <w:rPr>
+        <w:rFonts w:ascii="Arial" w:hAnsi="Arial" w:cs="Arial" w:hint="default" w:eastAsia="Arial"/>
+        <w:sz w:val="23"/>
+        <w:szCs w:val="23"/>
+        <w:color w:val="222222"/>
+      </w:rPr>
+      <w:suff w:val="tab"/>
     </w:lvl>
     <w:lvl w:ilvl="4">
       <w:numFmt w:val="bullet"/>
-      <w:lvlText w:val="o"/>
+      <w:lvlText w:val="◦"/>
       <w:lvlJc w:val="left"/>
       <w:pPr>
         <w:ind w:left="3600" w:hanging="360"/>
-      </w:pPr>
-      <w:rPr>
-        <w:rFonts w:ascii="Courier New" w:hAnsi="Courier New" w:cs="Courier New" w:hint="default"/>
-      </w:rPr>
+        <w:spacing w:before="0" w:after="120" w:line="288" w:lineRule="auto"/>
+      </w:pPr>
+      <w:rPr>
+        <w:rFonts w:ascii="Arial" w:hAnsi="Arial" w:cs="Arial" w:hint="default" w:eastAsia="Arial"/>
+        <w:sz w:val="23"/>
+        <w:szCs w:val="23"/>
+        <w:color w:val="222222"/>
+      </w:rPr>
+      <w:suff w:val="tab"/>
     </w:lvl>
     <w:lvl w:ilvl="5">
       <w:numFmt w:val="bullet"/>
-      <w:lvlText w:val=""/>
+      <w:lvlText w:val="▪"/>
       <w:lvlJc w:val="left"/>
       <w:pPr>
         <w:ind w:left="4320" w:hanging="360"/>
-      </w:pPr>
-      <w:rPr>
-        <w:rFonts w:ascii="Wingdings" w:hAnsi="Wingdings" w:cs="Wingdings" w:hint="default"/>
-      </w:rPr>
+        <w:spacing w:before="0" w:after="120" w:line="288" w:lineRule="auto"/>
+      </w:pPr>
+      <w:rPr>
+        <w:rFonts w:ascii="Arial" w:hAnsi="Arial" w:cs="Arial" w:hint="default" w:eastAsia="Arial"/>
+        <w:sz w:val="23"/>
+        <w:szCs w:val="23"/>
+        <w:color w:val="222222"/>
+      </w:rPr>
+      <w:suff w:val="tab"/>
     </w:lvl>
     <w:lvl w:ilvl="6">
       <w:numFmt w:val="bullet"/>
-      <w:lvlText w:val=""/>
+      <w:lvlText w:val="•"/>
       <w:lvlJc w:val="left"/>
       <w:pPr>
         <w:ind w:left="5040" w:hanging="360"/>
-      </w:pPr>
-      <w:rPr>
-        <w:rFonts w:ascii="Symbol" w:hAnsi="Symbol" w:cs="Symbol" w:hint="default"/>
-      </w:rPr>
+        <w:spacing w:before="0" w:after="120" w:line="288" w:lineRule="auto"/>
+      </w:pPr>
+      <w:rPr>
+        <w:rFonts w:ascii="Arial" w:hAnsi="Arial" w:cs="Arial" w:hint="default" w:eastAsia="Arial"/>
+        <w:sz w:val="23"/>
+        <w:szCs w:val="23"/>
+        <w:color w:val="222222"/>
+      </w:rPr>
+      <w:suff w:val="tab"/>
     </w:lvl>
     <w:lvl w:ilvl="7">
       <w:numFmt w:val="bullet"/>
-      <w:lvlText w:val="o"/>
+      <w:lvlText w:val="◦"/>
       <w:lvlJc w:val="left"/>
       <w:pPr>
         <w:ind w:left="5760" w:hanging="360"/>
-      </w:pPr>
-      <w:rPr>
-        <w:rFonts w:ascii="Courier New" w:hAnsi="Courier New" w:cs="Courier New" w:hint="default"/>
-      </w:rPr>
+        <w:spacing w:before="0" w:after="120" w:line="288" w:lineRule="auto"/>
+      </w:pPr>
+      <w:rPr>
+        <w:rFonts w:ascii="Arial" w:hAnsi="Arial" w:cs="Arial" w:hint="default" w:eastAsia="Arial"/>
+        <w:sz w:val="23"/>
+        <w:szCs w:val="23"/>
+        <w:color w:val="222222"/>
+      </w:rPr>
+      <w:suff w:val="tab"/>
     </w:lvl>
     <w:lvl w:ilvl="8">
       <w:numFmt w:val="bullet"/>
-      <w:lvlText w:val=""/>
+      <w:lvlText w:val="▪"/>
       <w:lvlJc w:val="left"/>
       <w:pPr>
         <w:ind w:left="6480" w:hanging="360"/>
-      </w:pPr>
-      <w:rPr>
-        <w:rFonts w:ascii="Wingdings" w:hAnsi="Wingdings" w:cs="Wingdings" w:hint="default"/>
-      </w:rPr>
+        <w:spacing w:before="0" w:after="120" w:line="288" w:lineRule="auto"/>
+      </w:pPr>
+      <w:rPr>
+        <w:rFonts w:ascii="Arial" w:hAnsi="Arial" w:cs="Arial" w:hint="default" w:eastAsia="Arial"/>
+        <w:sz w:val="23"/>
+        <w:szCs w:val="23"/>
+        <w:color w:val="222222"/>
+      </w:rPr>
+      <w:suff w:val="tab"/>
     </w:lvl>
   </w:abstractNum>
   <w:num w16cid:durableId="313026888" w:numId="1">
@@ -7622,32 +7403,32 @@
   <w:num w:numId="1000">
     <w:abstractNumId w:val="990"/>
   </w:num>
-  <w:num w:numId="1001">
-    <w:abstractNumId w:val="991"/>
+  <w:num w:numId="100">
+    <w:abstractNumId w:val="100"/>
   </w:num>
-  <w:num w:numId="1002">
-    <w:abstractNumId w:val="991"/>
+  <w:num w:numId="101">
+    <w:abstractNumId w:val="100"/>
   </w:num>
-  <w:num w:numId="1003">
-    <w:abstractNumId w:val="991"/>
+  <w:num w:numId="102">
+    <w:abstractNumId w:val="100"/>
   </w:num>
-  <w:num w:numId="1004">
-    <w:abstractNumId w:val="991"/>
+  <w:num w:numId="103">
+    <w:abstractNumId w:val="100"/>
   </w:num>
-  <w:num w:numId="1005">
-    <w:abstractNumId w:val="991"/>
+  <w:num w:numId="104">
+    <w:abstractNumId w:val="100"/>
   </w:num>
-  <w:num w:numId="1006">
-    <w:abstractNumId w:val="991"/>
+  <w:num w:numId="105">
+    <w:abstractNumId w:val="100"/>
   </w:num>
-  <w:num w:numId="1007">
-    <w:abstractNumId w:val="991"/>
+  <w:num w:numId="106">
+    <w:abstractNumId w:val="100"/>
   </w:num>
-  <w:num w:numId="1008">
-    <w:abstractNumId w:val="991"/>
+  <w:num w:numId="107">
+    <w:abstractNumId w:val="100"/>
   </w:num>
-  <w:num w:numId="1009">
-    <w:abstractNumId w:val="991"/>
+  <w:num w:numId="108">
+    <w:abstractNumId w:val="100"/>
   </w:num>
 </w:numbering>
 </file>
@@ -7657,17 +7438,18 @@
   <w:docDefaults>
     <w:rPrDefault>
       <w:rPr>
-        <w:rFonts w:asciiTheme="minorHAnsi" w:cstheme="minorBidi" w:eastAsiaTheme="minorHAnsi" w:hAnsiTheme="minorHAnsi"/>
+        <w:rFonts w:ascii="Arial" w:asciiTheme="minorHAnsi" w:cs="Arial" w:cstheme="minorBidi" w:eastAsia="Arial" w:eastAsiaTheme="minorHAnsi" w:hAnsi="Arial" w:hAnsiTheme="minorHAnsi"/>
         <w:kern w:val="2"/>
-        <w:sz w:val="24"/>
-        <w:szCs w:val="24"/>
+        <w:sz w:val="23"/>
+        <w:szCs w:val="23"/>
         <w:lang w:bidi="ar-SA" w:eastAsia="en-US" w:val="en-US"/>
         <w14:ligatures w14:val="standardContextual"/>
+        <w:color w:val="222222"/>
       </w:rPr>
     </w:rPrDefault>
     <w:pPrDefault>
       <w:pPr>
-        <w:spacing w:after="160" w:line="278" w:lineRule="auto"/>
+        <w:spacing w:after="160" w:before="0" w:line="300" w:lineRule="auto"/>
       </w:pPr>
     </w:pPrDefault>
   </w:docDefaults>
@@ -8053,6 +7835,16 @@
     <w:name w:val="Normal"/>
     <w:qFormat/>
     <w:rsid w:val="00E6184A"/>
+    <w:pPr>
+      <w:spacing w:after="160" w:before="0" w:line="300" w:lineRule="auto"/>
+      <w:widowControl/>
+    </w:pPr>
+    <w:rPr>
+      <w:rFonts w:ascii="Arial" w:cs="Arial" w:eastAsia="Arial" w:hAnsi="Arial"/>
+      <w:sz w:val="23"/>
+      <w:szCs w:val="23"/>
+      <w:color w:val="222222"/>
+    </w:rPr>
   </w:style>
   <w:style w:styleId="Heading1" w:type="paragraph">
     <w:name w:val="heading 1"/>
@@ -8076,7 +7868,7 @@
         <w:right w:color="000000" w:shadow="1" w:space="4" w:sz="4" w:themeColor="text1" w:val="single"/>
       </w:pBdr>
       <w:shd w:color="F2F2F2" w:fill="F2F2F2" w:themeColor="background1" w:themeFill="background1" w:themeFillShade="F2" w:themeShade="F2" w:val="solid"/>
-      <w:spacing w:after="480" w:before="360"/>
+      <w:spacing w:after="200" w:before="360" w:line="300" w:lineRule="auto"/>
       <w:outlineLvl w:val="0"/>
     </w:pPr>
     <w:rPr>
@@ -8102,15 +7894,17 @@
         <w:ilvl w:val="1"/>
         <w:numId w:val="42"/>
       </w:numPr>
-      <w:spacing w:after="80" w:before="160"/>
+      <w:spacing w:after="140" w:before="300" w:line="300" w:lineRule="auto"/>
       <w:outlineLvl w:val="1"/>
+      <w:keepNext/>
+      <w:keepLines/>
     </w:pPr>
     <w:rPr>
-      <w:rFonts w:cstheme="majorBidi" w:eastAsiaTheme="majorEastAsia"/>
+      <w:rFonts w:ascii="Arial" w:cs="Arial" w:cstheme="majorBidi" w:eastAsia="Arial" w:eastAsiaTheme="majorEastAsia" w:hAnsi="Arial"/>
       <w:b/>
-      <w:color w:themeColor="text1" w:val="000000"/>
-      <w:sz w:val="32"/>
-      <w:szCs w:val="32"/>
+      <w:color w:themeColor="text1" w:val="1A1A1A"/>
+      <w:sz w:val="30"/>
+      <w:szCs w:val="30"/>
     </w:rPr>
   </w:style>
   <w:style w:styleId="Heading3" w:type="paragraph">
@@ -8128,13 +7922,16 @@
         <w:ilvl w:val="2"/>
         <w:numId w:val="42"/>
       </w:numPr>
-      <w:spacing w:after="80" w:before="160"/>
+      <w:spacing w:after="120" w:before="240" w:line="288" w:lineRule="auto"/>
       <w:outlineLvl w:val="2"/>
+      <w:keepNext/>
+      <w:keepLines/>
     </w:pPr>
     <w:rPr>
-      <w:color w:themeColor="text1" w:val="000000"/>
-      <w:sz w:val="28"/>
-      <w:szCs w:val="28"/>
+      <w:rFonts w:ascii="Arial" w:cs="Arial" w:eastAsia="Arial" w:hAnsi="Arial"/>
+      <w:color w:themeColor="text1" w:val="333333"/>
+      <w:sz w:val="26"/>
+      <w:szCs w:val="26"/>
     </w:rPr>
   </w:style>
   <w:style w:styleId="Heading4" w:type="paragraph">
@@ -8461,9 +8258,11 @@
     <w:qFormat/>
     <w:rsid w:val="00AC7473"/>
     <w:pPr>
-      <w:spacing w:after="120" w:line="240" w:lineRule="auto"/>
+      <w:spacing w:after="100" w:before="0" w:line="288" w:lineRule="auto"/>
       <w:contextualSpacing/>
       <w:jc w:val="center"/>
+      <w:keepNext/>
+      <w:keepLines/>
     </w:pPr>
     <w:rPr>
       <w:rFonts w:asciiTheme="majorHAnsi" w:cstheme="majorBidi" w:eastAsiaTheme="majorEastAsia" w:hAnsiTheme="majorHAnsi"/>
@@ -8505,9 +8304,12 @@
         <w:ilvl w:val="1"/>
       </w:numPr>
       <w:jc w:val="center"/>
+      <w:spacing w:after="260" w:before="0" w:line="288" w:lineRule="auto"/>
+      <w:keepNext/>
+      <w:keepLines/>
     </w:pPr>
     <w:rPr>
-      <w:rFonts w:asciiTheme="majorHAnsi" w:cstheme="majorBidi" w:eastAsiaTheme="majorEastAsia" w:hAnsiTheme="majorHAnsi"/>
+      <w:rFonts w:ascii="Arial" w:asciiTheme="majorHAnsi" w:cs="Arial" w:cstheme="majorBidi" w:eastAsia="Arial" w:eastAsiaTheme="majorEastAsia" w:hAnsi="Arial" w:hAnsiTheme="majorHAnsi"/>
       <w:color w:themeColor="text1" w:themeTint="A6" w:val="595959"/>
       <w:spacing w:val="15"/>
       <w:sz w:val="28"/>
@@ -8568,7 +8370,14 @@
     <w:pPr>
       <w:ind w:left="720"/>
       <w:contextualSpacing/>
+      <w:spacing w:after="120" w:before="0" w:line="288" w:lineRule="auto"/>
     </w:pPr>
+    <w:rPr>
+      <w:rFonts w:ascii="Arial" w:cs="Arial" w:eastAsia="Arial" w:hAnsi="Arial"/>
+      <w:sz w:val="23"/>
+      <w:szCs w:val="23"/>
+      <w:color w:val="222222"/>
+    </w:rPr>
   </w:style>
   <w:style w:styleId="IntenseEmphasis" w:type="character">
     <w:name w:val="Intense Emphasis"/>
@@ -8740,190 +8549,271 @@
     <w:autoRedefine/>
     <w:qFormat/>
     <w:pPr>
-      <w:shd w:color="auto" w:fill="F1F3F5" w:val="clear"/>
-      <w:wordWrap w:val="0"/>
+      <w:shd w:color="auto" w:fill="F7F7F7" w:val="clear"/>
+      <w:wordWrap w:val="1"/>
+      <w:spacing w:after="160" w:before="120" w:line="264" w:lineRule="auto"/>
+      <w:ind w:left="160" w:right="160"/>
+      <w:pBdr>
+        <w:left w:color="C8102E" w:space="12" w:sz="14" w:val="single"/>
+        <w:top w:color="D9D9D9" w:space="6" w:sz="4" w:val="single"/>
+        <w:bottom w:color="D9D9D9" w:space="6" w:sz="4" w:val="single"/>
+        <w:right w:color="D9D9D9" w:space="6" w:sz="4" w:val="single"/>
+      </w:pBdr>
     </w:pPr>
+    <w:rPr>
+      <w:rFonts w:ascii="Courier New" w:cs="Courier New" w:eastAsia="Courier New" w:hAnsi="Courier New"/>
+      <w:sz w:val="19"/>
+      <w:szCs w:val="19"/>
+      <w:color w:val="1F2937"/>
+    </w:rPr>
   </w:style>
   <w:style w:customStyle="1" w:styleId="KeywordTok" w:type="character">
     <w:name w:val="KeywordTok"/>
     <w:rPr>
+      <w:rFonts w:ascii="Courier New" w:cs="Courier New" w:eastAsia="Courier New" w:hAnsi="Courier New"/>
       <w:b/>
       <w:color w:val="003B4F"/>
-      <w:shd w:color="auto" w:fill="F1F3F5" w:val="clear"/>
+      <w:shd w:color="auto" w:fill="F7F7F7" w:val="clear"/>
+      <w:sz w:val="19"/>
+      <w:szCs w:val="19"/>
     </w:rPr>
   </w:style>
   <w:style w:customStyle="1" w:styleId="DataTypeTok" w:type="character">
     <w:name w:val="DataTypeTok"/>
     <w:rsid w:val="008B5ADE"/>
     <w:rPr>
-      <w:rFonts w:asciiTheme="minorHAnsi" w:hAnsiTheme="minorHAnsi"/>
+      <w:rFonts w:ascii="Courier New" w:asciiTheme="minorHAnsi" w:cs="Courier New" w:eastAsia="Courier New" w:hAnsi="Courier New" w:hAnsiTheme="minorHAnsi"/>
       <w:color w:val="AD0000"/>
-      <w:shd w:color="auto" w:fill="F1F3F5" w:val="clear"/>
+      <w:shd w:color="auto" w:fill="F7F7F7" w:val="clear"/>
+      <w:sz w:val="19"/>
+      <w:szCs w:val="19"/>
     </w:rPr>
   </w:style>
   <w:style w:customStyle="1" w:styleId="DecValTok" w:type="character">
     <w:name w:val="DecValTok"/>
     <w:rPr>
+      <w:rFonts w:ascii="Courier New" w:cs="Courier New" w:eastAsia="Courier New" w:hAnsi="Courier New"/>
       <w:color w:val="AD0000"/>
-      <w:shd w:color="auto" w:fill="F1F3F5" w:val="clear"/>
+      <w:shd w:color="auto" w:fill="F7F7F7" w:val="clear"/>
+      <w:sz w:val="19"/>
+      <w:szCs w:val="19"/>
     </w:rPr>
   </w:style>
   <w:style w:customStyle="1" w:styleId="BaseNTok" w:type="character">
     <w:name w:val="BaseNTok"/>
     <w:rsid w:val="008B5ADE"/>
     <w:rPr>
-      <w:rFonts w:asciiTheme="minorHAnsi" w:hAnsiTheme="minorHAnsi"/>
+      <w:rFonts w:ascii="Courier New" w:asciiTheme="minorHAnsi" w:cs="Courier New" w:eastAsia="Courier New" w:hAnsi="Courier New" w:hAnsiTheme="minorHAnsi"/>
       <w:color w:val="AD0000"/>
-      <w:shd w:color="auto" w:fill="F1F3F5" w:val="clear"/>
+      <w:shd w:color="auto" w:fill="F7F7F7" w:val="clear"/>
+      <w:sz w:val="19"/>
+      <w:szCs w:val="19"/>
     </w:rPr>
   </w:style>
   <w:style w:customStyle="1" w:styleId="FloatTok" w:type="character">
     <w:name w:val="FloatTok"/>
     <w:rPr>
+      <w:rFonts w:ascii="Courier New" w:cs="Courier New" w:eastAsia="Courier New" w:hAnsi="Courier New"/>
       <w:color w:val="AD0000"/>
-      <w:shd w:color="auto" w:fill="F1F3F5" w:val="clear"/>
+      <w:shd w:color="auto" w:fill="F7F7F7" w:val="clear"/>
+      <w:sz w:val="19"/>
+      <w:szCs w:val="19"/>
     </w:rPr>
   </w:style>
   <w:style w:customStyle="1" w:styleId="ConstantTok" w:type="character">
     <w:name w:val="ConstantTok"/>
     <w:rPr>
+      <w:rFonts w:ascii="Courier New" w:cs="Courier New" w:eastAsia="Courier New" w:hAnsi="Courier New"/>
       <w:color w:val="8F5902"/>
-      <w:shd w:color="auto" w:fill="F1F3F5" w:val="clear"/>
+      <w:shd w:color="auto" w:fill="F7F7F7" w:val="clear"/>
+      <w:sz w:val="19"/>
+      <w:szCs w:val="19"/>
     </w:rPr>
   </w:style>
   <w:style w:customStyle="1" w:styleId="CharTok" w:type="character">
     <w:name w:val="CharTok"/>
     <w:rsid w:val="008B5ADE"/>
     <w:rPr>
-      <w:rFonts w:asciiTheme="minorHAnsi" w:hAnsiTheme="minorHAnsi"/>
+      <w:rFonts w:ascii="Courier New" w:asciiTheme="minorHAnsi" w:cs="Courier New" w:eastAsia="Courier New" w:hAnsi="Courier New" w:hAnsiTheme="minorHAnsi"/>
       <w:color w:val="20794D"/>
-      <w:shd w:color="auto" w:fill="F1F3F5" w:val="clear"/>
+      <w:shd w:color="auto" w:fill="F7F7F7" w:val="clear"/>
+      <w:sz w:val="19"/>
+      <w:szCs w:val="19"/>
     </w:rPr>
   </w:style>
   <w:style w:customStyle="1" w:styleId="SpecialCharTok" w:type="character">
     <w:name w:val="SpecialCharTok"/>
     <w:rPr>
+      <w:rFonts w:ascii="Courier New" w:cs="Courier New" w:eastAsia="Courier New" w:hAnsi="Courier New"/>
       <w:color w:val="5E5E5E"/>
-      <w:shd w:color="auto" w:fill="F1F3F5" w:val="clear"/>
+      <w:shd w:color="auto" w:fill="F7F7F7" w:val="clear"/>
+      <w:sz w:val="19"/>
+      <w:szCs w:val="19"/>
     </w:rPr>
   </w:style>
   <w:style w:customStyle="1" w:styleId="StringTok" w:type="character">
     <w:name w:val="StringTok"/>
     <w:rPr>
+      <w:rFonts w:ascii="Courier New" w:cs="Courier New" w:eastAsia="Courier New" w:hAnsi="Courier New"/>
       <w:color w:val="20794D"/>
-      <w:shd w:color="auto" w:fill="F1F3F5" w:val="clear"/>
+      <w:shd w:color="auto" w:fill="F7F7F7" w:val="clear"/>
+      <w:sz w:val="19"/>
+      <w:szCs w:val="19"/>
     </w:rPr>
   </w:style>
   <w:style w:customStyle="1" w:styleId="VerbatimStringTok" w:type="character">
     <w:name w:val="VerbatimStringTok"/>
     <w:rPr>
+      <w:rFonts w:ascii="Courier New" w:cs="Courier New" w:eastAsia="Courier New" w:hAnsi="Courier New"/>
       <w:color w:val="20794D"/>
-      <w:shd w:color="auto" w:fill="F1F3F5" w:val="clear"/>
+      <w:shd w:color="auto" w:fill="F7F7F7" w:val="clear"/>
+      <w:sz w:val="19"/>
+      <w:szCs w:val="19"/>
     </w:rPr>
   </w:style>
   <w:style w:customStyle="1" w:styleId="SpecialStringTok" w:type="character">
     <w:name w:val="SpecialStringTok"/>
     <w:rPr>
+      <w:rFonts w:ascii="Courier New" w:cs="Courier New" w:eastAsia="Courier New" w:hAnsi="Courier New"/>
       <w:color w:val="20794D"/>
-      <w:shd w:color="auto" w:fill="F1F3F5" w:val="clear"/>
+      <w:shd w:color="auto" w:fill="F7F7F7" w:val="clear"/>
+      <w:sz w:val="19"/>
+      <w:szCs w:val="19"/>
     </w:rPr>
   </w:style>
   <w:style w:customStyle="1" w:styleId="ImportTok" w:type="character">
     <w:name w:val="ImportTok"/>
     <w:rPr>
+      <w:rFonts w:ascii="Courier New" w:cs="Courier New" w:eastAsia="Courier New" w:hAnsi="Courier New"/>
       <w:color w:val="00769E"/>
-      <w:shd w:color="auto" w:fill="F1F3F5" w:val="clear"/>
+      <w:shd w:color="auto" w:fill="F7F7F7" w:val="clear"/>
+      <w:sz w:val="19"/>
+      <w:szCs w:val="19"/>
     </w:rPr>
   </w:style>
   <w:style w:customStyle="1" w:styleId="CommentTok" w:type="character">
     <w:name w:val="CommentTok"/>
     <w:rPr>
+      <w:rFonts w:ascii="Courier New" w:cs="Courier New" w:eastAsia="Courier New" w:hAnsi="Courier New"/>
       <w:color w:val="5E5E5E"/>
-      <w:shd w:color="auto" w:fill="F1F3F5" w:val="clear"/>
+      <w:shd w:color="auto" w:fill="F7F7F7" w:val="clear"/>
+      <w:sz w:val="19"/>
+      <w:szCs w:val="19"/>
     </w:rPr>
   </w:style>
   <w:style w:customStyle="1" w:styleId="DocumentationTok" w:type="character">
     <w:name w:val="DocumentationTok"/>
     <w:rsid w:val="008B5ADE"/>
     <w:rPr>
-      <w:rFonts w:asciiTheme="minorHAnsi" w:hAnsiTheme="minorHAnsi"/>
+      <w:rFonts w:ascii="Courier New" w:asciiTheme="minorHAnsi" w:cs="Courier New" w:eastAsia="Courier New" w:hAnsi="Courier New" w:hAnsiTheme="minorHAnsi"/>
       <w:i/>
       <w:color w:val="5E5E5E"/>
-      <w:shd w:color="auto" w:fill="F1F3F5" w:val="clear"/>
+      <w:shd w:color="auto" w:fill="F7F7F7" w:val="clear"/>
+      <w:sz w:val="19"/>
+      <w:szCs w:val="19"/>
     </w:rPr>
   </w:style>
   <w:style w:customStyle="1" w:styleId="AnnotationTok" w:type="character">
     <w:name w:val="AnnotationTok"/>
     <w:rPr>
+      <w:rFonts w:ascii="Courier New" w:cs="Courier New" w:eastAsia="Courier New" w:hAnsi="Courier New"/>
       <w:color w:val="5E5E5E"/>
-      <w:shd w:color="auto" w:fill="F1F3F5" w:val="clear"/>
+      <w:shd w:color="auto" w:fill="F7F7F7" w:val="clear"/>
+      <w:sz w:val="19"/>
+      <w:szCs w:val="19"/>
     </w:rPr>
   </w:style>
   <w:style w:customStyle="1" w:styleId="CommentVarTok" w:type="character">
     <w:name w:val="CommentVarTok"/>
     <w:rPr>
+      <w:rFonts w:ascii="Courier New" w:cs="Courier New" w:eastAsia="Courier New" w:hAnsi="Courier New"/>
       <w:i/>
       <w:color w:val="5E5E5E"/>
-      <w:shd w:color="auto" w:fill="F1F3F5" w:val="clear"/>
+      <w:shd w:color="auto" w:fill="F7F7F7" w:val="clear"/>
+      <w:sz w:val="19"/>
+      <w:szCs w:val="19"/>
     </w:rPr>
   </w:style>
   <w:style w:customStyle="1" w:styleId="OtherTok" w:type="character">
     <w:name w:val="OtherTok"/>
     <w:rPr>
+      <w:rFonts w:ascii="Courier New" w:cs="Courier New" w:eastAsia="Courier New" w:hAnsi="Courier New"/>
       <w:color w:val="003B4F"/>
-      <w:shd w:color="auto" w:fill="F1F3F5" w:val="clear"/>
+      <w:shd w:color="auto" w:fill="F7F7F7" w:val="clear"/>
+      <w:sz w:val="19"/>
+      <w:szCs w:val="19"/>
     </w:rPr>
   </w:style>
   <w:style w:customStyle="1" w:styleId="FunctionTok" w:type="character">
     <w:name w:val="FunctionTok"/>
     <w:rPr>
+      <w:rFonts w:ascii="Courier New" w:cs="Courier New" w:eastAsia="Courier New" w:hAnsi="Courier New"/>
       <w:color w:val="4758AB"/>
-      <w:shd w:color="auto" w:fill="F1F3F5" w:val="clear"/>
+      <w:shd w:color="auto" w:fill="F7F7F7" w:val="clear"/>
+      <w:sz w:val="19"/>
+      <w:szCs w:val="19"/>
     </w:rPr>
   </w:style>
   <w:style w:customStyle="1" w:styleId="VariableTok" w:type="character">
     <w:name w:val="VariableTok"/>
     <w:rPr>
+      <w:rFonts w:ascii="Courier New" w:cs="Courier New" w:eastAsia="Courier New" w:hAnsi="Courier New"/>
       <w:color w:val="111111"/>
-      <w:shd w:color="auto" w:fill="F1F3F5" w:val="clear"/>
+      <w:shd w:color="auto" w:fill="F7F7F7" w:val="clear"/>
+      <w:sz w:val="19"/>
+      <w:szCs w:val="19"/>
     </w:rPr>
   </w:style>
   <w:style w:customStyle="1" w:styleId="ControlFlowTok" w:type="character">
     <w:name w:val="ControlFlowTok"/>
     <w:rPr>
+      <w:rFonts w:ascii="Courier New" w:cs="Courier New" w:eastAsia="Courier New" w:hAnsi="Courier New"/>
       <w:b/>
       <w:color w:val="003B4F"/>
-      <w:shd w:color="auto" w:fill="F1F3F5" w:val="clear"/>
+      <w:shd w:color="auto" w:fill="F7F7F7" w:val="clear"/>
+      <w:sz w:val="19"/>
+      <w:szCs w:val="19"/>
     </w:rPr>
   </w:style>
   <w:style w:customStyle="1" w:styleId="OperatorTok" w:type="character">
     <w:name w:val="OperatorTok"/>
     <w:rPr>
+      <w:rFonts w:ascii="Courier New" w:cs="Courier New" w:eastAsia="Courier New" w:hAnsi="Courier New"/>
       <w:color w:val="5E5E5E"/>
-      <w:shd w:color="auto" w:fill="F1F3F5" w:val="clear"/>
+      <w:shd w:color="auto" w:fill="F7F7F7" w:val="clear"/>
+      <w:sz w:val="19"/>
+      <w:szCs w:val="19"/>
     </w:rPr>
   </w:style>
   <w:style w:customStyle="1" w:styleId="BuiltInTok" w:type="character">
     <w:name w:val="BuiltInTok"/>
     <w:rsid w:val="008B5ADE"/>
     <w:rPr>
-      <w:rFonts w:asciiTheme="minorHAnsi" w:hAnsiTheme="minorHAnsi"/>
+      <w:rFonts w:ascii="Courier New" w:asciiTheme="minorHAnsi" w:cs="Courier New" w:eastAsia="Courier New" w:hAnsi="Courier New" w:hAnsiTheme="minorHAnsi"/>
       <w:color w:val="003B4F"/>
-      <w:shd w:color="auto" w:fill="F1F3F5" w:val="clear"/>
+      <w:shd w:color="auto" w:fill="F7F7F7" w:val="clear"/>
+      <w:sz w:val="19"/>
+      <w:szCs w:val="19"/>
     </w:rPr>
   </w:style>
   <w:style w:customStyle="1" w:styleId="ExtensionTok" w:type="character">
     <w:name w:val="ExtensionTok"/>
     <w:rPr>
+      <w:rFonts w:ascii="Courier New" w:cs="Courier New" w:eastAsia="Courier New" w:hAnsi="Courier New"/>
       <w:color w:val="003B4F"/>
-      <w:shd w:color="auto" w:fill="F1F3F5" w:val="clear"/>
+      <w:shd w:color="auto" w:fill="F7F7F7" w:val="clear"/>
+      <w:sz w:val="19"/>
+      <w:szCs w:val="19"/>
     </w:rPr>
   </w:style>
   <w:style w:customStyle="1" w:styleId="PreprocessorTok" w:type="character">
     <w:name w:val="PreprocessorTok"/>
     <w:rPr>
+      <w:rFonts w:ascii="Courier New" w:cs="Courier New" w:eastAsia="Courier New" w:hAnsi="Courier New"/>
       <w:color w:val="AD0000"/>
-      <w:shd w:color="auto" w:fill="F1F3F5" w:val="clear"/>
+      <w:shd w:color="auto" w:fill="F7F7F7" w:val="clear"/>
+      <w:sz w:val="19"/>
+      <w:szCs w:val="19"/>
     </w:rPr>
   </w:style>
   <w:style w:customStyle="1" w:styleId="AttributeTok" w:type="character">
@@ -8931,31 +8821,42 @@
     <w:qFormat/>
     <w:rsid w:val="008B5ADE"/>
     <w:rPr>
-      <w:rFonts w:asciiTheme="minorHAnsi" w:hAnsiTheme="minorHAnsi"/>
+      <w:rFonts w:ascii="Courier New" w:asciiTheme="minorHAnsi" w:cs="Courier New" w:eastAsia="Courier New" w:hAnsi="Courier New" w:hAnsiTheme="minorHAnsi"/>
       <w:color w:val="657422"/>
-      <w:shd w:color="auto" w:fill="F1F3F5" w:val="clear"/>
+      <w:shd w:color="auto" w:fill="F7F7F7" w:val="clear"/>
+      <w:sz w:val="19"/>
+      <w:szCs w:val="19"/>
     </w:rPr>
   </w:style>
   <w:style w:customStyle="1" w:styleId="RegionMarkerTok" w:type="character">
     <w:name w:val="RegionMarkerTok"/>
     <w:rPr>
+      <w:rFonts w:ascii="Courier New" w:cs="Courier New" w:eastAsia="Courier New" w:hAnsi="Courier New"/>
       <w:color w:val="003B4F"/>
-      <w:shd w:color="auto" w:fill="F1F3F5" w:val="clear"/>
+      <w:shd w:color="auto" w:fill="F7F7F7" w:val="clear"/>
+      <w:sz w:val="19"/>
+      <w:szCs w:val="19"/>
     </w:rPr>
   </w:style>
   <w:style w:customStyle="1" w:styleId="InformationTok" w:type="character">
     <w:name w:val="InformationTok"/>
     <w:rPr>
+      <w:rFonts w:ascii="Courier New" w:cs="Courier New" w:eastAsia="Courier New" w:hAnsi="Courier New"/>
       <w:color w:val="5E5E5E"/>
-      <w:shd w:color="auto" w:fill="F1F3F5" w:val="clear"/>
+      <w:shd w:color="auto" w:fill="F7F7F7" w:val="clear"/>
+      <w:sz w:val="19"/>
+      <w:szCs w:val="19"/>
     </w:rPr>
   </w:style>
   <w:style w:customStyle="1" w:styleId="WarningTok" w:type="character">
     <w:name w:val="WarningTok"/>
     <w:rPr>
+      <w:rFonts w:ascii="Courier New" w:cs="Courier New" w:eastAsia="Courier New" w:hAnsi="Courier New"/>
       <w:i/>
       <w:color w:val="5E5E5E"/>
-      <w:shd w:color="auto" w:fill="F1F3F5" w:val="clear"/>
+      <w:shd w:color="auto" w:fill="F7F7F7" w:val="clear"/>
+      <w:sz w:val="19"/>
+      <w:szCs w:val="19"/>
     </w:rPr>
   </w:style>
   <w:style w:customStyle="1" w:styleId="AlertTok" w:type="character">
@@ -8963,23 +8864,31 @@
     <w:qFormat/>
     <w:rsid w:val="008B5ADE"/>
     <w:rPr>
-      <w:rFonts w:asciiTheme="minorHAnsi" w:hAnsiTheme="minorHAnsi"/>
+      <w:rFonts w:ascii="Courier New" w:asciiTheme="minorHAnsi" w:cs="Courier New" w:eastAsia="Courier New" w:hAnsi="Courier New" w:hAnsiTheme="minorHAnsi"/>
       <w:color w:val="AD0000"/>
-      <w:shd w:color="auto" w:fill="F1F3F5" w:val="clear"/>
+      <w:shd w:color="auto" w:fill="F7F7F7" w:val="clear"/>
+      <w:sz w:val="19"/>
+      <w:szCs w:val="19"/>
     </w:rPr>
   </w:style>
   <w:style w:customStyle="1" w:styleId="ErrorTok" w:type="character">
     <w:name w:val="ErrorTok"/>
     <w:rPr>
+      <w:rFonts w:ascii="Courier New" w:cs="Courier New" w:eastAsia="Courier New" w:hAnsi="Courier New"/>
       <w:color w:val="AD0000"/>
-      <w:shd w:color="auto" w:fill="F1F3F5" w:val="clear"/>
+      <w:shd w:color="auto" w:fill="F7F7F7" w:val="clear"/>
+      <w:sz w:val="19"/>
+      <w:szCs w:val="19"/>
     </w:rPr>
   </w:style>
   <w:style w:customStyle="1" w:styleId="NormalTok" w:type="character">
     <w:name w:val="NormalTok"/>
     <w:rPr>
+      <w:rFonts w:ascii="Courier New" w:cs="Courier New" w:eastAsia="Courier New" w:hAnsi="Courier New"/>
       <w:color w:val="003B4F"/>
-      <w:shd w:color="auto" w:fill="F1F3F5" w:val="clear"/>
+      <w:shd w:color="auto" w:fill="F7F7F7" w:val="clear"/>
+      <w:sz w:val="19"/>
+      <w:szCs w:val="19"/>
     </w:rPr>
   </w:style>
   <w:style w:customStyle="1" w:styleId="Section1" w:type="character">
@@ -9829,6 +9738,7 @@
       <w:spacing w:after="200" w:line="240" w:lineRule="auto"/>
     </w:pPr>
     <w:rPr>
+      <w:rFonts w:ascii="Arial" w:cs="Arial" w:eastAsia="Arial" w:hAnsi="Arial"/>
       <w:i/>
       <w:iCs/>
       <w:color w:themeColor="text2" w:val="44546A"/>
@@ -9869,11 +9779,15 @@
     <w:qFormat/>
     <w:rsid w:val="00491A31"/>
     <w:pPr>
-      <w:spacing w:after="180" w:before="180" w:line="240" w:lineRule="auto"/>
+      <w:spacing w:after="160" w:before="0" w:line="300" w:lineRule="auto"/>
     </w:pPr>
     <w:rPr>
+      <w:rFonts w:ascii="Arial" w:cs="Arial" w:eastAsia="Arial" w:hAnsi="Arial"/>
       <w:kern w:val="0"/>
       <w14:ligatures w14:val="none"/>
+      <w:sz w:val="23"/>
+      <w:szCs w:val="23"/>
+      <w:color w:val="222222"/>
     </w:rPr>
   </w:style>
   <w:style w:customStyle="1" w:styleId="VerbatimChar" w:type="character">
@@ -9883,8 +9797,11 @@
     <w:qFormat/>
     <w:rsid w:val="00D15FFF"/>
     <w:rPr>
-      <w:rFonts w:ascii="Atkinson Hyperlegible" w:hAnsi="Atkinson Hyperlegible"/>
+      <w:rFonts w:ascii="Courier New" w:cs="Courier New" w:eastAsia="Courier New" w:hAnsi="Courier New"/>
       <w:shd w:color="auto" w:fill="F1F3F5" w:val="clear"/>
+      <w:sz w:val="20"/>
+      <w:szCs w:val="20"/>
+      <w:color w:val="1F2937"/>
     </w:rPr>
   </w:style>
   <w:style w:styleId="BodyText" w:type="paragraph">
@@ -9897,8 +9814,14 @@
     <w:qFormat/>
     <w:rsid w:val="00AA286D"/>
     <w:pPr>
-      <w:spacing w:after="240" w:before="120"/>
+      <w:spacing w:after="160" w:before="0" w:line="300" w:lineRule="auto"/>
     </w:pPr>
+    <w:rPr>
+      <w:rFonts w:ascii="Arial" w:cs="Arial" w:eastAsia="Arial" w:hAnsi="Arial"/>
+      <w:sz w:val="23"/>
+      <w:szCs w:val="23"/>
+      <w:color w:val="222222"/>
+    </w:rPr>
   </w:style>
   <w:style w:customStyle="1" w:styleId="BodyTextChar" w:type="character">
     <w:name w:val="Body Text Char"/>
@@ -9913,11 +9836,15 @@
     <w:qFormat/>
     <w:rsid w:val="00D15FFF"/>
     <w:pPr>
-      <w:spacing w:after="36" w:before="36" w:line="240" w:lineRule="auto"/>
+      <w:spacing w:after="120" w:before="0" w:line="288" w:lineRule="auto"/>
     </w:pPr>
     <w:rPr>
+      <w:rFonts w:ascii="Arial" w:cs="Arial" w:eastAsia="Arial" w:hAnsi="Arial"/>
       <w:kern w:val="0"/>
       <w14:ligatures w14:val="none"/>
+      <w:sz w:val="23"/>
+      <w:szCs w:val="23"/>
+      <w:color w:val="222222"/>
     </w:rPr>
   </w:style>
   <w:style w:styleId="FootnoteReference" w:type="character">
@@ -10769,20 +10696,22 @@
     <w:qFormat/>
     <w:rsid w:val="00050EB4"/>
     <w:pPr>
-      <w:numPr>
-        <w:numId w:val="51"/>
-      </w:numPr>
       <w:pBdr>
-        <w:top w:color="auto" w:space="5" w:sz="4" w:val="dotted"/>
-        <w:left w:color="auto" w:space="4" w:sz="4" w:val="dotted"/>
-        <w:bottom w:color="auto" w:space="5" w:sz="4" w:val="dotted"/>
-        <w:right w:color="auto" w:space="4" w:sz="4" w:val="dotted"/>
+        <w:top w:color="B7B7B7" w:space="12" w:sz="6" w:val="single"/>
+        <w:left w:color="C8102E" w:space="12" w:sz="14" w:val="single"/>
+        <w:bottom w:color="B7B7B7" w:space="12" w:sz="6" w:val="single"/>
+        <w:right w:color="B7B7B7" w:space="12" w:sz="6" w:val="single"/>
       </w:pBdr>
-      <w:ind w:right="1008"/>
+      <w:ind w:left="240" w:right="240"/>
+      <w:spacing w:after="360" w:before="180" w:line="300" w:lineRule="auto"/>
+      <w:widowControl/>
+      <w:shd w:color="auto" w:fill="F7F7F7" w:val="clear"/>
     </w:pPr>
     <w:rPr>
-      <w:rFonts w:cs="Times New Roman (Body CS)"/>
-      <w:sz w:val="22"/>
+      <w:rFonts w:ascii="Arial" w:cs="Arial" w:eastAsia="Arial" w:hAnsi="Arial"/>
+      <w:sz w:val="23"/>
+      <w:szCs w:val="23"/>
+      <w:color w:val="222222"/>
     </w:rPr>
   </w:style>
   <w:style w:styleId="HTMLAddress" w:type="paragraph">
@@ -10861,7 +10790,7 @@
       </w:pBdr>
       <w:shd w:color="auto" w:fill="auto" w:val="clear"/>
       <w:spacing w:line="360" w:lineRule="auto"/>
-      <w:ind w:left="-1152" w:right="-1152"/>
+      <w:ind w:left="0" w:right="0"/>
     </w:pPr>
     <w:rPr>
       <w:sz w:val="20"/>
@@ -10999,7 +10928,7 @@
     <w:qFormat/>
     <w:rsid w:val="00E6184A"/>
     <w:rPr>
-      <w:rFonts w:asciiTheme="minorHAnsi" w:hAnsiTheme="minorHAnsi"/>
+      <w:rFonts w:ascii="Arial" w:asciiTheme="minorHAnsi" w:cs="Arial" w:eastAsia="Arial" w:hAnsi="Arial" w:hAnsiTheme="minorHAnsi"/>
       <w:b/>
       <w:i w:val="0"/>
       <w:caps w:val="0"/>

</xml_diff>